<commit_message>
DOC: Avance con Listado de Requerimientos
</commit_message>
<xml_diff>
--- a/A-Documentacion/A-Inicio/Iteracion1-31_8-al-20_9/2-ListadoRequerimientos/eGradudos_Inicio_Iteracion1_RequerimientosPreliminares.docx
+++ b/A-Documentacion/A-Inicio/Iteracion1-31_8-al-20_9/2-ListadoRequerimientos/eGradudos_Inicio_Iteracion1_RequerimientosPreliminares.docx
@@ -2723,7 +2723,7 @@
               <w:pStyle w:val="PSI-Normal"/>
             </w:pPr>
             <w:r>
-              <w:t>Baja</w:t>
+              <w:t>Alta</w:t>
             </w:r>
           </w:p>
         </w:tc>
@@ -2879,10 +2879,10 @@
     </w:p>
     <w:p>
       <w:pPr>
-        <w:pStyle w:val="PSI-Ttulo2"/>
-      </w:pPr>
-      <w:r>
-        <w:t>Acceso al sistema</w:t>
+        <w:pStyle w:val="PSI-Normal"/>
+      </w:pPr>
+      <w:r>
+        <w:t>Login</w:t>
       </w:r>
     </w:p>
     <w:p>
@@ -2892,21 +2892,47 @@
           <w:ilvl w:val="0"/>
           <w:numId w:val="20"/>
         </w:numPr>
-      </w:pPr>
-      <w:r>
         <w:rPr>
           <w:b/>
           <w:bCs/>
-        </w:rPr>
-        <w:t xml:space="preserve">RF-01: </w:t>
-      </w:r>
-      <w:bookmarkStart w:id="19" w:name="_Toc240000036"/>
+          <w:sz w:val="24"/>
+          <w:szCs w:val="24"/>
+        </w:rPr>
+      </w:pPr>
       <w:r>
         <w:rPr>
           <w:b/>
           <w:bCs/>
         </w:rPr>
-        <w:t xml:space="preserve">El sistema debe </w:t>
+        <w:t>RF-01: Registro al sistema</w:t>
+      </w:r>
+    </w:p>
+    <w:p>
+      <w:pPr>
+        <w:pStyle w:val="PSI-Normal"/>
+        <w:ind w:left="720"/>
+        <w:rPr>
+          <w:b/>
+          <w:bCs/>
+        </w:rPr>
+      </w:pPr>
+      <w:r>
+        <w:t xml:space="preserve">El sistema debe permitir que un usuario se registre con un correo electrónico permitido. </w:t>
+      </w:r>
+      <w:r>
+        <w:rPr>
+          <w:b/>
+          <w:bCs/>
+        </w:rPr>
+        <w:t xml:space="preserve"> </w:t>
+      </w:r>
+    </w:p>
+    <w:p>
+      <w:pPr>
+        <w:pStyle w:val="PSI-Normal"/>
+      </w:pPr>
+      <w:r>
+        <w:t>Inicio</w:t>
       </w:r>
     </w:p>
     <w:p>
@@ -2916,7 +2942,1151 @@
           <w:ilvl w:val="0"/>
           <w:numId w:val="20"/>
         </w:numPr>
-      </w:pPr>
+        <w:rPr>
+          <w:sz w:val="24"/>
+          <w:szCs w:val="24"/>
+        </w:rPr>
+      </w:pPr>
+      <w:r>
+        <w:rPr>
+          <w:b/>
+          <w:bCs/>
+        </w:rPr>
+        <w:t>RF-02: Selección de módulo</w:t>
+      </w:r>
+    </w:p>
+    <w:p>
+      <w:pPr>
+        <w:pStyle w:val="PSI-Normal"/>
+        <w:ind w:left="720"/>
+      </w:pPr>
+      <w:r>
+        <w:t xml:space="preserve">El sistema debe mostrar y permitir el ingreso al usuario validado de los </w:t>
+      </w:r>
+      <w:r>
+        <w:t xml:space="preserve">siguientes </w:t>
+      </w:r>
+      <w:r>
+        <w:t>módulos disponibles: módulo de analíticos, módulo de graduados, módulo de estadísticas</w:t>
+      </w:r>
+      <w:r>
+        <w:t xml:space="preserve">, </w:t>
+      </w:r>
+      <w:r>
+        <w:t xml:space="preserve">módulo de graduados </w:t>
+      </w:r>
+      <w:r>
+        <w:t>con</w:t>
+      </w:r>
+      <w:r>
+        <w:t xml:space="preserve"> baja</w:t>
+      </w:r>
+      <w:r>
+        <w:t xml:space="preserve"> lógica</w:t>
+      </w:r>
+      <w:r>
+        <w:t>, módulo de transacciones y módulo de carga de datos.</w:t>
+      </w:r>
+    </w:p>
+    <w:p>
+      <w:pPr>
+        <w:pStyle w:val="PSI-Normal"/>
+        <w:rPr>
+          <w:sz w:val="24"/>
+          <w:szCs w:val="24"/>
+        </w:rPr>
+      </w:pPr>
+      <w:r>
+        <w:lastRenderedPageBreak/>
+        <w:t>Módulo</w:t>
+      </w:r>
+      <w:r>
+        <w:t xml:space="preserve"> de analíticos</w:t>
+      </w:r>
+    </w:p>
+    <w:p>
+      <w:pPr>
+        <w:pStyle w:val="PSI-Normal"/>
+        <w:numPr>
+          <w:ilvl w:val="0"/>
+          <w:numId w:val="20"/>
+        </w:numPr>
+      </w:pPr>
+      <w:r>
+        <w:rPr>
+          <w:b/>
+          <w:bCs/>
+        </w:rPr>
+        <w:t>RF-0</w:t>
+      </w:r>
+      <w:r>
+        <w:rPr>
+          <w:b/>
+          <w:bCs/>
+        </w:rPr>
+        <w:t>3</w:t>
+      </w:r>
+      <w:r>
+        <w:rPr>
+          <w:b/>
+          <w:bCs/>
+        </w:rPr>
+        <w:t xml:space="preserve">: </w:t>
+      </w:r>
+      <w:bookmarkStart w:id="19" w:name="_Toc240000036"/>
+      <w:r>
+        <w:rPr>
+          <w:b/>
+          <w:bCs/>
+        </w:rPr>
+        <w:t>Creación de analíticos</w:t>
+      </w:r>
+    </w:p>
+    <w:p>
+      <w:pPr>
+        <w:pStyle w:val="PSI-Normal"/>
+        <w:ind w:left="720"/>
+      </w:pPr>
+      <w:r>
+        <w:t xml:space="preserve">El sistema debe permitir la creación de </w:t>
+      </w:r>
+      <w:r>
+        <w:t>analíticos o títulos en trámite</w:t>
+      </w:r>
+      <w:r>
+        <w:t xml:space="preserve"> haciendo clic en el botón “generar” luego de</w:t>
+      </w:r>
+      <w:r>
+        <w:t>: la carga de un certificado Lincoln en formato Excel y la carga manual de los siguientes datos</w:t>
+      </w:r>
+      <w:r>
+        <w:t xml:space="preserve"> del graduado</w:t>
+      </w:r>
+      <w:r>
+        <w:t>: nombre/s, apellido/s, DNI, legajo, fecha (día/mes/año), ciudad y provincia de nacimiento; nacionalidad, título secundario (bachiller, título técnico); nombre, ciudad</w:t>
+      </w:r>
+      <w:r>
+        <w:t>,</w:t>
+      </w:r>
+      <w:r>
+        <w:t xml:space="preserve"> provincia</w:t>
+      </w:r>
+      <w:r>
+        <w:t xml:space="preserve"> y año de egreso</w:t>
+      </w:r>
+      <w:r>
+        <w:t xml:space="preserve"> del secundario</w:t>
+      </w:r>
+      <w:r>
+        <w:t>; año de ingreso a la UARG, carrera cursada, resoluciones institucionales y nacionales correspondientes a la carrera, incluyendo notas si corresponde; y año de egreso de la carrera.</w:t>
+      </w:r>
+      <w:r>
+        <w:t xml:space="preserve"> </w:t>
+      </w:r>
+    </w:p>
+    <w:p>
+      <w:pPr>
+        <w:pStyle w:val="PSI-Normal"/>
+        <w:numPr>
+          <w:ilvl w:val="0"/>
+          <w:numId w:val="20"/>
+        </w:numPr>
+      </w:pPr>
+      <w:r>
+        <w:rPr>
+          <w:b/>
+          <w:bCs/>
+        </w:rPr>
+        <w:t>RF-0</w:t>
+      </w:r>
+      <w:r>
+        <w:rPr>
+          <w:b/>
+          <w:bCs/>
+        </w:rPr>
+        <w:t>4</w:t>
+      </w:r>
+      <w:r>
+        <w:rPr>
+          <w:b/>
+          <w:bCs/>
+        </w:rPr>
+        <w:t xml:space="preserve">: </w:t>
+      </w:r>
+      <w:r>
+        <w:rPr>
+          <w:b/>
+          <w:bCs/>
+        </w:rPr>
+        <w:t>Validación de analítico creado</w:t>
+      </w:r>
+    </w:p>
+    <w:p>
+      <w:pPr>
+        <w:pStyle w:val="PSI-Normal"/>
+        <w:ind w:left="720"/>
+      </w:pPr>
+      <w:r>
+        <w:t>El sistema debe generar una vista preliminar del analítico</w:t>
+      </w:r>
+      <w:r>
+        <w:t xml:space="preserve"> o título en trámite</w:t>
+      </w:r>
+      <w:r>
+        <w:t xml:space="preserve"> que se desea generar y colocar un botón de “Validar” para que se haga efectiva la creación del analítico</w:t>
+      </w:r>
+      <w:r>
+        <w:t>.</w:t>
+      </w:r>
+    </w:p>
+    <w:p>
+      <w:pPr>
+        <w:pStyle w:val="PSI-Normal"/>
+        <w:numPr>
+          <w:ilvl w:val="0"/>
+          <w:numId w:val="20"/>
+        </w:numPr>
+      </w:pPr>
+      <w:r>
+        <w:rPr>
+          <w:b/>
+          <w:bCs/>
+        </w:rPr>
+        <w:t>RF-0</w:t>
+      </w:r>
+      <w:r>
+        <w:rPr>
+          <w:b/>
+          <w:bCs/>
+        </w:rPr>
+        <w:t>5</w:t>
+      </w:r>
+      <w:r>
+        <w:rPr>
+          <w:b/>
+          <w:bCs/>
+        </w:rPr>
+        <w:t xml:space="preserve">: </w:t>
+      </w:r>
+      <w:r>
+        <w:rPr>
+          <w:b/>
+          <w:bCs/>
+        </w:rPr>
+        <w:t>Creación del perfil</w:t>
+      </w:r>
+      <w:r>
+        <w:rPr>
+          <w:b/>
+          <w:bCs/>
+        </w:rPr>
+        <w:t xml:space="preserve"> de los datos del analítico</w:t>
+      </w:r>
+      <w:r>
+        <w:rPr>
+          <w:b/>
+          <w:bCs/>
+        </w:rPr>
+        <w:t xml:space="preserve"> validado</w:t>
+      </w:r>
+    </w:p>
+    <w:p>
+      <w:pPr>
+        <w:pStyle w:val="PSI-Normal"/>
+        <w:ind w:left="720"/>
+      </w:pPr>
+      <w:r>
+        <w:t>El sistema debe</w:t>
+      </w:r>
+      <w:r>
+        <w:t xml:space="preserve"> generar el perfil de un graduado luego de la validación de un analítico. El perfil debe contar con toda la información del graduado almacenada.</w:t>
+      </w:r>
+    </w:p>
+    <w:p>
+      <w:pPr>
+        <w:pStyle w:val="PSI-Normal"/>
+        <w:numPr>
+          <w:ilvl w:val="0"/>
+          <w:numId w:val="20"/>
+        </w:numPr>
+      </w:pPr>
+      <w:r>
+        <w:rPr>
+          <w:b/>
+          <w:bCs/>
+        </w:rPr>
+        <w:t xml:space="preserve">RF-06: </w:t>
+      </w:r>
+      <w:r>
+        <w:rPr>
+          <w:b/>
+          <w:bCs/>
+        </w:rPr>
+        <w:t>Descarga de analíticos</w:t>
+      </w:r>
+    </w:p>
+    <w:p>
+      <w:pPr>
+        <w:pStyle w:val="PSI-Normal"/>
+        <w:ind w:left="720"/>
+      </w:pPr>
+      <w:r>
+        <w:t>El sistema debe permitir que los analíticos o títulos en trámite generados se puedan descargar</w:t>
+      </w:r>
+      <w:r>
+        <w:t>.</w:t>
+      </w:r>
+    </w:p>
+    <w:p>
+      <w:pPr>
+        <w:pStyle w:val="PSI-Normal"/>
+      </w:pPr>
+      <w:r>
+        <w:t>Módulo de graduados</w:t>
+      </w:r>
+    </w:p>
+    <w:p>
+      <w:pPr>
+        <w:pStyle w:val="PSI-Normal"/>
+        <w:numPr>
+          <w:ilvl w:val="0"/>
+          <w:numId w:val="20"/>
+        </w:numPr>
+        <w:rPr>
+          <w:b/>
+          <w:bCs/>
+        </w:rPr>
+      </w:pPr>
+      <w:r>
+        <w:rPr>
+          <w:b/>
+          <w:bCs/>
+        </w:rPr>
+        <w:t>RF-0</w:t>
+      </w:r>
+      <w:r>
+        <w:rPr>
+          <w:b/>
+          <w:bCs/>
+        </w:rPr>
+        <w:t>7</w:t>
+      </w:r>
+      <w:r>
+        <w:rPr>
+          <w:b/>
+          <w:bCs/>
+        </w:rPr>
+        <w:t>: Listado de graduados</w:t>
+      </w:r>
+    </w:p>
+    <w:p>
+      <w:pPr>
+        <w:pStyle w:val="PSI-Normal"/>
+        <w:ind w:left="720"/>
+      </w:pPr>
+      <w:r>
+        <w:t xml:space="preserve">El sistema debe mostrar un listado de graduados con: legajo del graduado, nombre/s, apellido/s, nombre de la carrera de la </w:t>
+      </w:r>
+      <w:r>
+        <w:t>cual</w:t>
+      </w:r>
+      <w:r>
+        <w:t xml:space="preserve"> se graduaron y un botón “Ver más” para que puedan entrar al “perfil” del graduado.</w:t>
+      </w:r>
+    </w:p>
+    <w:p>
+      <w:pPr>
+        <w:pStyle w:val="PSI-Normal"/>
+        <w:numPr>
+          <w:ilvl w:val="0"/>
+          <w:numId w:val="20"/>
+        </w:numPr>
+      </w:pPr>
+      <w:r>
+        <w:rPr>
+          <w:b/>
+          <w:bCs/>
+        </w:rPr>
+        <w:t>RF-0</w:t>
+      </w:r>
+      <w:r>
+        <w:rPr>
+          <w:b/>
+          <w:bCs/>
+        </w:rPr>
+        <w:t>8</w:t>
+      </w:r>
+      <w:r>
+        <w:rPr>
+          <w:b/>
+          <w:bCs/>
+        </w:rPr>
+        <w:t>: Búsqueda de graduados por legajo, DNI y apellido</w:t>
+      </w:r>
+    </w:p>
+    <w:p>
+      <w:pPr>
+        <w:pStyle w:val="PSI-Normal"/>
+        <w:ind w:left="720"/>
+      </w:pPr>
+      <w:r>
+        <w:t>El sistema debe permitir de que se pueda buscar a un graduado y todos sus datos mediante el ingreso de legajo, DNI o apellido.</w:t>
+      </w:r>
+    </w:p>
+    <w:p>
+      <w:pPr>
+        <w:pStyle w:val="PSI-Normal"/>
+        <w:numPr>
+          <w:ilvl w:val="0"/>
+          <w:numId w:val="20"/>
+        </w:numPr>
+      </w:pPr>
+      <w:r>
+        <w:rPr>
+          <w:b/>
+          <w:bCs/>
+        </w:rPr>
+        <w:t>RF-09: Perfiles de graduados</w:t>
+      </w:r>
+    </w:p>
+    <w:p>
+      <w:pPr>
+        <w:pStyle w:val="PSI-Normal"/>
+        <w:ind w:left="720"/>
+      </w:pPr>
+      <w:r>
+        <w:t xml:space="preserve">El sistema debe permitir que el usuario vea un perfil del graduado con todos sus datos luego de hacerle clic al botón “Ver más” que aparece en el listado de graduados (RF-07). </w:t>
+      </w:r>
+    </w:p>
+    <w:p>
+      <w:pPr>
+        <w:pStyle w:val="PSI-Normal"/>
+        <w:numPr>
+          <w:ilvl w:val="0"/>
+          <w:numId w:val="20"/>
+        </w:numPr>
+      </w:pPr>
+      <w:r>
+        <w:rPr>
+          <w:b/>
+          <w:bCs/>
+        </w:rPr>
+        <w:t>RF-</w:t>
+      </w:r>
+      <w:r>
+        <w:rPr>
+          <w:b/>
+          <w:bCs/>
+        </w:rPr>
+        <w:t>10</w:t>
+      </w:r>
+      <w:r>
+        <w:rPr>
+          <w:b/>
+          <w:bCs/>
+        </w:rPr>
+        <w:t>: Modificación de datos de graduado</w:t>
+      </w:r>
+    </w:p>
+    <w:p>
+      <w:pPr>
+        <w:pStyle w:val="PSI-Normal"/>
+        <w:ind w:left="720"/>
+      </w:pPr>
+      <w:r>
+        <w:lastRenderedPageBreak/>
+        <w:t>El sistema debe permitir que se modifique y actualice cualquiera de los datos de un graduado</w:t>
+      </w:r>
+      <w:r>
+        <w:t xml:space="preserve"> mediante el acceso de su perfil.</w:t>
+      </w:r>
+    </w:p>
+    <w:p>
+      <w:pPr>
+        <w:pStyle w:val="PSI-Normal"/>
+        <w:numPr>
+          <w:ilvl w:val="0"/>
+          <w:numId w:val="20"/>
+        </w:numPr>
+      </w:pPr>
+      <w:r>
+        <w:rPr>
+          <w:b/>
+          <w:bCs/>
+        </w:rPr>
+        <w:t>RF-11: Persistencia de modificaciones en los datos de un graduado</w:t>
+      </w:r>
+    </w:p>
+    <w:p>
+      <w:pPr>
+        <w:pStyle w:val="PSI-Normal"/>
+        <w:ind w:left="720"/>
+      </w:pPr>
+      <w:r>
+        <w:t>El sistema debe guardar y reflejar en la base de datos las modificaciones realizadas en el perfil de un graduado para mantener los datos consistentes.</w:t>
+      </w:r>
+    </w:p>
+    <w:p>
+      <w:pPr>
+        <w:pStyle w:val="PSI-Normal"/>
+        <w:numPr>
+          <w:ilvl w:val="0"/>
+          <w:numId w:val="20"/>
+        </w:numPr>
+      </w:pPr>
+      <w:r>
+        <w:rPr>
+          <w:b/>
+          <w:bCs/>
+        </w:rPr>
+        <w:t>RF-</w:t>
+      </w:r>
+      <w:r>
+        <w:rPr>
+          <w:b/>
+          <w:bCs/>
+        </w:rPr>
+        <w:t>12</w:t>
+      </w:r>
+      <w:r>
+        <w:rPr>
+          <w:b/>
+          <w:bCs/>
+        </w:rPr>
+        <w:t>: Baja de graduados</w:t>
+      </w:r>
+    </w:p>
+    <w:p>
+      <w:pPr>
+        <w:pStyle w:val="PSI-Normal"/>
+        <w:ind w:left="720"/>
+      </w:pPr>
+      <w:r>
+        <w:t>El sistema debe permitir que se genere la baja lógica de un graduado</w:t>
+      </w:r>
+      <w:r>
+        <w:t xml:space="preserve"> mediante el perfil de un graduado o en el listado de graduados. </w:t>
+      </w:r>
+    </w:p>
+    <w:p>
+      <w:pPr>
+        <w:pStyle w:val="PSI-Normal"/>
+        <w:numPr>
+          <w:ilvl w:val="0"/>
+          <w:numId w:val="20"/>
+        </w:numPr>
+        <w:rPr>
+          <w:b/>
+          <w:bCs/>
+        </w:rPr>
+      </w:pPr>
+      <w:r>
+        <w:rPr>
+          <w:b/>
+          <w:bCs/>
+        </w:rPr>
+        <w:t>RF-13: Validación de la baja lógica</w:t>
+      </w:r>
+    </w:p>
+    <w:p>
+      <w:pPr>
+        <w:pStyle w:val="PSI-Normal"/>
+        <w:ind w:left="720"/>
+      </w:pPr>
+      <w:r>
+        <w:t xml:space="preserve">El sistema debe mostrarle al usuario un cartel al momento de que se desee realizar la baja lógica de un graduado. El cartel muestra una advertencia y solicita </w:t>
+      </w:r>
+      <w:r>
+        <w:t xml:space="preserve">una categoría de la baja: </w:t>
+      </w:r>
+      <w:r>
+        <w:t>“E</w:t>
+      </w:r>
+      <w:r>
+        <w:t>rror al ingresar los datos</w:t>
+      </w:r>
+      <w:r>
+        <w:t>” o</w:t>
+      </w:r>
+      <w:r>
+        <w:t xml:space="preserve"> </w:t>
+      </w:r>
+      <w:r>
+        <w:t>“C</w:t>
+      </w:r>
+      <w:r>
+        <w:t>uestiones de carácter administrativo</w:t>
+      </w:r>
+      <w:r>
+        <w:t>”</w:t>
+      </w:r>
+      <w:r>
+        <w:t xml:space="preserve">.  Además, se deberá rellenar un campo desarrollando </w:t>
+      </w:r>
+      <w:r>
+        <w:t>la justificación</w:t>
+      </w:r>
+      <w:r>
+        <w:t xml:space="preserve"> de la </w:t>
+      </w:r>
+      <w:r>
+        <w:t xml:space="preserve">baja de un graduado. </w:t>
+      </w:r>
+    </w:p>
+    <w:p>
+      <w:pPr>
+        <w:pStyle w:val="PSI-Normal"/>
+        <w:numPr>
+          <w:ilvl w:val="0"/>
+          <w:numId w:val="20"/>
+        </w:numPr>
+      </w:pPr>
+      <w:r>
+        <w:rPr>
+          <w:b/>
+          <w:bCs/>
+        </w:rPr>
+        <w:t>RF-</w:t>
+      </w:r>
+      <w:r>
+        <w:rPr>
+          <w:b/>
+          <w:bCs/>
+        </w:rPr>
+        <w:t>14</w:t>
+      </w:r>
+      <w:r>
+        <w:rPr>
+          <w:b/>
+          <w:bCs/>
+        </w:rPr>
+        <w:t>: Listado de graduados dados de baja</w:t>
+      </w:r>
+    </w:p>
+    <w:p>
+      <w:pPr>
+        <w:pStyle w:val="PSI-Normal"/>
+        <w:ind w:left="720"/>
+      </w:pPr>
+      <w:r>
+        <w:t>El sistema debe mantener un listado de todos los graduados dados de baja y su justificación como un guardado de respaldo.</w:t>
+      </w:r>
+    </w:p>
+    <w:p>
+      <w:pPr>
+        <w:pStyle w:val="PSI-Normal"/>
+        <w:numPr>
+          <w:ilvl w:val="0"/>
+          <w:numId w:val="20"/>
+        </w:numPr>
+      </w:pPr>
+      <w:r>
+        <w:rPr>
+          <w:b/>
+          <w:bCs/>
+        </w:rPr>
+        <w:t>RF-</w:t>
+      </w:r>
+      <w:r>
+        <w:rPr>
+          <w:b/>
+          <w:bCs/>
+        </w:rPr>
+        <w:t>15</w:t>
+      </w:r>
+      <w:r>
+        <w:rPr>
+          <w:b/>
+          <w:bCs/>
+        </w:rPr>
+        <w:t>: Eliminación definitiva de graduados</w:t>
+      </w:r>
+    </w:p>
+    <w:p>
+      <w:pPr>
+        <w:pStyle w:val="PSI-Normal"/>
+        <w:ind w:left="720"/>
+      </w:pPr>
+      <w:r>
+        <w:t>El sistema debe permitir que los datos de los alumnos que se encuentren en el listado de graduados dados de baja puedan eliminarse completamente del sistema.</w:t>
+      </w:r>
+    </w:p>
+    <w:p>
+      <w:pPr>
+        <w:pStyle w:val="PSI-Normal"/>
+      </w:pPr>
+      <w:r>
+        <w:t>Módulo de estadística</w:t>
+      </w:r>
+    </w:p>
+    <w:p>
+      <w:pPr>
+        <w:pStyle w:val="PSI-Normal"/>
+        <w:numPr>
+          <w:ilvl w:val="0"/>
+          <w:numId w:val="20"/>
+        </w:numPr>
+      </w:pPr>
+      <w:r>
+        <w:rPr>
+          <w:b/>
+          <w:bCs/>
+        </w:rPr>
+        <w:t>RF-</w:t>
+      </w:r>
+      <w:r>
+        <w:rPr>
+          <w:b/>
+          <w:bCs/>
+        </w:rPr>
+        <w:t>1</w:t>
+      </w:r>
+      <w:r>
+        <w:rPr>
+          <w:b/>
+          <w:bCs/>
+        </w:rPr>
+        <w:t>6</w:t>
+      </w:r>
+      <w:r>
+        <w:rPr>
+          <w:b/>
+          <w:bCs/>
+        </w:rPr>
+        <w:t xml:space="preserve">: </w:t>
+      </w:r>
+      <w:r>
+        <w:rPr>
+          <w:b/>
+          <w:bCs/>
+        </w:rPr>
+        <w:t>Cálculo del promedio histórico</w:t>
+      </w:r>
+      <w:r>
+        <w:rPr>
+          <w:b/>
+          <w:bCs/>
+        </w:rPr>
+        <w:t xml:space="preserve"> sin aplazo y con aplazo</w:t>
+      </w:r>
+    </w:p>
+    <w:p>
+      <w:pPr>
+        <w:pStyle w:val="PSI-Normal"/>
+        <w:ind w:left="720"/>
+      </w:pPr>
+      <w:r>
+        <w:t>El sistema debe</w:t>
+      </w:r>
+      <w:r>
+        <w:t xml:space="preserve"> permitir que se calcule el promedio</w:t>
+      </w:r>
+      <w:r>
+        <w:t xml:space="preserve"> histórico</w:t>
+      </w:r>
+      <w:r>
+        <w:t xml:space="preserve"> sin aplazo y con aplazo </w:t>
+      </w:r>
+      <w:r>
+        <w:t xml:space="preserve">de los graduados </w:t>
+      </w:r>
+      <w:r>
+        <w:t xml:space="preserve">ajustado por: </w:t>
+      </w:r>
+      <w:r>
+        <w:t>carrera, escuela</w:t>
+      </w:r>
+      <w:r>
+        <w:t>, año de ingreso, año de egreso, lapso determinado con fecha de inicio y fecha de cierre</w:t>
+      </w:r>
+      <w:r>
+        <w:t>.</w:t>
+      </w:r>
+    </w:p>
+    <w:p>
+      <w:pPr>
+        <w:pStyle w:val="PSI-Normal"/>
+        <w:numPr>
+          <w:ilvl w:val="0"/>
+          <w:numId w:val="20"/>
+        </w:numPr>
+      </w:pPr>
+      <w:r>
+        <w:rPr>
+          <w:b/>
+          <w:bCs/>
+        </w:rPr>
+        <w:t>RF-1</w:t>
+      </w:r>
+      <w:r>
+        <w:rPr>
+          <w:b/>
+          <w:bCs/>
+        </w:rPr>
+        <w:t>7: Cálculo de totales</w:t>
+      </w:r>
+      <w:r>
+        <w:rPr>
+          <w:b/>
+          <w:bCs/>
+        </w:rPr>
+        <w:t xml:space="preserve"> de graduados</w:t>
+      </w:r>
+    </w:p>
+    <w:p>
+      <w:pPr>
+        <w:pStyle w:val="PSI-Normal"/>
+        <w:ind w:left="720"/>
+      </w:pPr>
+      <w:r>
+        <w:t>El sistema debe calcula</w:t>
+      </w:r>
+      <w:r>
+        <w:t>r los totales de graduados ajustados por</w:t>
+      </w:r>
+      <w:r>
+        <w:t xml:space="preserve">: </w:t>
+      </w:r>
+      <w:r>
+        <w:t>escuela</w:t>
+      </w:r>
+      <w:r>
+        <w:t>, carrera,</w:t>
+      </w:r>
+      <w:r>
+        <w:t xml:space="preserve"> año</w:t>
+      </w:r>
+      <w:r>
+        <w:t xml:space="preserve"> </w:t>
+      </w:r>
+      <w:r>
+        <w:t>ingreso, año de egreso</w:t>
+      </w:r>
+      <w:r>
+        <w:t>,</w:t>
+      </w:r>
+      <w:r>
+        <w:t xml:space="preserve"> y</w:t>
+      </w:r>
+      <w:r>
+        <w:t xml:space="preserve"> lapso determinado con fecha de inicio y fecha de cierre.</w:t>
+      </w:r>
+    </w:p>
+    <w:p>
+      <w:pPr>
+        <w:pStyle w:val="PSI-Normal"/>
+        <w:numPr>
+          <w:ilvl w:val="0"/>
+          <w:numId w:val="20"/>
+        </w:numPr>
+      </w:pPr>
+      <w:r>
+        <w:rPr>
+          <w:b/>
+          <w:bCs/>
+        </w:rPr>
+        <w:t>RF-</w:t>
+      </w:r>
+      <w:r>
+        <w:rPr>
+          <w:b/>
+          <w:bCs/>
+        </w:rPr>
+        <w:t>18</w:t>
+      </w:r>
+      <w:r>
+        <w:rPr>
+          <w:b/>
+          <w:bCs/>
+        </w:rPr>
+        <w:t>: Cálculo de tiempo promedio de graduación</w:t>
+      </w:r>
+    </w:p>
+    <w:p>
+      <w:pPr>
+        <w:pStyle w:val="PSI-Normal"/>
+        <w:ind w:left="720"/>
+      </w:pPr>
+      <w:r>
+        <w:t>El sistema debe calcular el tiempo promedio de graduación por</w:t>
+      </w:r>
+      <w:r>
+        <w:t>:</w:t>
+      </w:r>
+      <w:r>
+        <w:t xml:space="preserve"> escuela, carrera, año de ingreso</w:t>
+      </w:r>
+      <w:r>
+        <w:t>, año de egreso, y lapso con fecha de inicio y fecha de cierre.</w:t>
+      </w:r>
+    </w:p>
+    <w:p>
+      <w:pPr>
+        <w:pStyle w:val="PSI-Normal"/>
+        <w:numPr>
+          <w:ilvl w:val="0"/>
+          <w:numId w:val="20"/>
+        </w:numPr>
+      </w:pPr>
+      <w:r>
+        <w:rPr>
+          <w:b/>
+          <w:bCs/>
+        </w:rPr>
+        <w:t>RF-</w:t>
+      </w:r>
+      <w:r>
+        <w:rPr>
+          <w:b/>
+          <w:bCs/>
+        </w:rPr>
+        <w:t>19</w:t>
+      </w:r>
+      <w:r>
+        <w:rPr>
+          <w:b/>
+          <w:bCs/>
+        </w:rPr>
+        <w:t xml:space="preserve">: </w:t>
+      </w:r>
+      <w:r>
+        <w:rPr>
+          <w:b/>
+          <w:bCs/>
+        </w:rPr>
+        <w:t>Cálculo</w:t>
+      </w:r>
+      <w:r>
+        <w:rPr>
+          <w:b/>
+          <w:bCs/>
+        </w:rPr>
+        <w:t xml:space="preserve"> de la evolución de graduados</w:t>
+      </w:r>
+    </w:p>
+    <w:p>
+      <w:pPr>
+        <w:pStyle w:val="PSI-Normal"/>
+        <w:ind w:left="720"/>
+      </w:pPr>
+      <w:r>
+        <w:lastRenderedPageBreak/>
+        <w:t xml:space="preserve">El sistema debe </w:t>
+      </w:r>
+      <w:r>
+        <w:t xml:space="preserve">calcular la evolución de graduados </w:t>
+      </w:r>
+      <w:r>
+        <w:t>ajustado por</w:t>
+      </w:r>
+      <w:r>
+        <w:t>: carrera, escuela</w:t>
+      </w:r>
+      <w:r>
+        <w:t xml:space="preserve">, año de ingreso, año de egreso, y lapso con fecha de inicio y fecha de cierre. </w:t>
+      </w:r>
+    </w:p>
+    <w:p>
+      <w:pPr>
+        <w:pStyle w:val="PSI-Normal"/>
+        <w:numPr>
+          <w:ilvl w:val="0"/>
+          <w:numId w:val="20"/>
+        </w:numPr>
+      </w:pPr>
+      <w:r>
+        <w:rPr>
+          <w:b/>
+          <w:bCs/>
+        </w:rPr>
+        <w:t>RF-2</w:t>
+      </w:r>
+      <w:r>
+        <w:rPr>
+          <w:b/>
+          <w:bCs/>
+        </w:rPr>
+        <w:t>0</w:t>
+      </w:r>
+      <w:r>
+        <w:rPr>
+          <w:b/>
+          <w:bCs/>
+        </w:rPr>
+        <w:t xml:space="preserve">: </w:t>
+      </w:r>
+      <w:r>
+        <w:rPr>
+          <w:b/>
+          <w:bCs/>
+        </w:rPr>
+        <w:t>Cálculo</w:t>
+      </w:r>
+      <w:r>
+        <w:rPr>
+          <w:b/>
+          <w:bCs/>
+        </w:rPr>
+        <w:t xml:space="preserve"> de la distribución de </w:t>
+      </w:r>
+      <w:r>
+        <w:rPr>
+          <w:b/>
+          <w:bCs/>
+        </w:rPr>
+        <w:t>promedios con y sin aplazo</w:t>
+      </w:r>
+    </w:p>
+    <w:p>
+      <w:pPr>
+        <w:pStyle w:val="PSI-Normal"/>
+        <w:ind w:left="720"/>
+      </w:pPr>
+      <w:r>
+        <w:t xml:space="preserve">El sistema debe </w:t>
+      </w:r>
+      <w:r>
+        <w:t>calcular la distribución</w:t>
+      </w:r>
+      <w:r>
+        <w:t xml:space="preserve"> de</w:t>
+      </w:r>
+      <w:r>
+        <w:t xml:space="preserve"> promedios con y sin aplazo ajustado por</w:t>
+      </w:r>
+      <w:r>
+        <w:t>:</w:t>
+      </w:r>
+      <w:r>
+        <w:t xml:space="preserve"> </w:t>
+      </w:r>
+      <w:r>
+        <w:t>carrera,</w:t>
+      </w:r>
+      <w:r>
+        <w:t xml:space="preserve"> </w:t>
+      </w:r>
+      <w:r>
+        <w:t>escuela,</w:t>
+      </w:r>
+      <w:r>
+        <w:t xml:space="preserve"> </w:t>
+      </w:r>
+      <w:r>
+        <w:t>año de ingreso, año de egreso</w:t>
+      </w:r>
+      <w:r>
+        <w:t>, y lapso con fecha de inicio y fecha de cierre</w:t>
+      </w:r>
+      <w:r>
+        <w:t>. Estos cálculos deben ser ajustables por lapso con una fecha de inicio y una fecha de cierre.</w:t>
+      </w:r>
+    </w:p>
+    <w:p>
+      <w:pPr>
+        <w:pStyle w:val="PSI-Normal"/>
+        <w:numPr>
+          <w:ilvl w:val="0"/>
+          <w:numId w:val="20"/>
+        </w:numPr>
+      </w:pPr>
+      <w:r>
+        <w:rPr>
+          <w:b/>
+          <w:bCs/>
+        </w:rPr>
+        <w:t>RF-</w:t>
+      </w:r>
+      <w:r>
+        <w:rPr>
+          <w:b/>
+          <w:bCs/>
+        </w:rPr>
+        <w:t>2</w:t>
+      </w:r>
+      <w:r>
+        <w:rPr>
+          <w:b/>
+          <w:bCs/>
+        </w:rPr>
+        <w:t>1</w:t>
+      </w:r>
+      <w:r>
+        <w:rPr>
+          <w:b/>
+          <w:bCs/>
+        </w:rPr>
+        <w:t xml:space="preserve">: </w:t>
+      </w:r>
+      <w:r>
+        <w:rPr>
+          <w:b/>
+          <w:bCs/>
+        </w:rPr>
+        <w:t>Representación de los cálculos</w:t>
+      </w:r>
+    </w:p>
+    <w:p>
+      <w:pPr>
+        <w:pStyle w:val="PSI-Normal"/>
+        <w:ind w:left="720"/>
+      </w:pPr>
+      <w:r>
+        <w:t>El sistema debe representar en, al menos, formato tabla/listado y representación gráfica a los cálculos de los siguientes requerimientos: RF-17,</w:t>
+      </w:r>
+      <w:r>
+        <w:t xml:space="preserve"> RF-18, RF-19</w:t>
+      </w:r>
+      <w:r>
+        <w:t xml:space="preserve"> y</w:t>
+      </w:r>
+      <w:r>
+        <w:t xml:space="preserve"> </w:t>
+      </w:r>
+      <w:r>
+        <w:t>RF-</w:t>
+      </w:r>
+      <w:r>
+        <w:t>20.</w:t>
+      </w:r>
+    </w:p>
+    <w:p>
+      <w:pPr>
+        <w:pStyle w:val="PSI-Normal"/>
+      </w:pPr>
+      <w:r>
+        <w:t>Módulo de graduados con baja lógica</w:t>
+      </w:r>
+    </w:p>
+    <w:p>
+      <w:pPr>
+        <w:pStyle w:val="PSI-Normal"/>
+        <w:numPr>
+          <w:ilvl w:val="0"/>
+          <w:numId w:val="20"/>
+        </w:numPr>
+      </w:pPr>
+      <w:r>
+        <w:rPr>
+          <w:b/>
+          <w:bCs/>
+        </w:rPr>
+        <w:t>RF-</w:t>
+      </w:r>
+      <w:r>
+        <w:rPr>
+          <w:b/>
+          <w:bCs/>
+        </w:rPr>
+        <w:t>22</w:t>
+      </w:r>
+      <w:r>
+        <w:rPr>
+          <w:b/>
+          <w:bCs/>
+        </w:rPr>
+        <w:t xml:space="preserve">: </w:t>
+      </w:r>
     </w:p>
     <w:p>
       <w:pPr>
@@ -2945,6 +4115,13 @@
         </w:rPr>
         <w:t>RNF-01:</w:t>
       </w:r>
+      <w:r>
+        <w:rPr>
+          <w:b/>
+          <w:bCs/>
+        </w:rPr>
+        <w:t xml:space="preserve"> Tipo de archivo del analítico</w:t>
+      </w:r>
     </w:p>
     <w:p>
       <w:pPr>
@@ -2952,7 +4129,55 @@
         <w:ind w:left="720"/>
       </w:pPr>
       <w:r>
-        <w:t>.</w:t>
+        <w:t>El sistema debe permitir que el analítico del graduado sea generado en formato PDF y formato docs.</w:t>
+      </w:r>
+    </w:p>
+    <w:p>
+      <w:pPr>
+        <w:pStyle w:val="PSI-Normal"/>
+        <w:numPr>
+          <w:ilvl w:val="0"/>
+          <w:numId w:val="21"/>
+        </w:numPr>
+      </w:pPr>
+      <w:r>
+        <w:rPr>
+          <w:b/>
+          <w:bCs/>
+        </w:rPr>
+        <w:t>RNF-02: Uso del framework UARGFlow</w:t>
+      </w:r>
+    </w:p>
+    <w:p>
+      <w:pPr>
+        <w:pStyle w:val="PSI-Normal"/>
+        <w:numPr>
+          <w:ilvl w:val="0"/>
+          <w:numId w:val="21"/>
+        </w:numPr>
+      </w:pPr>
+      <w:r>
+        <w:rPr>
+          <w:b/>
+          <w:bCs/>
+        </w:rPr>
+        <w:t>RNF-03: Acceso limitado</w:t>
+      </w:r>
+    </w:p>
+    <w:p>
+      <w:pPr>
+        <w:pStyle w:val="PSI-Normal"/>
+        <w:numPr>
+          <w:ilvl w:val="0"/>
+          <w:numId w:val="21"/>
+        </w:numPr>
+      </w:pPr>
+      <w:r>
+        <w:rPr>
+          <w:b/>
+          <w:bCs/>
+        </w:rPr>
+        <w:t xml:space="preserve">RNF-04: </w:t>
       </w:r>
     </w:p>
     <w:p>
@@ -2966,56 +4191,56 @@
       </w:pPr>
       <w:bookmarkStart w:id="20" w:name="_Toc240000037"/>
       <w:r>
+        <w:t>Supuestos e incertidumbres</w:t>
+      </w:r>
+      <w:bookmarkEnd w:id="20"/>
+    </w:p>
+    <w:p>
+      <w:pPr>
+        <w:pStyle w:val="PSI-Normal"/>
+      </w:pPr>
+      <w:r>
+        <w:t xml:space="preserve">Una vez completada la especificación de los requerimientos obtenidos, se </w:t>
+      </w:r>
+      <w:r>
+        <w:t>plantean las siguientes incertidumbres y supuestos</w:t>
+      </w:r>
+      <w:r>
+        <w:t xml:space="preserve"> con respecto a las funcionalidades y restricciones del sistema.</w:t>
+      </w:r>
+      <w:r>
+        <w:t xml:space="preserve"> Estas incertidumbres se originan del análisis de los requerimientos y los insumos</w:t>
+      </w:r>
+      <w:r>
+        <w:t xml:space="preserve"> </w:t>
+      </w:r>
+      <w:r>
+        <w:t xml:space="preserve">utilizados para la especificación de requerimientos. </w:t>
+      </w:r>
+    </w:p>
+    <w:p>
+      <w:pPr>
+        <w:pStyle w:val="PSI-Normal"/>
+      </w:pPr>
+      <w:r>
+        <w:t>Las incertidumbres abarcan cuestiones relacionadas a los procesos y cómo debe funcionar el sistema basándose en los objetivos del cliente. Para ello, se plantea una pregunta que no posee una respuesta clara y posibles soluciones a esa incertidumbre.</w:t>
+      </w:r>
+    </w:p>
+    <w:p>
+      <w:pPr>
+        <w:pStyle w:val="PSI-Normal"/>
+      </w:pPr>
+      <w:r>
+        <w:t>En el caso de los supuestos, se plantean ideas que se han nombrado en alguno de los insumos utilizados para el documento, pero que no han sido definidos. Los supuestos implican un tema parcialmente claro en el cuál se intenta suponer y buscar una solución.</w:t>
+      </w:r>
+    </w:p>
+    <w:p>
+      <w:pPr>
+        <w:pStyle w:val="PSI-Ttulo2"/>
+      </w:pPr>
+      <w:bookmarkStart w:id="21" w:name="_Toc240000038"/>
+      <w:r>
         <w:lastRenderedPageBreak/>
-        <w:t>Supuestos e incertidumbres</w:t>
-      </w:r>
-      <w:bookmarkEnd w:id="20"/>
-    </w:p>
-    <w:p>
-      <w:pPr>
-        <w:pStyle w:val="PSI-Normal"/>
-      </w:pPr>
-      <w:r>
-        <w:t xml:space="preserve">Una vez completada la especificación de los requerimientos obtenidos, se </w:t>
-      </w:r>
-      <w:r>
-        <w:t>plantean las siguientes incertidumbres y supuestos</w:t>
-      </w:r>
-      <w:r>
-        <w:t xml:space="preserve"> con respecto a las funcionalidades y restricciones del sistema.</w:t>
-      </w:r>
-      <w:r>
-        <w:t xml:space="preserve"> Estas incertidumbres se originan del análisis de los requerimientos y los insumos</w:t>
-      </w:r>
-      <w:r>
-        <w:t xml:space="preserve"> </w:t>
-      </w:r>
-      <w:r>
-        <w:t xml:space="preserve">utilizados para la especificación de requerimientos. </w:t>
-      </w:r>
-    </w:p>
-    <w:p>
-      <w:pPr>
-        <w:pStyle w:val="PSI-Normal"/>
-      </w:pPr>
-      <w:r>
-        <w:t>Las incertidumbres abarcan cuestiones relacionadas a los procesos y cómo debe funcionar el sistema basándose en los objetivos del cliente. Para ello, se plantea una pregunta que no posee una respuesta clara y posibles soluciones a esa incertidumbre.</w:t>
-      </w:r>
-    </w:p>
-    <w:p>
-      <w:pPr>
-        <w:pStyle w:val="PSI-Normal"/>
-      </w:pPr>
-      <w:r>
-        <w:t>En el caso de los supuestos, se plantean ideas que se han nombrado en alguno de los insumos utilizados para el documento, pero que no han sido definidos. Los supuestos implican un tema parcialmente claro en el cuál se intenta suponer y buscar una solución.</w:t>
-      </w:r>
-    </w:p>
-    <w:p>
-      <w:pPr>
-        <w:pStyle w:val="PSI-Ttulo2"/>
-      </w:pPr>
-      <w:bookmarkStart w:id="21" w:name="_Toc240000038"/>
-      <w:r>
         <w:t>Incertidumbres</w:t>
       </w:r>
       <w:bookmarkEnd w:id="21"/>
@@ -3198,7 +4423,6 @@
         <w:ind w:left="720"/>
       </w:pPr>
       <w:r>
-        <w:lastRenderedPageBreak/>
         <w:t xml:space="preserve">El hecho de si los comercios realmente les interesan dato estadístico es un punto que modifica la personalización de la interfaz y el entorno en el cuál se manejará un comercio adherido al programa de credenciales universitarias dentro del sistema. Las estadísticas pueden ser de utilidad, pero para el desarrollo del presente documento no se poseen insumos que correspondan a requerimientos obtenidos de los comercios adheridos. </w:t>
       </w:r>
     </w:p>
@@ -3233,6 +4457,7 @@
           <w:b/>
           <w:bCs/>
         </w:rPr>
+        <w:lastRenderedPageBreak/>
         <w:t>Solución 1</w:t>
       </w:r>
       <w:r>
@@ -3361,11 +4586,7 @@
         <w:t>en formato de hoja de cálculo o similares</w:t>
       </w:r>
       <w:r>
-        <w:t xml:space="preserve">, el sistema podría adaptar solicitar un formato específico para la </w:t>
-      </w:r>
-      <w:r>
-        <w:lastRenderedPageBreak/>
-        <w:t>carga de datos tanto de hojas de cálculo de Personal como los listados obtenidos del SIU Guaraní, permitiendo así una validación automática si se desea.</w:t>
+        <w:t>, el sistema podría adaptar solicitar un formato específico para la carga de datos tanto de hojas de cálculo de Personal como los listados obtenidos del SIU Guaraní, permitiendo así una validación automática si se desea.</w:t>
       </w:r>
     </w:p>
     <w:p>
@@ -3433,6 +4654,7 @@
       </w:pPr>
       <w:bookmarkStart w:id="22" w:name="_Toc240000039"/>
       <w:r>
+        <w:lastRenderedPageBreak/>
         <w:t>Supuestos</w:t>
       </w:r>
       <w:bookmarkEnd w:id="22"/>
@@ -3604,45 +4826,51 @@
           <w:b/>
           <w:bCs/>
         </w:rPr>
+        <w:t>Solución 3</w:t>
+      </w:r>
+      <w:r>
+        <w:t>:</w:t>
+      </w:r>
+      <w:r>
+        <w:t xml:space="preserve"> Esta última solución no plantea el uso de un QR, sino que p</w:t>
+      </w:r>
+      <w:r>
+        <w:t>ropone la utilización de un código OTP y un algoritmo TOTP (Time-Based One-Time Password). El beneficiario genera un código OTP de seis dígitos con un vencimiento de 2 minutos y se la pasa al comerciante, el cuál valida en el sistema el código ofrecido. Sin embargo, esta aplicación posee una gran complejidad matemática y algorítmica detrás, por lo que es poco factible de llevar a cabo.</w:t>
+      </w:r>
+    </w:p>
+    <w:p>
+      <w:pPr>
+        <w:pStyle w:val="PSI-Normal"/>
+      </w:pPr>
+    </w:p>
+    <w:p>
+      <w:pPr>
+        <w:pStyle w:val="PSI-Ttulo1"/>
+      </w:pPr>
+      <w:bookmarkStart w:id="23" w:name="_Toc240000040"/>
+      <w:r>
+        <w:t>Conclusión</w:t>
+      </w:r>
+      <w:bookmarkEnd w:id="23"/>
+    </w:p>
+    <w:p>
+      <w:pPr>
+        <w:rPr>
+          <w:lang w:val="es-AR"/>
+        </w:rPr>
+      </w:pPr>
+      <w:r>
+        <w:rPr>
+          <w:lang w:val="es-AR"/>
+        </w:rPr>
+        <w:t xml:space="preserve">El Sistema de Credenciales Universitarias Digitales reemplazará el circuito manual y fragmentado actual (Google Forms, Sheets, Excel, Word y Drive) por una plataforma web </w:t>
+      </w:r>
+      <w:r>
+        <w:rPr>
+          <w:lang w:val="es-AR"/>
+        </w:rPr>
         <w:lastRenderedPageBreak/>
-        <w:t>Solución 3</w:t>
-      </w:r>
-      <w:r>
-        <w:t>:</w:t>
-      </w:r>
-      <w:r>
-        <w:t xml:space="preserve"> Esta última solución no plantea el uso de un QR, sino que p</w:t>
-      </w:r>
-      <w:r>
-        <w:t>ropone la utilización de un código OTP y un algoritmo TOTP (Time-Based One-Time Password). El beneficiario genera un código OTP de seis dígitos con un vencimiento de 2 minutos y se la pasa al comerciante, el cuál valida en el sistema el código ofrecido. Sin embargo, esta aplicación posee una gran complejidad matemática y algorítmica detrás, por lo que es poco factible de llevar a cabo.</w:t>
-      </w:r>
-    </w:p>
-    <w:p>
-      <w:pPr>
-        <w:pStyle w:val="PSI-Normal"/>
-      </w:pPr>
-    </w:p>
-    <w:p>
-      <w:pPr>
-        <w:pStyle w:val="PSI-Ttulo1"/>
-      </w:pPr>
-      <w:bookmarkStart w:id="23" w:name="_Toc240000040"/>
-      <w:r>
-        <w:t>Conclusión</w:t>
-      </w:r>
-      <w:bookmarkEnd w:id="23"/>
-    </w:p>
-    <w:p>
-      <w:pPr>
-        <w:rPr>
-          <w:lang w:val="es-AR"/>
-        </w:rPr>
-      </w:pPr>
-      <w:r>
-        <w:rPr>
-          <w:lang w:val="es-AR"/>
-        </w:rPr>
-        <w:t>El Sistema de Credenciales Universitarias Digitales reemplazará el circuito manual y fragmentado actual (Google Forms, Sheets, Excel, Word y Drive) por una plataforma web unificada y alojada en servidores propios de la universidad. Esto optimizará los tiempos de emisión, evitará la falsificación de archivos PDF y protegerá los datos sensibles de los usuarios.</w:t>
+        <w:t>unificada y alojada en servidores propios de la universidad. Esto optimizará los tiempos de emisión, evitará la falsificación de archivos PDF y protegerá los datos sensibles de los usuarios.</w:t>
       </w:r>
     </w:p>
     <w:p>

</xml_diff>

<commit_message>
DOC:Avance con especificación de CU. Casi completo
</commit_message>
<xml_diff>
--- a/A-Documentacion/A-Inicio/Iteracion1-31_8-al-20_9/2-ListadoRequerimientos/eGradudos_Inicio_Iteracion1_RequerimientosPreliminares.docx
+++ b/A-Documentacion/A-Inicio/Iteracion1-31_8-al-20_9/2-ListadoRequerimientos/eGradudos_Inicio_Iteracion1_RequerimientosPreliminares.docx
@@ -4041,7 +4041,46 @@
           <w:b/>
           <w:bCs/>
         </w:rPr>
-        <w:t>RF-</w:t>
+        <w:t>RF-2</w:t>
+      </w:r>
+      <w:r>
+        <w:rPr>
+          <w:b/>
+          <w:bCs/>
+        </w:rPr>
+        <w:t>1</w:t>
+      </w:r>
+      <w:r>
+        <w:rPr>
+          <w:b/>
+          <w:bCs/>
+        </w:rPr>
+        <w:t>: Listado de graduados dados de baja</w:t>
+      </w:r>
+    </w:p>
+    <w:p>
+      <w:pPr>
+        <w:pStyle w:val="PSI-Normal"/>
+        <w:ind w:left="720"/>
+      </w:pPr>
+      <w:r>
+        <w:t>El sistema debe mantener un listado de todos los graduados dados de baja con la justificación de su baja como un guardado de respaldo.</w:t>
+      </w:r>
+    </w:p>
+    <w:p>
+      <w:pPr>
+        <w:pStyle w:val="PSI-Normal"/>
+        <w:numPr>
+          <w:ilvl w:val="0"/>
+          <w:numId w:val="20"/>
+        </w:numPr>
+      </w:pPr>
+      <w:r>
+        <w:rPr>
+          <w:b/>
+          <w:bCs/>
+        </w:rPr>
+        <w:t>RF-2</w:t>
       </w:r>
       <w:r>
         <w:rPr>
@@ -4055,14 +4094,7 @@
           <w:b/>
           <w:bCs/>
         </w:rPr>
-        <w:t>1</w:t>
-      </w:r>
-      <w:r>
-        <w:rPr>
-          <w:b/>
-          <w:bCs/>
-        </w:rPr>
-        <w:t>: Listado de graduados dados de baja</w:t>
+        <w:t>: Eliminación definitiva de graduados</w:t>
       </w:r>
     </w:p>
     <w:p>
@@ -4071,19 +4103,7 @@
         <w:ind w:left="720"/>
       </w:pPr>
       <w:r>
-        <w:t xml:space="preserve">El sistema debe mantener un listado de todos los graduados dados de baja </w:t>
-      </w:r>
-      <w:r>
-        <w:t xml:space="preserve">con la </w:t>
-      </w:r>
-      <w:r>
-        <w:t>justificación</w:t>
-      </w:r>
-      <w:r>
-        <w:t xml:space="preserve"> de su baja</w:t>
-      </w:r>
-      <w:r>
-        <w:t xml:space="preserve"> como un guardado de respaldo.</w:t>
+        <w:t>El sistema debe permitir que los datos de los alumnos que se encuentren en el listado de graduados dados de baja puedan eliminarse completamente del sistema.</w:t>
       </w:r>
     </w:p>
     <w:p>
@@ -4099,28 +4119,21 @@
           <w:b/>
           <w:bCs/>
         </w:rPr>
-        <w:t>RF-</w:t>
+        <w:t>RF-2</w:t>
       </w:r>
       <w:r>
         <w:rPr>
           <w:b/>
           <w:bCs/>
         </w:rPr>
-        <w:t>2</w:t>
+        <w:t>3</w:t>
       </w:r>
       <w:r>
         <w:rPr>
           <w:b/>
           <w:bCs/>
         </w:rPr>
-        <w:t>2</w:t>
-      </w:r>
-      <w:r>
-        <w:rPr>
-          <w:b/>
-          <w:bCs/>
-        </w:rPr>
-        <w:t>: Eliminación definitiva de graduados</w:t>
+        <w:t>: Alta de graduados con baja lógica</w:t>
       </w:r>
     </w:p>
     <w:p>
@@ -4129,7 +4142,7 @@
         <w:ind w:left="720"/>
       </w:pPr>
       <w:r>
-        <w:t>El sistema debe permitir que los datos de los alumnos que se encuentren en el listado de graduados dados de baja puedan eliminarse completamente del sistema.</w:t>
+        <w:t>El sistema debe permitir que los alumnos que se encuentren en el listado de graduados de baja puedan darse de alta nuevamente e incorporarse al listado de graduados</w:t>
       </w:r>
     </w:p>
     <w:p>
@@ -4152,14 +4165,14 @@
           <w:b/>
           <w:bCs/>
         </w:rPr>
-        <w:t>3</w:t>
+        <w:t>4</w:t>
       </w:r>
       <w:r>
         <w:rPr>
           <w:b/>
           <w:bCs/>
         </w:rPr>
-        <w:t>: Alta de graduados con baja lógica</w:t>
+        <w:t>: Modificación de graduados con baja lógica</w:t>
       </w:r>
     </w:p>
     <w:p>
@@ -4168,7 +4181,18 @@
         <w:ind w:left="720"/>
       </w:pPr>
       <w:r>
-        <w:t>El sistema debe permitir que los alumnos que se encuentren en el listado de graduados de baja puedan darse de alta nuevamente e incorporarse al listado de graduados</w:t>
+        <w:t xml:space="preserve">El sistema debe permitir que se modifiquen los datos de los alumnos que se encuentren en el listado de graduados de baja. </w:t>
+      </w:r>
+    </w:p>
+    <w:p>
+      <w:pPr>
+        <w:pStyle w:val="PSI-Normal"/>
+      </w:pPr>
+      <w:r>
+        <w:t>Módulo</w:t>
+      </w:r>
+      <w:r>
+        <w:t xml:space="preserve"> de carga de datos</w:t>
       </w:r>
     </w:p>
     <w:p>
@@ -4184,7 +4208,299 @@
           <w:b/>
           <w:bCs/>
         </w:rPr>
-        <w:t>RF-2</w:t>
+        <w:t>RF-25: Carga de graduados por Excel</w:t>
+      </w:r>
+    </w:p>
+    <w:p>
+      <w:pPr>
+        <w:pStyle w:val="PSI-Normal"/>
+        <w:ind w:left="720"/>
+      </w:pPr>
+      <w:r>
+        <w:t xml:space="preserve">El sistema debe permitir que se carguen nuevos graduados a través la carga de un Excel que cuente con la siguiente estructura: </w:t>
+      </w:r>
+      <w:r>
+        <w:t xml:space="preserve">legajo del graduado, </w:t>
+      </w:r>
+      <w:r>
+        <w:t xml:space="preserve">apellidos del graduado, nombres del graduado, </w:t>
+      </w:r>
+      <w:r>
+        <w:t>código de la carrera, promedio sin aplazo, promedio con aplazo, fecha de ingreso a la carrera, fecha de egreso de la carrera.</w:t>
+      </w:r>
+    </w:p>
+    <w:p>
+      <w:pPr>
+        <w:pStyle w:val="PSI-Normal"/>
+        <w:numPr>
+          <w:ilvl w:val="0"/>
+          <w:numId w:val="20"/>
+        </w:numPr>
+      </w:pPr>
+      <w:r>
+        <w:rPr>
+          <w:b/>
+          <w:bCs/>
+        </w:rPr>
+        <w:t>RF-26: Carga de certificado Lincoln</w:t>
+      </w:r>
+    </w:p>
+    <w:p>
+      <w:pPr>
+        <w:pStyle w:val="PSI-Normal"/>
+        <w:ind w:left="720"/>
+      </w:pPr>
+      <w:r>
+        <w:t>El sistema debe permitir que se cargue el certificado Lincoln de un graduado en formato Excel para que el sistema pueda realizar el seguimiento de los exámenes, materias de graduados ya cargados en el sistema o crear nuevos graduados a partir de los datos del certificado</w:t>
+      </w:r>
+    </w:p>
+    <w:p>
+      <w:pPr>
+        <w:pStyle w:val="PSI-Normal"/>
+        <w:numPr>
+          <w:ilvl w:val="0"/>
+          <w:numId w:val="20"/>
+        </w:numPr>
+      </w:pPr>
+      <w:r>
+        <w:rPr>
+          <w:b/>
+          <w:bCs/>
+        </w:rPr>
+        <w:t>RF-27: Actualización de datos de graduados con carga de datos</w:t>
+      </w:r>
+      <w:r>
+        <w:t xml:space="preserve"> </w:t>
+      </w:r>
+    </w:p>
+    <w:p>
+      <w:pPr>
+        <w:pStyle w:val="PSI-Normal"/>
+        <w:ind w:left="720"/>
+      </w:pPr>
+      <w:r>
+        <w:lastRenderedPageBreak/>
+        <w:t xml:space="preserve">El sistema debe validar si, al momento de la carga de archivos, el legajo de un graduado se encuentra en el sistema. Si no se encuentra se debe consultar mediante opciones (si/no) si se desea cargar al nuevo graduado, en caso contrario se debe consultar mediante opciones (si/no) si desea actualizar/modificar datos de un graduado ya existente. </w:t>
+      </w:r>
+    </w:p>
+    <w:p>
+      <w:pPr>
+        <w:pStyle w:val="PSI-Normal"/>
+        <w:numPr>
+          <w:ilvl w:val="0"/>
+          <w:numId w:val="20"/>
+        </w:numPr>
+      </w:pPr>
+      <w:r>
+        <w:rPr>
+          <w:b/>
+          <w:bCs/>
+        </w:rPr>
+        <w:t>RF-28: Carga de datos de becas</w:t>
+      </w:r>
+    </w:p>
+    <w:p>
+      <w:pPr>
+        <w:pStyle w:val="PSI-Normal"/>
+        <w:ind w:left="720"/>
+      </w:pPr>
+      <w:r>
+        <w:t xml:space="preserve">El sistema debe permitir la carga de archivos Excel con información de la beca de los graduados. </w:t>
+      </w:r>
+    </w:p>
+    <w:p>
+      <w:pPr>
+        <w:pStyle w:val="PSI-Normal"/>
+      </w:pPr>
+      <w:r>
+        <w:t>Módulo de transacciones</w:t>
+      </w:r>
+    </w:p>
+    <w:p>
+      <w:pPr>
+        <w:pStyle w:val="PSI-Normal"/>
+        <w:numPr>
+          <w:ilvl w:val="0"/>
+          <w:numId w:val="20"/>
+        </w:numPr>
+      </w:pPr>
+      <w:r>
+        <w:rPr>
+          <w:b/>
+          <w:bCs/>
+        </w:rPr>
+        <w:t>RF-29: Registro de operaciones</w:t>
+      </w:r>
+    </w:p>
+    <w:p>
+      <w:pPr>
+        <w:pStyle w:val="PSI-Normal"/>
+        <w:ind w:left="720"/>
+      </w:pPr>
+      <w:r>
+        <w:t xml:space="preserve">El sistema debe registrar las siguientes operaciones en un listado: inserción de graduado (por analítico o por carga de datos), modificación de los datos de un graduado, baja lógica de un graduado, alta de un alumno con baja lógica, modificación de datos de un </w:t>
+      </w:r>
+      <w:r>
+        <w:t>alumno</w:t>
+      </w:r>
+      <w:r>
+        <w:t xml:space="preserve"> con baja lógica</w:t>
+      </w:r>
+      <w:r>
+        <w:t xml:space="preserve"> y</w:t>
+      </w:r>
+      <w:r>
+        <w:t xml:space="preserve"> </w:t>
+      </w:r>
+      <w:r>
+        <w:t xml:space="preserve">eliminación de alumno con baja lógica. </w:t>
+      </w:r>
+    </w:p>
+    <w:p>
+      <w:pPr>
+        <w:pStyle w:val="PSI-Normal"/>
+        <w:numPr>
+          <w:ilvl w:val="0"/>
+          <w:numId w:val="20"/>
+        </w:numPr>
+      </w:pPr>
+      <w:r>
+        <w:rPr>
+          <w:b/>
+          <w:bCs/>
+        </w:rPr>
+        <w:t>RF-30: Información de operaciones</w:t>
+      </w:r>
+    </w:p>
+    <w:p>
+      <w:pPr>
+        <w:pStyle w:val="PSI-Normal"/>
+        <w:ind w:left="720"/>
+      </w:pPr>
+      <w:r>
+        <w:t xml:space="preserve">El sistema debe registrar la siguiente información de cada operación: fecha de la operación, usuario que realiza la operación, legajo del graduado y una observación sobre la operación. </w:t>
+      </w:r>
+    </w:p>
+    <w:p>
+      <w:pPr>
+        <w:pStyle w:val="PSI-Ttulo2"/>
+      </w:pPr>
+      <w:r>
+        <w:t xml:space="preserve">Requerimientos no </w:t>
+      </w:r>
+      <w:r>
+        <w:t>funcionales</w:t>
+      </w:r>
+      <w:bookmarkEnd w:id="19"/>
+    </w:p>
+    <w:p>
+      <w:pPr>
+        <w:pStyle w:val="PSI-Normal"/>
+      </w:pPr>
+      <w:r>
+        <w:t>Inicio</w:t>
+      </w:r>
+    </w:p>
+    <w:p>
+      <w:pPr>
+        <w:pStyle w:val="PSI-Normal"/>
+        <w:numPr>
+          <w:ilvl w:val="0"/>
+          <w:numId w:val="20"/>
+        </w:numPr>
+      </w:pPr>
+      <w:r>
+        <w:rPr>
+          <w:b/>
+          <w:bCs/>
+        </w:rPr>
+        <w:t>RFN-01: Interfaz del inicio</w:t>
+      </w:r>
+    </w:p>
+    <w:p>
+      <w:pPr>
+        <w:pStyle w:val="PSI-Normal"/>
+        <w:ind w:left="720"/>
+      </w:pPr>
+      <w:r>
+        <w:t>El sistema debe tener una pantalla de inicio minimalista, grande e intuitiva.</w:t>
+      </w:r>
+    </w:p>
+    <w:p>
+      <w:pPr>
+        <w:pStyle w:val="PSI-Normal"/>
+        <w:numPr>
+          <w:ilvl w:val="0"/>
+          <w:numId w:val="20"/>
+        </w:numPr>
+      </w:pPr>
+      <w:r>
+        <w:rPr>
+          <w:b/>
+          <w:bCs/>
+        </w:rPr>
+        <w:t>RNF-02: Navegación entre apartados</w:t>
+      </w:r>
+    </w:p>
+    <w:p>
+      <w:pPr>
+        <w:pStyle w:val="PSI-Normal"/>
+        <w:ind w:left="720"/>
+      </w:pPr>
+      <w:r>
+        <w:t xml:space="preserve">El sistema debe garantizar que un usuario navegue entre cada una de las distintas pantallas con un retraso no mayor a 2 segundos. </w:t>
+      </w:r>
+    </w:p>
+    <w:p>
+      <w:pPr>
+        <w:pStyle w:val="PSI-Normal"/>
+        <w:numPr>
+          <w:ilvl w:val="0"/>
+          <w:numId w:val="21"/>
+        </w:numPr>
+      </w:pPr>
+      <w:r>
+        <w:rPr>
+          <w:b/>
+          <w:bCs/>
+        </w:rPr>
+        <w:t>RNF-03: Uso del framework UARGFlow</w:t>
+      </w:r>
+    </w:p>
+    <w:p>
+      <w:pPr>
+        <w:pStyle w:val="PSI-Normal"/>
+        <w:ind w:left="720"/>
+      </w:pPr>
+      <w:r>
+        <w:t>El sistema debe utilizar el framework UARGFlow para la autenticación de usuarios</w:t>
+      </w:r>
+      <w:r>
+        <w:t>.</w:t>
+      </w:r>
+    </w:p>
+    <w:p>
+      <w:pPr>
+        <w:pStyle w:val="PSI-Normal"/>
+      </w:pPr>
+      <w:r>
+        <w:t>Módulo de analíticos</w:t>
+      </w:r>
+    </w:p>
+    <w:p>
+      <w:pPr>
+        <w:pStyle w:val="PSI-Normal"/>
+        <w:numPr>
+          <w:ilvl w:val="0"/>
+          <w:numId w:val="21"/>
+        </w:numPr>
+      </w:pPr>
+      <w:r>
+        <w:rPr>
+          <w:b/>
+          <w:bCs/>
+        </w:rPr>
+        <w:t>RNF-0</w:t>
       </w:r>
       <w:r>
         <w:rPr>
@@ -4198,362 +4514,6 @@
           <w:b/>
           <w:bCs/>
         </w:rPr>
-        <w:t>: Modificación de graduados con baja lógica</w:t>
-      </w:r>
-    </w:p>
-    <w:p>
-      <w:pPr>
-        <w:pStyle w:val="PSI-Normal"/>
-        <w:ind w:left="720"/>
-      </w:pPr>
-      <w:r>
-        <w:t xml:space="preserve">El sistema debe permitir que se modifiquen los datos de los alumnos que se encuentren en el listado de graduados de baja. </w:t>
-      </w:r>
-    </w:p>
-    <w:p>
-      <w:pPr>
-        <w:pStyle w:val="PSI-Normal"/>
-      </w:pPr>
-      <w:r>
-        <w:t>Módulo</w:t>
-      </w:r>
-      <w:r>
-        <w:t xml:space="preserve"> de carga de datos</w:t>
-      </w:r>
-    </w:p>
-    <w:p>
-      <w:pPr>
-        <w:pStyle w:val="PSI-Normal"/>
-        <w:numPr>
-          <w:ilvl w:val="0"/>
-          <w:numId w:val="20"/>
-        </w:numPr>
-      </w:pPr>
-      <w:r>
-        <w:rPr>
-          <w:b/>
-          <w:bCs/>
-        </w:rPr>
-        <w:t>RF-25: Carga de graduados por Excel</w:t>
-      </w:r>
-    </w:p>
-    <w:p>
-      <w:pPr>
-        <w:pStyle w:val="PSI-Normal"/>
-        <w:ind w:left="720"/>
-      </w:pPr>
-      <w:r>
-        <w:t xml:space="preserve">El sistema debe permitir que se carguen nuevos graduados a través la carga de un Excel que cuente con la siguiente estructura: </w:t>
-      </w:r>
-      <w:r>
-        <w:t xml:space="preserve">legajo del graduado, </w:t>
-      </w:r>
-      <w:r>
-        <w:t xml:space="preserve">apellidos del graduado, nombres del graduado, </w:t>
-      </w:r>
-      <w:r>
-        <w:t>código de la carrera, promedio sin aplazo, promedio con aplazo, fecha de ingreso a la carrera, fecha de egreso de la carrera.</w:t>
-      </w:r>
-    </w:p>
-    <w:p>
-      <w:pPr>
-        <w:pStyle w:val="PSI-Normal"/>
-        <w:numPr>
-          <w:ilvl w:val="0"/>
-          <w:numId w:val="20"/>
-        </w:numPr>
-      </w:pPr>
-      <w:r>
-        <w:rPr>
-          <w:b/>
-          <w:bCs/>
-        </w:rPr>
-        <w:t>RF-26: Carga de certificado Lincoln</w:t>
-      </w:r>
-    </w:p>
-    <w:p>
-      <w:pPr>
-        <w:pStyle w:val="PSI-Normal"/>
-        <w:ind w:left="720"/>
-      </w:pPr>
-      <w:r>
-        <w:t>El sistema debe permitir que se cargue el certificado Lincoln de un graduado en formato Excel para que el sistema pueda realizar el seguimiento de los exámenes, materias de graduados ya cargados en el sistema o crear nuevos graduados a partir de los datos del certificado</w:t>
-      </w:r>
-    </w:p>
-    <w:p>
-      <w:pPr>
-        <w:pStyle w:val="PSI-Normal"/>
-        <w:numPr>
-          <w:ilvl w:val="0"/>
-          <w:numId w:val="20"/>
-        </w:numPr>
-      </w:pPr>
-      <w:r>
-        <w:rPr>
-          <w:b/>
-          <w:bCs/>
-        </w:rPr>
-        <w:t>RF-27: Actualización de datos de graduados con carga de datos</w:t>
-      </w:r>
-      <w:r>
-        <w:t xml:space="preserve"> </w:t>
-      </w:r>
-    </w:p>
-    <w:p>
-      <w:pPr>
-        <w:pStyle w:val="PSI-Normal"/>
-        <w:ind w:left="720"/>
-      </w:pPr>
-      <w:r>
-        <w:lastRenderedPageBreak/>
-        <w:t xml:space="preserve">El sistema debe validar si, al momento de la carga de archivos, el legajo de un graduado se encuentra en el sistema. Si no se encuentra se debe consultar mediante opciones (si/no) si se desea cargar al nuevo graduado, en caso contrario se debe consultar mediante opciones (si/no) si desea actualizar/modificar datos de un graduado ya existente. </w:t>
-      </w:r>
-    </w:p>
-    <w:p>
-      <w:pPr>
-        <w:pStyle w:val="PSI-Normal"/>
-        <w:numPr>
-          <w:ilvl w:val="0"/>
-          <w:numId w:val="20"/>
-        </w:numPr>
-      </w:pPr>
-      <w:r>
-        <w:rPr>
-          <w:b/>
-          <w:bCs/>
-        </w:rPr>
-        <w:t>RF-28: Carga de datos de becas</w:t>
-      </w:r>
-    </w:p>
-    <w:p>
-      <w:pPr>
-        <w:pStyle w:val="PSI-Normal"/>
-        <w:ind w:left="720"/>
-      </w:pPr>
-      <w:r>
-        <w:t xml:space="preserve">El sistema debe permitir la carga de archivos Excel con información de la beca de los graduados. </w:t>
-      </w:r>
-    </w:p>
-    <w:p>
-      <w:pPr>
-        <w:pStyle w:val="PSI-Normal"/>
-      </w:pPr>
-      <w:r>
-        <w:t>Módulo de transacciones</w:t>
-      </w:r>
-    </w:p>
-    <w:p>
-      <w:pPr>
-        <w:pStyle w:val="PSI-Normal"/>
-        <w:numPr>
-          <w:ilvl w:val="0"/>
-          <w:numId w:val="20"/>
-        </w:numPr>
-      </w:pPr>
-      <w:r>
-        <w:rPr>
-          <w:b/>
-          <w:bCs/>
-        </w:rPr>
-        <w:t>RF-29: Registro de operaciones</w:t>
-      </w:r>
-    </w:p>
-    <w:p>
-      <w:pPr>
-        <w:pStyle w:val="PSI-Normal"/>
-        <w:ind w:left="720"/>
-      </w:pPr>
-      <w:r>
-        <w:t xml:space="preserve">El sistema debe registrar las siguientes operaciones en un listado: inserción de graduado (por analítico o por carga de datos), modificación de los datos de un graduado, baja lógica de un graduado, alta de un alumno con baja lógica, modificación de datos de un </w:t>
-      </w:r>
-      <w:r>
-        <w:t>alumno</w:t>
-      </w:r>
-      <w:r>
-        <w:t xml:space="preserve"> con baja lógica</w:t>
-      </w:r>
-      <w:r>
-        <w:t xml:space="preserve"> y</w:t>
-      </w:r>
-      <w:r>
-        <w:t xml:space="preserve"> </w:t>
-      </w:r>
-      <w:r>
-        <w:t xml:space="preserve">eliminación de alumno con baja lógica. </w:t>
-      </w:r>
-    </w:p>
-    <w:p>
-      <w:pPr>
-        <w:pStyle w:val="PSI-Normal"/>
-        <w:numPr>
-          <w:ilvl w:val="0"/>
-          <w:numId w:val="20"/>
-        </w:numPr>
-      </w:pPr>
-      <w:r>
-        <w:rPr>
-          <w:b/>
-          <w:bCs/>
-        </w:rPr>
-        <w:t>RF-30: Información de operaciones</w:t>
-      </w:r>
-    </w:p>
-    <w:p>
-      <w:pPr>
-        <w:pStyle w:val="PSI-Normal"/>
-        <w:ind w:left="720"/>
-      </w:pPr>
-      <w:r>
-        <w:t xml:space="preserve">El sistema debe registrar la siguiente información de cada operación: fecha de la operación, usuario que realiza la operación, legajo del graduado y una observación sobre la operación. </w:t>
-      </w:r>
-    </w:p>
-    <w:p>
-      <w:pPr>
-        <w:pStyle w:val="PSI-Ttulo2"/>
-      </w:pPr>
-      <w:r>
-        <w:t xml:space="preserve">Requerimientos no </w:t>
-      </w:r>
-      <w:r>
-        <w:t>funcionales</w:t>
-      </w:r>
-      <w:bookmarkEnd w:id="19"/>
-    </w:p>
-    <w:p>
-      <w:pPr>
-        <w:pStyle w:val="PSI-Normal"/>
-      </w:pPr>
-      <w:r>
-        <w:t>Inicio</w:t>
-      </w:r>
-    </w:p>
-    <w:p>
-      <w:pPr>
-        <w:pStyle w:val="PSI-Normal"/>
-        <w:numPr>
-          <w:ilvl w:val="0"/>
-          <w:numId w:val="20"/>
-        </w:numPr>
-      </w:pPr>
-      <w:r>
-        <w:rPr>
-          <w:b/>
-          <w:bCs/>
-        </w:rPr>
-        <w:t>RFN-01: Interfaz del inicio</w:t>
-      </w:r>
-    </w:p>
-    <w:p>
-      <w:pPr>
-        <w:pStyle w:val="PSI-Normal"/>
-        <w:ind w:left="720"/>
-      </w:pPr>
-      <w:r>
-        <w:t>El sistema debe tener una pantalla de inicio minimalista, grande e intuitiva.</w:t>
-      </w:r>
-    </w:p>
-    <w:p>
-      <w:pPr>
-        <w:pStyle w:val="PSI-Normal"/>
-        <w:numPr>
-          <w:ilvl w:val="0"/>
-          <w:numId w:val="20"/>
-        </w:numPr>
-      </w:pPr>
-      <w:r>
-        <w:rPr>
-          <w:b/>
-          <w:bCs/>
-        </w:rPr>
-        <w:t>RNF-02: Navegación entre apartados</w:t>
-      </w:r>
-    </w:p>
-    <w:p>
-      <w:pPr>
-        <w:pStyle w:val="PSI-Normal"/>
-        <w:ind w:left="720"/>
-      </w:pPr>
-      <w:r>
-        <w:t xml:space="preserve">El sistema debe garantizar que un usuario navegue entre cada una de las distintas pantallas con un retraso no mayor a 2 segundos. </w:t>
-      </w:r>
-    </w:p>
-    <w:p>
-      <w:pPr>
-        <w:pStyle w:val="PSI-Normal"/>
-        <w:numPr>
-          <w:ilvl w:val="0"/>
-          <w:numId w:val="21"/>
-        </w:numPr>
-      </w:pPr>
-      <w:r>
-        <w:rPr>
-          <w:b/>
-          <w:bCs/>
-        </w:rPr>
-        <w:t>RNF-0</w:t>
-      </w:r>
-      <w:r>
-        <w:rPr>
-          <w:b/>
-          <w:bCs/>
-        </w:rPr>
-        <w:t>3</w:t>
-      </w:r>
-      <w:r>
-        <w:rPr>
-          <w:b/>
-          <w:bCs/>
-        </w:rPr>
-        <w:t>: Uso del framework UARGFlow</w:t>
-      </w:r>
-    </w:p>
-    <w:p>
-      <w:pPr>
-        <w:pStyle w:val="PSI-Normal"/>
-        <w:ind w:left="720"/>
-      </w:pPr>
-      <w:r>
-        <w:t>El sistema debe utilizar el framework UARGFlow para la autenticación de usuarios</w:t>
-      </w:r>
-      <w:r>
-        <w:t>.</w:t>
-      </w:r>
-    </w:p>
-    <w:p>
-      <w:pPr>
-        <w:pStyle w:val="PSI-Normal"/>
-      </w:pPr>
-      <w:r>
-        <w:t>Módulo de analíticos</w:t>
-      </w:r>
-    </w:p>
-    <w:p>
-      <w:pPr>
-        <w:pStyle w:val="PSI-Normal"/>
-        <w:numPr>
-          <w:ilvl w:val="0"/>
-          <w:numId w:val="21"/>
-        </w:numPr>
-      </w:pPr>
-      <w:r>
-        <w:rPr>
-          <w:b/>
-          <w:bCs/>
-        </w:rPr>
-        <w:t>RNF-0</w:t>
-      </w:r>
-      <w:r>
-        <w:rPr>
-          <w:b/>
-          <w:bCs/>
-        </w:rPr>
-        <w:t>4</w:t>
-      </w:r>
-      <w:r>
-        <w:rPr>
-          <w:b/>
-          <w:bCs/>
-        </w:rPr>
         <w:t>:</w:t>
       </w:r>
       <w:r>
@@ -4570,25 +4530,7 @@
         <w:ind w:left="720"/>
       </w:pPr>
       <w:r>
-        <w:t xml:space="preserve">El sistema debe </w:t>
-      </w:r>
-      <w:r>
-        <w:t>generar</w:t>
-      </w:r>
-      <w:r>
-        <w:t xml:space="preserve"> el analítico del graduado</w:t>
-      </w:r>
-      <w:r>
-        <w:t xml:space="preserve"> o título en trámite</w:t>
-      </w:r>
-      <w:r>
-        <w:t xml:space="preserve"> en formato PDF </w:t>
-      </w:r>
-      <w:r>
-        <w:t>o</w:t>
-      </w:r>
-      <w:r>
-        <w:t xml:space="preserve"> docs.</w:t>
+        <w:t>El sistema debe generar el analítico del graduado o título en trámite en formato PDF o docs.</w:t>
       </w:r>
     </w:p>
     <w:p>
@@ -4958,9 +4900,204 @@
       </w:r>
     </w:p>
     <w:p>
+      <w:r>
+        <w:t>En este apartado se listan los Casos de Uso detectados para el sistema eGraduados</w:t>
+      </w:r>
+      <w:r>
+        <w:t xml:space="preserve"> y se otorga una breve descripción de ellos</w:t>
+      </w:r>
+    </w:p>
+    <w:p>
+      <w:pPr>
+        <w:pStyle w:val="Prrafodelista"/>
+        <w:numPr>
+          <w:ilvl w:val="0"/>
+          <w:numId w:val="27"/>
+        </w:numPr>
+      </w:pPr>
+      <w:r>
+        <w:t>Ingresar al sistema</w:t>
+      </w:r>
+    </w:p>
+    <w:p>
+      <w:pPr>
+        <w:pStyle w:val="Prrafodelista"/>
+        <w:numPr>
+          <w:ilvl w:val="0"/>
+          <w:numId w:val="27"/>
+        </w:numPr>
+      </w:pPr>
+      <w:r>
+        <w:t>Crear analíticos</w:t>
+      </w:r>
+    </w:p>
+    <w:p>
+      <w:pPr>
+        <w:pStyle w:val="Prrafodelista"/>
+        <w:numPr>
+          <w:ilvl w:val="0"/>
+          <w:numId w:val="27"/>
+        </w:numPr>
+      </w:pPr>
+      <w:r>
+        <w:t>Registrar graduados</w:t>
+      </w:r>
+    </w:p>
+    <w:p>
+      <w:pPr>
+        <w:pStyle w:val="Prrafodelista"/>
+        <w:numPr>
+          <w:ilvl w:val="0"/>
+          <w:numId w:val="27"/>
+        </w:numPr>
+      </w:pPr>
+      <w:r>
+        <w:t>Generar títulos en trámite</w:t>
+      </w:r>
+    </w:p>
+    <w:p>
+      <w:pPr>
+        <w:pStyle w:val="Prrafodelista"/>
+        <w:numPr>
+          <w:ilvl w:val="0"/>
+          <w:numId w:val="27"/>
+        </w:numPr>
+      </w:pPr>
+      <w:r>
+        <w:t>Descargar analíticos y títulos en trámite</w:t>
+      </w:r>
+    </w:p>
+    <w:p>
+      <w:pPr>
+        <w:pStyle w:val="Prrafodelista"/>
+        <w:numPr>
+          <w:ilvl w:val="0"/>
+          <w:numId w:val="27"/>
+        </w:numPr>
+      </w:pPr>
+      <w:r>
+        <w:t>Descargar listado de graduados</w:t>
+      </w:r>
+    </w:p>
+    <w:p>
+      <w:pPr>
+        <w:pStyle w:val="Prrafodelista"/>
+        <w:numPr>
+          <w:ilvl w:val="0"/>
+          <w:numId w:val="27"/>
+        </w:numPr>
+      </w:pPr>
+      <w:r>
+        <w:t>Filtrar el listado de graduados</w:t>
+      </w:r>
+    </w:p>
+    <w:p>
+      <w:pPr>
+        <w:pStyle w:val="Prrafodelista"/>
+        <w:numPr>
+          <w:ilvl w:val="0"/>
+          <w:numId w:val="27"/>
+        </w:numPr>
+      </w:pPr>
+      <w:r>
+        <w:t xml:space="preserve">Buscar graduado </w:t>
+      </w:r>
+    </w:p>
+    <w:p>
+      <w:pPr>
+        <w:pStyle w:val="Prrafodelista"/>
+        <w:numPr>
+          <w:ilvl w:val="0"/>
+          <w:numId w:val="27"/>
+        </w:numPr>
+      </w:pPr>
+      <w:r>
+        <w:t>Gestionar graduado</w:t>
+      </w:r>
+    </w:p>
+    <w:p>
+      <w:pPr>
+        <w:pStyle w:val="Prrafodelista"/>
+        <w:numPr>
+          <w:ilvl w:val="0"/>
+          <w:numId w:val="27"/>
+        </w:numPr>
+      </w:pPr>
+      <w:r>
+        <w:t xml:space="preserve">Consultar </w:t>
+      </w:r>
+      <w:r>
+        <w:t>tablero</w:t>
+      </w:r>
+      <w:r>
+        <w:t xml:space="preserve"> de estadística</w:t>
+      </w:r>
+    </w:p>
+    <w:p>
+      <w:pPr>
+        <w:pStyle w:val="Prrafodelista"/>
+        <w:numPr>
+          <w:ilvl w:val="0"/>
+          <w:numId w:val="27"/>
+        </w:numPr>
+      </w:pPr>
+      <w:r>
+        <w:t>Ajustar estadística</w:t>
+      </w:r>
+    </w:p>
+    <w:p>
+      <w:pPr>
+        <w:pStyle w:val="Prrafodelista"/>
+        <w:numPr>
+          <w:ilvl w:val="0"/>
+          <w:numId w:val="27"/>
+        </w:numPr>
+      </w:pPr>
+      <w:r>
+        <w:t>Gestionar graduados con baja lógica</w:t>
+      </w:r>
+    </w:p>
+    <w:p>
+      <w:pPr>
+        <w:pStyle w:val="Prrafodelista"/>
+        <w:numPr>
+          <w:ilvl w:val="0"/>
+          <w:numId w:val="27"/>
+        </w:numPr>
+      </w:pPr>
+      <w:r>
+        <w:t>Registrar operaciones</w:t>
+      </w:r>
+    </w:p>
+    <w:p>
+      <w:pPr>
+        <w:pStyle w:val="Prrafodelista"/>
+        <w:numPr>
+          <w:ilvl w:val="0"/>
+          <w:numId w:val="27"/>
+        </w:numPr>
+      </w:pPr>
+      <w:r>
+        <w:t>Cargar listado en formato de hoja de cálculo (becas/gradu</w:t>
+      </w:r>
+      <w:r>
+        <w:t>a</w:t>
+      </w:r>
+      <w:r>
+        <w:t>dos/</w:t>
+      </w:r>
+      <w:r>
+        <w:t>certificado Lincoln)</w:t>
+      </w:r>
+    </w:p>
+    <w:p/>
+    <w:p>
       <w:pPr>
         <w:pStyle w:val="PSI-Ttulo1"/>
       </w:pPr>
+      <w:r>
+        <w:t>Especificación de Casos de Uso</w:t>
+      </w:r>
     </w:p>
     <w:tbl>
       <w:tblPr>
@@ -4999,7 +5136,7 @@
               <w:pStyle w:val="PSI-Normal"/>
             </w:pPr>
             <w:r>
-              <w:t>Entrada al sistema</w:t>
+              <w:t>Entrar al sistema</w:t>
             </w:r>
           </w:p>
         </w:tc>
@@ -5207,6 +5344,7 @@
               <w:pStyle w:val="PSI-Normal"/>
             </w:pPr>
             <w:r>
+              <w:lastRenderedPageBreak/>
               <w:t>d-Estadísticas</w:t>
             </w:r>
           </w:p>
@@ -6192,10 +6330,7 @@
               <w:pStyle w:val="PSI-Normal"/>
             </w:pPr>
             <w:r>
-              <w:t>CU-0</w:t>
-            </w:r>
-            <w:r>
-              <w:t>2</w:t>
+              <w:t>CU-02</w:t>
             </w:r>
           </w:p>
         </w:tc>
@@ -6209,7 +6344,7 @@
               <w:pStyle w:val="PSI-Normal"/>
             </w:pPr>
             <w:r>
-              <w:t>Creación de analíticos</w:t>
+              <w:t>Crear analíticos</w:t>
             </w:r>
           </w:p>
         </w:tc>
@@ -6242,10 +6377,7 @@
               <w:pStyle w:val="PSI-Normal"/>
             </w:pPr>
             <w:r>
-              <w:t>Usuario</w:t>
-            </w:r>
-            <w:r>
-              <w:t>, BBDD</w:t>
+              <w:t>Usuario, BBDD</w:t>
             </w:r>
           </w:p>
         </w:tc>
@@ -6644,7 +6776,11 @@
               <w:pStyle w:val="PSI-Normal"/>
             </w:pPr>
             <w:r>
-              <w:t xml:space="preserve">El sistema genera una previsualización del analítico en el formato solicitado </w:t>
+              <w:t xml:space="preserve">El sistema genera una previsualización del analítico en </w:t>
+            </w:r>
+            <w:r>
+              <w:lastRenderedPageBreak/>
+              <w:t xml:space="preserve">el formato solicitado </w:t>
             </w:r>
           </w:p>
         </w:tc>
@@ -6724,7 +6860,10 @@
               <w:pStyle w:val="PSI-Normal"/>
             </w:pPr>
             <w:r>
-              <w:t>El sistema guarda en la BD los datos ingresados para la generación del analítico y habilita la opción de descargarlo</w:t>
+              <w:t xml:space="preserve">El sistema </w:t>
+            </w:r>
+            <w:r>
+              <w:t>ejecuta el CU-04 Paso 1 y luego habilita la opción de descargar el analítico</w:t>
             </w:r>
           </w:p>
         </w:tc>
@@ -7086,46 +7225,6 @@
           <w:p>
             <w:pPr>
               <w:pStyle w:val="PSI-Normal"/>
-            </w:pPr>
-            <w:r>
-              <w:t>6a</w:t>
-            </w:r>
-          </w:p>
-        </w:tc>
-        <w:tc>
-          <w:tcPr>
-            <w:tcW w:w="5068" w:type="dxa"/>
-          </w:tcPr>
-          <w:p>
-            <w:pPr>
-              <w:pStyle w:val="PSI-Normal"/>
-            </w:pPr>
-            <w:r>
-              <w:t>El usuario ingresa el legajo y carrera de un graduado ya existente en el sistema</w:t>
-            </w:r>
-          </w:p>
-        </w:tc>
-      </w:tr>
-      <w:tr>
-        <w:tc>
-          <w:tcPr>
-            <w:tcW w:w="2809" w:type="dxa"/>
-            <w:vMerge/>
-            <w:shd w:val="clear" w:color="auto" w:fill="9BBB59" w:themeFill="accent3"/>
-          </w:tcPr>
-          <w:p>
-            <w:pPr>
-              <w:pStyle w:val="PSI-Normal"/>
-            </w:pPr>
-          </w:p>
-        </w:tc>
-        <w:tc>
-          <w:tcPr>
-            <w:tcW w:w="805" w:type="dxa"/>
-          </w:tcPr>
-          <w:p>
-            <w:pPr>
-              <w:pStyle w:val="PSI-Normal"/>
               <w:rPr>
                 <w:b/>
                 <w:bCs/>
@@ -7136,6 +7235,50 @@
                 <w:b/>
                 <w:bCs/>
               </w:rPr>
+              <w:t>6a</w:t>
+            </w:r>
+          </w:p>
+        </w:tc>
+        <w:tc>
+          <w:tcPr>
+            <w:tcW w:w="5068" w:type="dxa"/>
+          </w:tcPr>
+          <w:p>
+            <w:pPr>
+              <w:pStyle w:val="PSI-Normal"/>
+            </w:pPr>
+            <w:r>
+              <w:t>El usuario ingresa el legajo y carrera de un graduado ya existente en el sistema</w:t>
+            </w:r>
+          </w:p>
+        </w:tc>
+      </w:tr>
+      <w:tr>
+        <w:tc>
+          <w:tcPr>
+            <w:tcW w:w="2809" w:type="dxa"/>
+            <w:vMerge/>
+            <w:shd w:val="clear" w:color="auto" w:fill="9BBB59" w:themeFill="accent3"/>
+          </w:tcPr>
+          <w:p>
+            <w:pPr>
+              <w:pStyle w:val="PSI-Normal"/>
+            </w:pPr>
+          </w:p>
+        </w:tc>
+        <w:tc>
+          <w:tcPr>
+            <w:tcW w:w="805" w:type="dxa"/>
+          </w:tcPr>
+          <w:p>
+            <w:pPr>
+              <w:pStyle w:val="PSI-Normal"/>
+              <w:rPr>
+                <w:sz w:val="16"/>
+                <w:szCs w:val="16"/>
+              </w:rPr>
+            </w:pPr>
+            <w:r>
               <w:t>6a1</w:t>
             </w:r>
           </w:p>
@@ -7149,7 +7292,13 @@
               <w:pStyle w:val="PSI-Normal"/>
             </w:pPr>
             <w:r>
-              <w:t>El sistema despliega un mensaje de advertencia “El analítico que deseas generar ya figura en el sistema. La generación del nuevo analítico modificará los datos” y la opción (Volver/Avanzar)</w:t>
+              <w:t>El sistema despliega un mensaje de advertencia “El analítico que deseas generar ya figura en el sistema. La generación del nuevo analítico modificará los datos</w:t>
+            </w:r>
+            <w:r>
+              <w:t xml:space="preserve"> del anterior</w:t>
+            </w:r>
+            <w:r>
+              <w:t>” y la opción (Volver/Avanzar)</w:t>
             </w:r>
           </w:p>
         </w:tc>
@@ -7247,10 +7396,7 @@
               <w:pStyle w:val="PSI-Normal"/>
             </w:pPr>
             <w:r>
-              <w:t>CU-0</w:t>
-            </w:r>
-            <w:r>
-              <w:t>3</w:t>
+              <w:t>CU-03</w:t>
             </w:r>
           </w:p>
         </w:tc>
@@ -7264,7 +7410,10 @@
               <w:pStyle w:val="PSI-Normal"/>
             </w:pPr>
             <w:r>
-              <w:t>Listar graduados</w:t>
+              <w:t>Descargar listado de</w:t>
+            </w:r>
+            <w:r>
+              <w:t xml:space="preserve"> graduados</w:t>
             </w:r>
           </w:p>
         </w:tc>
@@ -7359,6 +7508,9 @@
             <w:pPr>
               <w:pStyle w:val="PSI-Normal"/>
             </w:pPr>
+            <w:r>
+              <w:t>Ninguno</w:t>
+            </w:r>
           </w:p>
         </w:tc>
       </w:tr>
@@ -7905,6 +8057,3326 @@
         <w:pStyle w:val="PSI-Normal"/>
       </w:pPr>
     </w:p>
+    <w:tbl>
+      <w:tblPr>
+        <w:tblStyle w:val="Tablaconcuadrcula"/>
+        <w:tblW w:w="0" w:type="auto"/>
+        <w:tblInd w:w="38" w:type="dxa"/>
+        <w:tblLook w:val="04A0" w:firstRow="1" w:lastRow="0" w:firstColumn="1" w:lastColumn="0" w:noHBand="0" w:noVBand="1"/>
+      </w:tblPr>
+      <w:tblGrid>
+        <w:gridCol w:w="2809"/>
+        <w:gridCol w:w="805"/>
+        <w:gridCol w:w="5068"/>
+      </w:tblGrid>
+      <w:tr>
+        <w:tc>
+          <w:tcPr>
+            <w:tcW w:w="2809" w:type="dxa"/>
+            <w:shd w:val="clear" w:color="auto" w:fill="9BBB59" w:themeFill="accent3"/>
+          </w:tcPr>
+          <w:p>
+            <w:pPr>
+              <w:pStyle w:val="PSI-Normal"/>
+            </w:pPr>
+            <w:r>
+              <w:t>CU-0</w:t>
+            </w:r>
+            <w:r>
+              <w:t>4</w:t>
+            </w:r>
+          </w:p>
+        </w:tc>
+        <w:tc>
+          <w:tcPr>
+            <w:tcW w:w="5873" w:type="dxa"/>
+            <w:gridSpan w:val="2"/>
+          </w:tcPr>
+          <w:p>
+            <w:pPr>
+              <w:pStyle w:val="PSI-Normal"/>
+            </w:pPr>
+            <w:r>
+              <w:t>Registrar graduados</w:t>
+            </w:r>
+          </w:p>
+        </w:tc>
+      </w:tr>
+      <w:tr>
+        <w:trPr>
+          <w:trHeight w:val="186"/>
+        </w:trPr>
+        <w:tc>
+          <w:tcPr>
+            <w:tcW w:w="2809" w:type="dxa"/>
+            <w:shd w:val="clear" w:color="auto" w:fill="9BBB59" w:themeFill="accent3"/>
+          </w:tcPr>
+          <w:p>
+            <w:pPr>
+              <w:pStyle w:val="PSI-Normal"/>
+            </w:pPr>
+            <w:r>
+              <w:t>Actores</w:t>
+            </w:r>
+          </w:p>
+        </w:tc>
+        <w:tc>
+          <w:tcPr>
+            <w:tcW w:w="5873" w:type="dxa"/>
+            <w:gridSpan w:val="2"/>
+          </w:tcPr>
+          <w:p>
+            <w:pPr>
+              <w:pStyle w:val="PSI-Normal"/>
+            </w:pPr>
+            <w:r>
+              <w:t>Usuario, BBDD</w:t>
+            </w:r>
+          </w:p>
+        </w:tc>
+      </w:tr>
+      <w:tr>
+        <w:tc>
+          <w:tcPr>
+            <w:tcW w:w="2809" w:type="dxa"/>
+            <w:shd w:val="clear" w:color="auto" w:fill="9BBB59" w:themeFill="accent3"/>
+          </w:tcPr>
+          <w:p>
+            <w:pPr>
+              <w:pStyle w:val="PSI-Normal"/>
+            </w:pPr>
+            <w:r>
+              <w:t>Precondiciones</w:t>
+            </w:r>
+          </w:p>
+        </w:tc>
+        <w:tc>
+          <w:tcPr>
+            <w:tcW w:w="5873" w:type="dxa"/>
+            <w:gridSpan w:val="2"/>
+          </w:tcPr>
+          <w:p>
+            <w:pPr>
+              <w:pStyle w:val="PSI-Normal"/>
+            </w:pPr>
+            <w:r>
+              <w:t>Se valida un analítico generado</w:t>
+            </w:r>
+          </w:p>
+        </w:tc>
+      </w:tr>
+      <w:tr>
+        <w:tc>
+          <w:tcPr>
+            <w:tcW w:w="2809" w:type="dxa"/>
+            <w:shd w:val="clear" w:color="auto" w:fill="9BBB59" w:themeFill="accent3"/>
+          </w:tcPr>
+          <w:p>
+            <w:pPr>
+              <w:pStyle w:val="PSI-Normal"/>
+            </w:pPr>
+            <w:r>
+              <w:t>Postcondiciones</w:t>
+            </w:r>
+          </w:p>
+        </w:tc>
+        <w:tc>
+          <w:tcPr>
+            <w:tcW w:w="5873" w:type="dxa"/>
+            <w:gridSpan w:val="2"/>
+          </w:tcPr>
+          <w:p>
+            <w:pPr>
+              <w:pStyle w:val="PSI-Normal"/>
+            </w:pPr>
+            <w:r>
+              <w:t>Se genera el registro de un nuevo graduado</w:t>
+            </w:r>
+          </w:p>
+        </w:tc>
+      </w:tr>
+      <w:tr>
+        <w:tc>
+          <w:tcPr>
+            <w:tcW w:w="2809" w:type="dxa"/>
+            <w:vMerge w:val="restart"/>
+            <w:shd w:val="clear" w:color="auto" w:fill="9BBB59" w:themeFill="accent3"/>
+          </w:tcPr>
+          <w:p>
+            <w:pPr>
+              <w:pStyle w:val="PSI-Normal"/>
+            </w:pPr>
+            <w:r>
+              <w:t>Flujo normal</w:t>
+            </w:r>
+          </w:p>
+        </w:tc>
+        <w:tc>
+          <w:tcPr>
+            <w:tcW w:w="805" w:type="dxa"/>
+          </w:tcPr>
+          <w:p>
+            <w:pPr>
+              <w:pStyle w:val="PSI-Normal"/>
+            </w:pPr>
+            <w:r>
+              <w:t>Pasos</w:t>
+            </w:r>
+          </w:p>
+        </w:tc>
+        <w:tc>
+          <w:tcPr>
+            <w:tcW w:w="5068" w:type="dxa"/>
+          </w:tcPr>
+          <w:p>
+            <w:pPr>
+              <w:pStyle w:val="PSI-Normal"/>
+            </w:pPr>
+            <w:r>
+              <w:t>Acciones</w:t>
+            </w:r>
+          </w:p>
+        </w:tc>
+      </w:tr>
+      <w:tr>
+        <w:tc>
+          <w:tcPr>
+            <w:tcW w:w="2809" w:type="dxa"/>
+            <w:vMerge/>
+            <w:shd w:val="clear" w:color="auto" w:fill="9BBB59" w:themeFill="accent3"/>
+          </w:tcPr>
+          <w:p>
+            <w:pPr>
+              <w:pStyle w:val="PSI-Normal"/>
+            </w:pPr>
+          </w:p>
+        </w:tc>
+        <w:tc>
+          <w:tcPr>
+            <w:tcW w:w="805" w:type="dxa"/>
+          </w:tcPr>
+          <w:p>
+            <w:pPr>
+              <w:pStyle w:val="PSI-Normal"/>
+            </w:pPr>
+            <w:r>
+              <w:t>1</w:t>
+            </w:r>
+          </w:p>
+        </w:tc>
+        <w:tc>
+          <w:tcPr>
+            <w:tcW w:w="5068" w:type="dxa"/>
+          </w:tcPr>
+          <w:p>
+            <w:pPr>
+              <w:pStyle w:val="PSI-Normal"/>
+            </w:pPr>
+            <w:r>
+              <w:t xml:space="preserve">El </w:t>
+            </w:r>
+            <w:r>
+              <w:t xml:space="preserve">usuario </w:t>
+            </w:r>
+            <w:r>
+              <w:t>ingresa un nuevo graduado</w:t>
+            </w:r>
+          </w:p>
+        </w:tc>
+      </w:tr>
+      <w:tr>
+        <w:tc>
+          <w:tcPr>
+            <w:tcW w:w="2809" w:type="dxa"/>
+            <w:vMerge/>
+            <w:shd w:val="clear" w:color="auto" w:fill="9BBB59" w:themeFill="accent3"/>
+          </w:tcPr>
+          <w:p>
+            <w:pPr>
+              <w:pStyle w:val="PSI-Normal"/>
+            </w:pPr>
+          </w:p>
+        </w:tc>
+        <w:tc>
+          <w:tcPr>
+            <w:tcW w:w="805" w:type="dxa"/>
+          </w:tcPr>
+          <w:p>
+            <w:pPr>
+              <w:pStyle w:val="PSI-Normal"/>
+            </w:pPr>
+            <w:r>
+              <w:t>2</w:t>
+            </w:r>
+          </w:p>
+        </w:tc>
+        <w:tc>
+          <w:tcPr>
+            <w:tcW w:w="5068" w:type="dxa"/>
+          </w:tcPr>
+          <w:p>
+            <w:pPr>
+              <w:pStyle w:val="PSI-Normal"/>
+            </w:pPr>
+            <w:r>
+              <w:t>El sistema registra el nuevo graduado</w:t>
+            </w:r>
+            <w:r>
+              <w:t xml:space="preserve"> y ejecuta el CU-07 Paso 1</w:t>
+            </w:r>
+            <w:r>
+              <w:t>, lo inserta en la lista de graduados y devuelve un mensaje de “Ingreso exitoso” al usuario</w:t>
+            </w:r>
+          </w:p>
+        </w:tc>
+      </w:tr>
+    </w:tbl>
+    <w:p>
+      <w:pPr>
+        <w:pStyle w:val="PSI-Normal"/>
+      </w:pPr>
+    </w:p>
+    <w:tbl>
+      <w:tblPr>
+        <w:tblStyle w:val="Tablaconcuadrcula"/>
+        <w:tblW w:w="0" w:type="auto"/>
+        <w:tblInd w:w="38" w:type="dxa"/>
+        <w:tblLook w:val="04A0" w:firstRow="1" w:lastRow="0" w:firstColumn="1" w:lastColumn="0" w:noHBand="0" w:noVBand="1"/>
+      </w:tblPr>
+      <w:tblGrid>
+        <w:gridCol w:w="2809"/>
+        <w:gridCol w:w="805"/>
+        <w:gridCol w:w="5068"/>
+      </w:tblGrid>
+      <w:tr>
+        <w:tc>
+          <w:tcPr>
+            <w:tcW w:w="2809" w:type="dxa"/>
+            <w:shd w:val="clear" w:color="auto" w:fill="9BBB59" w:themeFill="accent3"/>
+          </w:tcPr>
+          <w:p>
+            <w:pPr>
+              <w:pStyle w:val="PSI-Normal"/>
+            </w:pPr>
+            <w:r>
+              <w:t>CU-0</w:t>
+            </w:r>
+            <w:r>
+              <w:t>5</w:t>
+            </w:r>
+          </w:p>
+        </w:tc>
+        <w:tc>
+          <w:tcPr>
+            <w:tcW w:w="5873" w:type="dxa"/>
+            <w:gridSpan w:val="2"/>
+          </w:tcPr>
+          <w:p>
+            <w:pPr>
+              <w:pStyle w:val="PSI-Normal"/>
+            </w:pPr>
+            <w:r>
+              <w:t>Buscar graduado</w:t>
+            </w:r>
+          </w:p>
+        </w:tc>
+      </w:tr>
+      <w:tr>
+        <w:trPr>
+          <w:trHeight w:val="186"/>
+        </w:trPr>
+        <w:tc>
+          <w:tcPr>
+            <w:tcW w:w="2809" w:type="dxa"/>
+            <w:shd w:val="clear" w:color="auto" w:fill="9BBB59" w:themeFill="accent3"/>
+          </w:tcPr>
+          <w:p>
+            <w:pPr>
+              <w:pStyle w:val="PSI-Normal"/>
+            </w:pPr>
+            <w:r>
+              <w:t>Actores</w:t>
+            </w:r>
+          </w:p>
+        </w:tc>
+        <w:tc>
+          <w:tcPr>
+            <w:tcW w:w="5873" w:type="dxa"/>
+            <w:gridSpan w:val="2"/>
+          </w:tcPr>
+          <w:p>
+            <w:pPr>
+              <w:pStyle w:val="PSI-Normal"/>
+            </w:pPr>
+            <w:r>
+              <w:t>Usuario, BBDD</w:t>
+            </w:r>
+          </w:p>
+        </w:tc>
+      </w:tr>
+      <w:tr>
+        <w:tc>
+          <w:tcPr>
+            <w:tcW w:w="2809" w:type="dxa"/>
+            <w:shd w:val="clear" w:color="auto" w:fill="9BBB59" w:themeFill="accent3"/>
+          </w:tcPr>
+          <w:p>
+            <w:pPr>
+              <w:pStyle w:val="PSI-Normal"/>
+            </w:pPr>
+            <w:r>
+              <w:t>Precondiciones</w:t>
+            </w:r>
+          </w:p>
+        </w:tc>
+        <w:tc>
+          <w:tcPr>
+            <w:tcW w:w="5873" w:type="dxa"/>
+            <w:gridSpan w:val="2"/>
+          </w:tcPr>
+          <w:p>
+            <w:pPr>
+              <w:pStyle w:val="PSI-Normal"/>
+            </w:pPr>
+            <w:r>
+              <w:t>El usuario se encuentra en el panel de listado de graduados</w:t>
+            </w:r>
+          </w:p>
+        </w:tc>
+      </w:tr>
+      <w:tr>
+        <w:tc>
+          <w:tcPr>
+            <w:tcW w:w="2809" w:type="dxa"/>
+            <w:shd w:val="clear" w:color="auto" w:fill="9BBB59" w:themeFill="accent3"/>
+          </w:tcPr>
+          <w:p>
+            <w:pPr>
+              <w:pStyle w:val="PSI-Normal"/>
+            </w:pPr>
+            <w:r>
+              <w:t>Postcondiciones</w:t>
+            </w:r>
+          </w:p>
+        </w:tc>
+        <w:tc>
+          <w:tcPr>
+            <w:tcW w:w="5873" w:type="dxa"/>
+            <w:gridSpan w:val="2"/>
+          </w:tcPr>
+          <w:p>
+            <w:pPr>
+              <w:pStyle w:val="PSI-Normal"/>
+            </w:pPr>
+            <w:r>
+              <w:t>Se devuelven las coincidencias con lo buscado</w:t>
+            </w:r>
+          </w:p>
+        </w:tc>
+      </w:tr>
+      <w:tr>
+        <w:tc>
+          <w:tcPr>
+            <w:tcW w:w="2809" w:type="dxa"/>
+            <w:vMerge w:val="restart"/>
+            <w:shd w:val="clear" w:color="auto" w:fill="9BBB59" w:themeFill="accent3"/>
+          </w:tcPr>
+          <w:p>
+            <w:pPr>
+              <w:pStyle w:val="PSI-Normal"/>
+            </w:pPr>
+            <w:r>
+              <w:t>Flujo normal</w:t>
+            </w:r>
+          </w:p>
+        </w:tc>
+        <w:tc>
+          <w:tcPr>
+            <w:tcW w:w="805" w:type="dxa"/>
+          </w:tcPr>
+          <w:p>
+            <w:pPr>
+              <w:pStyle w:val="PSI-Normal"/>
+            </w:pPr>
+            <w:r>
+              <w:t>Pasos</w:t>
+            </w:r>
+          </w:p>
+        </w:tc>
+        <w:tc>
+          <w:tcPr>
+            <w:tcW w:w="5068" w:type="dxa"/>
+          </w:tcPr>
+          <w:p>
+            <w:pPr>
+              <w:pStyle w:val="PSI-Normal"/>
+            </w:pPr>
+            <w:r>
+              <w:t>Acciones</w:t>
+            </w:r>
+          </w:p>
+        </w:tc>
+      </w:tr>
+      <w:tr>
+        <w:tc>
+          <w:tcPr>
+            <w:tcW w:w="2809" w:type="dxa"/>
+            <w:vMerge/>
+            <w:shd w:val="clear" w:color="auto" w:fill="9BBB59" w:themeFill="accent3"/>
+          </w:tcPr>
+          <w:p>
+            <w:pPr>
+              <w:pStyle w:val="PSI-Normal"/>
+            </w:pPr>
+          </w:p>
+        </w:tc>
+        <w:tc>
+          <w:tcPr>
+            <w:tcW w:w="805" w:type="dxa"/>
+          </w:tcPr>
+          <w:p>
+            <w:pPr>
+              <w:pStyle w:val="PSI-Normal"/>
+            </w:pPr>
+            <w:r>
+              <w:t>1</w:t>
+            </w:r>
+          </w:p>
+        </w:tc>
+        <w:tc>
+          <w:tcPr>
+            <w:tcW w:w="5068" w:type="dxa"/>
+          </w:tcPr>
+          <w:p>
+            <w:pPr>
+              <w:pStyle w:val="PSI-Normal"/>
+            </w:pPr>
+            <w:r>
+              <w:t xml:space="preserve">El usuario </w:t>
+            </w:r>
+            <w:r>
+              <w:t>ingresa un DNI, legajo o apellido para buscar en la lista de graduados</w:t>
+            </w:r>
+          </w:p>
+        </w:tc>
+      </w:tr>
+      <w:tr>
+        <w:tc>
+          <w:tcPr>
+            <w:tcW w:w="2809" w:type="dxa"/>
+            <w:vMerge/>
+            <w:shd w:val="clear" w:color="auto" w:fill="9BBB59" w:themeFill="accent3"/>
+          </w:tcPr>
+          <w:p>
+            <w:pPr>
+              <w:pStyle w:val="PSI-Normal"/>
+            </w:pPr>
+          </w:p>
+        </w:tc>
+        <w:tc>
+          <w:tcPr>
+            <w:tcW w:w="805" w:type="dxa"/>
+          </w:tcPr>
+          <w:p>
+            <w:pPr>
+              <w:pStyle w:val="PSI-Normal"/>
+            </w:pPr>
+            <w:r>
+              <w:t>2</w:t>
+            </w:r>
+          </w:p>
+        </w:tc>
+        <w:tc>
+          <w:tcPr>
+            <w:tcW w:w="5068" w:type="dxa"/>
+          </w:tcPr>
+          <w:p>
+            <w:pPr>
+              <w:pStyle w:val="PSI-Normal"/>
+            </w:pPr>
+            <w:r>
+              <w:t>El sistema devuelve las coincidencias totales o parciales que cumplen con la búsqueda</w:t>
+            </w:r>
+          </w:p>
+        </w:tc>
+      </w:tr>
+      <w:tr>
+        <w:tc>
+          <w:tcPr>
+            <w:tcW w:w="2809" w:type="dxa"/>
+            <w:vMerge/>
+            <w:shd w:val="clear" w:color="auto" w:fill="9BBB59" w:themeFill="accent3"/>
+          </w:tcPr>
+          <w:p>
+            <w:pPr>
+              <w:pStyle w:val="PSI-Normal"/>
+            </w:pPr>
+          </w:p>
+        </w:tc>
+        <w:tc>
+          <w:tcPr>
+            <w:tcW w:w="805" w:type="dxa"/>
+          </w:tcPr>
+          <w:p>
+            <w:pPr>
+              <w:pStyle w:val="PSI-Normal"/>
+            </w:pPr>
+            <w:r>
+              <w:t>3</w:t>
+            </w:r>
+          </w:p>
+        </w:tc>
+        <w:tc>
+          <w:tcPr>
+            <w:tcW w:w="5068" w:type="dxa"/>
+          </w:tcPr>
+          <w:p>
+            <w:pPr>
+              <w:pStyle w:val="PSI-Normal"/>
+            </w:pPr>
+            <w:r>
+              <w:t>El usuario accede al perfil del graduado</w:t>
+            </w:r>
+          </w:p>
+        </w:tc>
+      </w:tr>
+      <w:tr>
+        <w:tc>
+          <w:tcPr>
+            <w:tcW w:w="2809" w:type="dxa"/>
+            <w:vMerge/>
+            <w:shd w:val="clear" w:color="auto" w:fill="9BBB59" w:themeFill="accent3"/>
+          </w:tcPr>
+          <w:p>
+            <w:pPr>
+              <w:pStyle w:val="PSI-Normal"/>
+            </w:pPr>
+          </w:p>
+        </w:tc>
+        <w:tc>
+          <w:tcPr>
+            <w:tcW w:w="805" w:type="dxa"/>
+          </w:tcPr>
+          <w:p>
+            <w:pPr>
+              <w:pStyle w:val="PSI-Normal"/>
+            </w:pPr>
+            <w:r>
+              <w:t>-</w:t>
+            </w:r>
+          </w:p>
+        </w:tc>
+        <w:tc>
+          <w:tcPr>
+            <w:tcW w:w="5068" w:type="dxa"/>
+          </w:tcPr>
+          <w:p>
+            <w:pPr>
+              <w:pStyle w:val="PSI-Normal"/>
+            </w:pPr>
+            <w:r>
+              <w:t>El flujo sigue en el CU-06 Paso 1</w:t>
+            </w:r>
+          </w:p>
+        </w:tc>
+      </w:tr>
+    </w:tbl>
+    <w:p>
+      <w:pPr>
+        <w:pStyle w:val="PSI-Normal"/>
+      </w:pPr>
+    </w:p>
+    <w:tbl>
+      <w:tblPr>
+        <w:tblStyle w:val="Tablaconcuadrcula"/>
+        <w:tblW w:w="0" w:type="auto"/>
+        <w:tblInd w:w="38" w:type="dxa"/>
+        <w:tblLook w:val="04A0" w:firstRow="1" w:lastRow="0" w:firstColumn="1" w:lastColumn="0" w:noHBand="0" w:noVBand="1"/>
+      </w:tblPr>
+      <w:tblGrid>
+        <w:gridCol w:w="2809"/>
+        <w:gridCol w:w="805"/>
+        <w:gridCol w:w="5068"/>
+      </w:tblGrid>
+      <w:tr>
+        <w:tc>
+          <w:tcPr>
+            <w:tcW w:w="2809" w:type="dxa"/>
+            <w:shd w:val="clear" w:color="auto" w:fill="9BBB59" w:themeFill="accent3"/>
+          </w:tcPr>
+          <w:p>
+            <w:pPr>
+              <w:pStyle w:val="PSI-Normal"/>
+            </w:pPr>
+            <w:r>
+              <w:t>CU-0</w:t>
+            </w:r>
+            <w:r>
+              <w:t>6</w:t>
+            </w:r>
+          </w:p>
+        </w:tc>
+        <w:tc>
+          <w:tcPr>
+            <w:tcW w:w="5873" w:type="dxa"/>
+            <w:gridSpan w:val="2"/>
+          </w:tcPr>
+          <w:p>
+            <w:pPr>
+              <w:pStyle w:val="PSI-Normal"/>
+            </w:pPr>
+            <w:r>
+              <w:t>Ver perfil de graduado</w:t>
+            </w:r>
+          </w:p>
+        </w:tc>
+      </w:tr>
+      <w:tr>
+        <w:trPr>
+          <w:trHeight w:val="186"/>
+        </w:trPr>
+        <w:tc>
+          <w:tcPr>
+            <w:tcW w:w="2809" w:type="dxa"/>
+            <w:shd w:val="clear" w:color="auto" w:fill="9BBB59" w:themeFill="accent3"/>
+          </w:tcPr>
+          <w:p>
+            <w:pPr>
+              <w:pStyle w:val="PSI-Normal"/>
+            </w:pPr>
+            <w:r>
+              <w:t>Actores</w:t>
+            </w:r>
+          </w:p>
+        </w:tc>
+        <w:tc>
+          <w:tcPr>
+            <w:tcW w:w="5873" w:type="dxa"/>
+            <w:gridSpan w:val="2"/>
+          </w:tcPr>
+          <w:p>
+            <w:pPr>
+              <w:pStyle w:val="PSI-Normal"/>
+            </w:pPr>
+            <w:r>
+              <w:t>Usuario, BBDD</w:t>
+            </w:r>
+          </w:p>
+        </w:tc>
+      </w:tr>
+      <w:tr>
+        <w:tc>
+          <w:tcPr>
+            <w:tcW w:w="2809" w:type="dxa"/>
+            <w:shd w:val="clear" w:color="auto" w:fill="9BBB59" w:themeFill="accent3"/>
+          </w:tcPr>
+          <w:p>
+            <w:pPr>
+              <w:pStyle w:val="PSI-Normal"/>
+            </w:pPr>
+            <w:r>
+              <w:t>Precondiciones</w:t>
+            </w:r>
+          </w:p>
+        </w:tc>
+        <w:tc>
+          <w:tcPr>
+            <w:tcW w:w="5873" w:type="dxa"/>
+            <w:gridSpan w:val="2"/>
+          </w:tcPr>
+          <w:p>
+            <w:pPr>
+              <w:pStyle w:val="PSI-Normal"/>
+            </w:pPr>
+            <w:r>
+              <w:t>El usuario hace clic sobre el nombre de un graduado</w:t>
+            </w:r>
+          </w:p>
+        </w:tc>
+      </w:tr>
+      <w:tr>
+        <w:tc>
+          <w:tcPr>
+            <w:tcW w:w="2809" w:type="dxa"/>
+            <w:shd w:val="clear" w:color="auto" w:fill="9BBB59" w:themeFill="accent3"/>
+          </w:tcPr>
+          <w:p>
+            <w:pPr>
+              <w:pStyle w:val="PSI-Normal"/>
+            </w:pPr>
+            <w:r>
+              <w:t>Postcondiciones</w:t>
+            </w:r>
+          </w:p>
+        </w:tc>
+        <w:tc>
+          <w:tcPr>
+            <w:tcW w:w="5873" w:type="dxa"/>
+            <w:gridSpan w:val="2"/>
+          </w:tcPr>
+          <w:p>
+            <w:pPr>
+              <w:pStyle w:val="PSI-Normal"/>
+            </w:pPr>
+            <w:r>
+              <w:t>Ninguno</w:t>
+            </w:r>
+          </w:p>
+        </w:tc>
+      </w:tr>
+      <w:tr>
+        <w:tc>
+          <w:tcPr>
+            <w:tcW w:w="2809" w:type="dxa"/>
+            <w:vMerge w:val="restart"/>
+            <w:shd w:val="clear" w:color="auto" w:fill="9BBB59" w:themeFill="accent3"/>
+          </w:tcPr>
+          <w:p>
+            <w:pPr>
+              <w:pStyle w:val="PSI-Normal"/>
+            </w:pPr>
+            <w:r>
+              <w:t>Flujo normal</w:t>
+            </w:r>
+          </w:p>
+        </w:tc>
+        <w:tc>
+          <w:tcPr>
+            <w:tcW w:w="805" w:type="dxa"/>
+          </w:tcPr>
+          <w:p>
+            <w:pPr>
+              <w:pStyle w:val="PSI-Normal"/>
+            </w:pPr>
+            <w:r>
+              <w:t>Pasos</w:t>
+            </w:r>
+          </w:p>
+        </w:tc>
+        <w:tc>
+          <w:tcPr>
+            <w:tcW w:w="5068" w:type="dxa"/>
+          </w:tcPr>
+          <w:p>
+            <w:pPr>
+              <w:pStyle w:val="PSI-Normal"/>
+            </w:pPr>
+            <w:r>
+              <w:t>Acciones</w:t>
+            </w:r>
+          </w:p>
+        </w:tc>
+      </w:tr>
+      <w:tr>
+        <w:tc>
+          <w:tcPr>
+            <w:tcW w:w="2809" w:type="dxa"/>
+            <w:vMerge/>
+            <w:shd w:val="clear" w:color="auto" w:fill="9BBB59" w:themeFill="accent3"/>
+          </w:tcPr>
+          <w:p>
+            <w:pPr>
+              <w:pStyle w:val="PSI-Normal"/>
+            </w:pPr>
+          </w:p>
+        </w:tc>
+        <w:tc>
+          <w:tcPr>
+            <w:tcW w:w="805" w:type="dxa"/>
+          </w:tcPr>
+          <w:p>
+            <w:pPr>
+              <w:pStyle w:val="PSI-Normal"/>
+            </w:pPr>
+            <w:r>
+              <w:t>1</w:t>
+            </w:r>
+          </w:p>
+        </w:tc>
+        <w:tc>
+          <w:tcPr>
+            <w:tcW w:w="5068" w:type="dxa"/>
+          </w:tcPr>
+          <w:p>
+            <w:pPr>
+              <w:pStyle w:val="PSI-Normal"/>
+            </w:pPr>
+            <w:r>
+              <w:t>El sistema despliega la pantalla de perfil de graduado donde aparecen todos los datos recolectados sobre ese graduado</w:t>
+            </w:r>
+          </w:p>
+        </w:tc>
+      </w:tr>
+      <w:tr>
+        <w:tc>
+          <w:tcPr>
+            <w:tcW w:w="2809" w:type="dxa"/>
+            <w:vMerge/>
+            <w:shd w:val="clear" w:color="auto" w:fill="9BBB59" w:themeFill="accent3"/>
+          </w:tcPr>
+          <w:p>
+            <w:pPr>
+              <w:pStyle w:val="PSI-Normal"/>
+            </w:pPr>
+          </w:p>
+        </w:tc>
+        <w:tc>
+          <w:tcPr>
+            <w:tcW w:w="805" w:type="dxa"/>
+          </w:tcPr>
+          <w:p>
+            <w:pPr>
+              <w:pStyle w:val="PSI-Normal"/>
+            </w:pPr>
+            <w:r>
+              <w:t>2</w:t>
+            </w:r>
+          </w:p>
+        </w:tc>
+        <w:tc>
+          <w:tcPr>
+            <w:tcW w:w="5068" w:type="dxa"/>
+          </w:tcPr>
+          <w:p>
+            <w:pPr>
+              <w:pStyle w:val="PSI-Normal"/>
+            </w:pPr>
+            <w:r>
+              <w:t>El usuario modifica (o no) dato/s del graduado</w:t>
+            </w:r>
+          </w:p>
+        </w:tc>
+      </w:tr>
+      <w:tr>
+        <w:tc>
+          <w:tcPr>
+            <w:tcW w:w="2809" w:type="dxa"/>
+            <w:vMerge/>
+            <w:shd w:val="clear" w:color="auto" w:fill="9BBB59" w:themeFill="accent3"/>
+          </w:tcPr>
+          <w:p>
+            <w:pPr>
+              <w:pStyle w:val="PSI-Normal"/>
+            </w:pPr>
+          </w:p>
+        </w:tc>
+        <w:tc>
+          <w:tcPr>
+            <w:tcW w:w="805" w:type="dxa"/>
+          </w:tcPr>
+          <w:p>
+            <w:pPr>
+              <w:pStyle w:val="PSI-Normal"/>
+            </w:pPr>
+            <w:r>
+              <w:t>3</w:t>
+            </w:r>
+          </w:p>
+        </w:tc>
+        <w:tc>
+          <w:tcPr>
+            <w:tcW w:w="5068" w:type="dxa"/>
+          </w:tcPr>
+          <w:p>
+            <w:pPr>
+              <w:pStyle w:val="PSI-Normal"/>
+            </w:pPr>
+            <w:r>
+              <w:t>El sistema actualiza los datos del graduado. Se ejecuta el CU07-Paso 1</w:t>
+            </w:r>
+          </w:p>
+        </w:tc>
+      </w:tr>
+    </w:tbl>
+    <w:p>
+      <w:pPr>
+        <w:pStyle w:val="PSI-Normal"/>
+      </w:pPr>
+    </w:p>
+    <w:tbl>
+      <w:tblPr>
+        <w:tblStyle w:val="Tablaconcuadrcula"/>
+        <w:tblW w:w="0" w:type="auto"/>
+        <w:tblInd w:w="38" w:type="dxa"/>
+        <w:tblLook w:val="04A0" w:firstRow="1" w:lastRow="0" w:firstColumn="1" w:lastColumn="0" w:noHBand="0" w:noVBand="1"/>
+      </w:tblPr>
+      <w:tblGrid>
+        <w:gridCol w:w="2809"/>
+        <w:gridCol w:w="805"/>
+        <w:gridCol w:w="5068"/>
+      </w:tblGrid>
+      <w:tr>
+        <w:tc>
+          <w:tcPr>
+            <w:tcW w:w="2809" w:type="dxa"/>
+            <w:shd w:val="clear" w:color="auto" w:fill="9BBB59" w:themeFill="accent3"/>
+          </w:tcPr>
+          <w:p>
+            <w:pPr>
+              <w:pStyle w:val="PSI-Normal"/>
+            </w:pPr>
+            <w:r>
+              <w:t>CU-0</w:t>
+            </w:r>
+            <w:r>
+              <w:t>7</w:t>
+            </w:r>
+          </w:p>
+        </w:tc>
+        <w:tc>
+          <w:tcPr>
+            <w:tcW w:w="5873" w:type="dxa"/>
+            <w:gridSpan w:val="2"/>
+          </w:tcPr>
+          <w:p>
+            <w:pPr>
+              <w:pStyle w:val="PSI-Normal"/>
+            </w:pPr>
+            <w:r>
+              <w:t>Registrar operación</w:t>
+            </w:r>
+          </w:p>
+        </w:tc>
+      </w:tr>
+      <w:tr>
+        <w:trPr>
+          <w:trHeight w:val="186"/>
+        </w:trPr>
+        <w:tc>
+          <w:tcPr>
+            <w:tcW w:w="2809" w:type="dxa"/>
+            <w:shd w:val="clear" w:color="auto" w:fill="9BBB59" w:themeFill="accent3"/>
+          </w:tcPr>
+          <w:p>
+            <w:pPr>
+              <w:pStyle w:val="PSI-Normal"/>
+            </w:pPr>
+            <w:r>
+              <w:t>Actores</w:t>
+            </w:r>
+          </w:p>
+        </w:tc>
+        <w:tc>
+          <w:tcPr>
+            <w:tcW w:w="5873" w:type="dxa"/>
+            <w:gridSpan w:val="2"/>
+          </w:tcPr>
+          <w:p>
+            <w:pPr>
+              <w:pStyle w:val="PSI-Normal"/>
+            </w:pPr>
+            <w:r>
+              <w:t>Usuario, BBDD</w:t>
+            </w:r>
+          </w:p>
+        </w:tc>
+      </w:tr>
+      <w:tr>
+        <w:tc>
+          <w:tcPr>
+            <w:tcW w:w="2809" w:type="dxa"/>
+            <w:shd w:val="clear" w:color="auto" w:fill="9BBB59" w:themeFill="accent3"/>
+          </w:tcPr>
+          <w:p>
+            <w:pPr>
+              <w:pStyle w:val="PSI-Normal"/>
+            </w:pPr>
+            <w:r>
+              <w:t>Precondiciones</w:t>
+            </w:r>
+          </w:p>
+        </w:tc>
+        <w:tc>
+          <w:tcPr>
+            <w:tcW w:w="5873" w:type="dxa"/>
+            <w:gridSpan w:val="2"/>
+          </w:tcPr>
+          <w:p>
+            <w:pPr>
+              <w:pStyle w:val="PSI-Normal"/>
+            </w:pPr>
+            <w:r>
+              <w:t xml:space="preserve">El usuario realiza alguna operación (alta, baja y modificación) </w:t>
+            </w:r>
+            <w:r>
+              <w:lastRenderedPageBreak/>
+              <w:t>sobre alguno de los siguientes elementos: graduado, carrera, graduado con baja lógica</w:t>
+            </w:r>
+          </w:p>
+        </w:tc>
+      </w:tr>
+      <w:tr>
+        <w:tc>
+          <w:tcPr>
+            <w:tcW w:w="2809" w:type="dxa"/>
+            <w:shd w:val="clear" w:color="auto" w:fill="9BBB59" w:themeFill="accent3"/>
+          </w:tcPr>
+          <w:p>
+            <w:pPr>
+              <w:pStyle w:val="PSI-Normal"/>
+            </w:pPr>
+            <w:r>
+              <w:lastRenderedPageBreak/>
+              <w:t>Postcondiciones</w:t>
+            </w:r>
+          </w:p>
+        </w:tc>
+        <w:tc>
+          <w:tcPr>
+            <w:tcW w:w="5873" w:type="dxa"/>
+            <w:gridSpan w:val="2"/>
+          </w:tcPr>
+          <w:p>
+            <w:pPr>
+              <w:pStyle w:val="PSI-Normal"/>
+            </w:pPr>
+            <w:r>
+              <w:t>Ninguno</w:t>
+            </w:r>
+          </w:p>
+        </w:tc>
+      </w:tr>
+      <w:tr>
+        <w:tc>
+          <w:tcPr>
+            <w:tcW w:w="2809" w:type="dxa"/>
+            <w:vMerge w:val="restart"/>
+            <w:shd w:val="clear" w:color="auto" w:fill="9BBB59" w:themeFill="accent3"/>
+          </w:tcPr>
+          <w:p>
+            <w:pPr>
+              <w:pStyle w:val="PSI-Normal"/>
+            </w:pPr>
+            <w:r>
+              <w:t>Flujo normal</w:t>
+            </w:r>
+          </w:p>
+        </w:tc>
+        <w:tc>
+          <w:tcPr>
+            <w:tcW w:w="805" w:type="dxa"/>
+          </w:tcPr>
+          <w:p>
+            <w:pPr>
+              <w:pStyle w:val="PSI-Normal"/>
+            </w:pPr>
+            <w:r>
+              <w:t>Pasos</w:t>
+            </w:r>
+          </w:p>
+        </w:tc>
+        <w:tc>
+          <w:tcPr>
+            <w:tcW w:w="5068" w:type="dxa"/>
+          </w:tcPr>
+          <w:p>
+            <w:pPr>
+              <w:pStyle w:val="PSI-Normal"/>
+            </w:pPr>
+            <w:r>
+              <w:t>Acciones</w:t>
+            </w:r>
+          </w:p>
+        </w:tc>
+      </w:tr>
+      <w:tr>
+        <w:tc>
+          <w:tcPr>
+            <w:tcW w:w="2809" w:type="dxa"/>
+            <w:vMerge/>
+            <w:shd w:val="clear" w:color="auto" w:fill="9BBB59" w:themeFill="accent3"/>
+          </w:tcPr>
+          <w:p>
+            <w:pPr>
+              <w:pStyle w:val="PSI-Normal"/>
+            </w:pPr>
+          </w:p>
+        </w:tc>
+        <w:tc>
+          <w:tcPr>
+            <w:tcW w:w="805" w:type="dxa"/>
+          </w:tcPr>
+          <w:p>
+            <w:pPr>
+              <w:pStyle w:val="PSI-Normal"/>
+            </w:pPr>
+            <w:r>
+              <w:t>1</w:t>
+            </w:r>
+          </w:p>
+        </w:tc>
+        <w:tc>
+          <w:tcPr>
+            <w:tcW w:w="5068" w:type="dxa"/>
+          </w:tcPr>
+          <w:p>
+            <w:pPr>
+              <w:pStyle w:val="PSI-Normal"/>
+            </w:pPr>
+            <w:r>
+              <w:t>El usuario realiza alguna operación</w:t>
+            </w:r>
+          </w:p>
+        </w:tc>
+      </w:tr>
+      <w:tr>
+        <w:tc>
+          <w:tcPr>
+            <w:tcW w:w="2809" w:type="dxa"/>
+            <w:vMerge/>
+            <w:shd w:val="clear" w:color="auto" w:fill="9BBB59" w:themeFill="accent3"/>
+          </w:tcPr>
+          <w:p>
+            <w:pPr>
+              <w:pStyle w:val="PSI-Normal"/>
+            </w:pPr>
+          </w:p>
+        </w:tc>
+        <w:tc>
+          <w:tcPr>
+            <w:tcW w:w="805" w:type="dxa"/>
+          </w:tcPr>
+          <w:p>
+            <w:pPr>
+              <w:pStyle w:val="PSI-Normal"/>
+            </w:pPr>
+            <w:r>
+              <w:t>2</w:t>
+            </w:r>
+          </w:p>
+        </w:tc>
+        <w:tc>
+          <w:tcPr>
+            <w:tcW w:w="5068" w:type="dxa"/>
+          </w:tcPr>
+          <w:p>
+            <w:pPr>
+              <w:pStyle w:val="PSI-Normal"/>
+            </w:pPr>
+            <w:r>
+              <w:t>El sistema</w:t>
+            </w:r>
+            <w:r>
+              <w:t xml:space="preserve"> ejecuta la operación </w:t>
+            </w:r>
+            <w:r>
+              <w:t>y genera</w:t>
+            </w:r>
+            <w:r>
+              <w:t xml:space="preserve"> un registro con la fecha, hora, operación y usuario que realizó la operación. El sistema envía un mensaje de “(Tipo de operación) exitosa”</w:t>
+            </w:r>
+          </w:p>
+        </w:tc>
+      </w:tr>
+    </w:tbl>
+    <w:p>
+      <w:pPr>
+        <w:pStyle w:val="PSI-Normal"/>
+      </w:pPr>
+    </w:p>
+    <w:tbl>
+      <w:tblPr>
+        <w:tblStyle w:val="Tablaconcuadrcula"/>
+        <w:tblW w:w="0" w:type="auto"/>
+        <w:tblInd w:w="38" w:type="dxa"/>
+        <w:tblLook w:val="04A0" w:firstRow="1" w:lastRow="0" w:firstColumn="1" w:lastColumn="0" w:noHBand="0" w:noVBand="1"/>
+      </w:tblPr>
+      <w:tblGrid>
+        <w:gridCol w:w="2809"/>
+        <w:gridCol w:w="805"/>
+        <w:gridCol w:w="5068"/>
+      </w:tblGrid>
+      <w:tr>
+        <w:tc>
+          <w:tcPr>
+            <w:tcW w:w="2809" w:type="dxa"/>
+            <w:shd w:val="clear" w:color="auto" w:fill="9BBB59" w:themeFill="accent3"/>
+          </w:tcPr>
+          <w:p>
+            <w:pPr>
+              <w:pStyle w:val="PSI-Normal"/>
+            </w:pPr>
+            <w:r>
+              <w:t>CU-0</w:t>
+            </w:r>
+            <w:r>
+              <w:t>8</w:t>
+            </w:r>
+          </w:p>
+        </w:tc>
+        <w:tc>
+          <w:tcPr>
+            <w:tcW w:w="5873" w:type="dxa"/>
+            <w:gridSpan w:val="2"/>
+          </w:tcPr>
+          <w:p>
+            <w:pPr>
+              <w:pStyle w:val="PSI-Normal"/>
+            </w:pPr>
+            <w:r>
+              <w:t>Gestionar graduado</w:t>
+            </w:r>
+          </w:p>
+        </w:tc>
+      </w:tr>
+      <w:tr>
+        <w:trPr>
+          <w:trHeight w:val="186"/>
+        </w:trPr>
+        <w:tc>
+          <w:tcPr>
+            <w:tcW w:w="2809" w:type="dxa"/>
+            <w:shd w:val="clear" w:color="auto" w:fill="9BBB59" w:themeFill="accent3"/>
+          </w:tcPr>
+          <w:p>
+            <w:pPr>
+              <w:pStyle w:val="PSI-Normal"/>
+            </w:pPr>
+            <w:r>
+              <w:t>Actores</w:t>
+            </w:r>
+          </w:p>
+        </w:tc>
+        <w:tc>
+          <w:tcPr>
+            <w:tcW w:w="5873" w:type="dxa"/>
+            <w:gridSpan w:val="2"/>
+          </w:tcPr>
+          <w:p>
+            <w:pPr>
+              <w:pStyle w:val="PSI-Normal"/>
+            </w:pPr>
+            <w:r>
+              <w:t>Usuario, BBDD</w:t>
+            </w:r>
+          </w:p>
+        </w:tc>
+      </w:tr>
+      <w:tr>
+        <w:tc>
+          <w:tcPr>
+            <w:tcW w:w="2809" w:type="dxa"/>
+            <w:shd w:val="clear" w:color="auto" w:fill="9BBB59" w:themeFill="accent3"/>
+          </w:tcPr>
+          <w:p>
+            <w:pPr>
+              <w:pStyle w:val="PSI-Normal"/>
+            </w:pPr>
+            <w:r>
+              <w:t>Precondiciones</w:t>
+            </w:r>
+          </w:p>
+        </w:tc>
+        <w:tc>
+          <w:tcPr>
+            <w:tcW w:w="5873" w:type="dxa"/>
+            <w:gridSpan w:val="2"/>
+          </w:tcPr>
+          <w:p>
+            <w:pPr>
+              <w:pStyle w:val="PSI-Normal"/>
+            </w:pPr>
+            <w:r>
+              <w:t>El usuario ha ingresado al panel de listado de graduados</w:t>
+            </w:r>
+          </w:p>
+        </w:tc>
+      </w:tr>
+      <w:tr>
+        <w:tc>
+          <w:tcPr>
+            <w:tcW w:w="2809" w:type="dxa"/>
+            <w:shd w:val="clear" w:color="auto" w:fill="9BBB59" w:themeFill="accent3"/>
+          </w:tcPr>
+          <w:p>
+            <w:pPr>
+              <w:pStyle w:val="PSI-Normal"/>
+            </w:pPr>
+            <w:r>
+              <w:t>Postcondiciones</w:t>
+            </w:r>
+          </w:p>
+        </w:tc>
+        <w:tc>
+          <w:tcPr>
+            <w:tcW w:w="5873" w:type="dxa"/>
+            <w:gridSpan w:val="2"/>
+          </w:tcPr>
+          <w:p>
+            <w:pPr>
+              <w:pStyle w:val="PSI-Normal"/>
+            </w:pPr>
+            <w:r>
+              <w:t>Ninguno</w:t>
+            </w:r>
+          </w:p>
+        </w:tc>
+      </w:tr>
+      <w:tr>
+        <w:tc>
+          <w:tcPr>
+            <w:tcW w:w="2809" w:type="dxa"/>
+            <w:vMerge w:val="restart"/>
+            <w:shd w:val="clear" w:color="auto" w:fill="9BBB59" w:themeFill="accent3"/>
+          </w:tcPr>
+          <w:p>
+            <w:pPr>
+              <w:pStyle w:val="PSI-Normal"/>
+            </w:pPr>
+            <w:r>
+              <w:t>Flujo normal</w:t>
+            </w:r>
+          </w:p>
+        </w:tc>
+        <w:tc>
+          <w:tcPr>
+            <w:tcW w:w="805" w:type="dxa"/>
+          </w:tcPr>
+          <w:p>
+            <w:pPr>
+              <w:pStyle w:val="PSI-Normal"/>
+            </w:pPr>
+            <w:r>
+              <w:t>Pasos</w:t>
+            </w:r>
+          </w:p>
+        </w:tc>
+        <w:tc>
+          <w:tcPr>
+            <w:tcW w:w="5068" w:type="dxa"/>
+          </w:tcPr>
+          <w:p>
+            <w:pPr>
+              <w:pStyle w:val="PSI-Normal"/>
+            </w:pPr>
+            <w:r>
+              <w:t>Acciones</w:t>
+            </w:r>
+          </w:p>
+        </w:tc>
+      </w:tr>
+      <w:tr>
+        <w:tc>
+          <w:tcPr>
+            <w:tcW w:w="2809" w:type="dxa"/>
+            <w:vMerge/>
+            <w:shd w:val="clear" w:color="auto" w:fill="9BBB59" w:themeFill="accent3"/>
+          </w:tcPr>
+          <w:p>
+            <w:pPr>
+              <w:pStyle w:val="PSI-Normal"/>
+            </w:pPr>
+          </w:p>
+        </w:tc>
+        <w:tc>
+          <w:tcPr>
+            <w:tcW w:w="805" w:type="dxa"/>
+          </w:tcPr>
+          <w:p>
+            <w:pPr>
+              <w:pStyle w:val="PSI-Normal"/>
+            </w:pPr>
+            <w:r>
+              <w:t>1</w:t>
+            </w:r>
+          </w:p>
+        </w:tc>
+        <w:tc>
+          <w:tcPr>
+            <w:tcW w:w="5068" w:type="dxa"/>
+          </w:tcPr>
+          <w:p>
+            <w:pPr>
+              <w:pStyle w:val="PSI-Normal"/>
+            </w:pPr>
+            <w:r>
+              <w:t xml:space="preserve">El sistema despliega la pantalla de </w:t>
+            </w:r>
+            <w:r>
+              <w:t>listado de graduados</w:t>
+            </w:r>
+          </w:p>
+        </w:tc>
+      </w:tr>
+      <w:tr>
+        <w:tc>
+          <w:tcPr>
+            <w:tcW w:w="2809" w:type="dxa"/>
+            <w:vMerge/>
+            <w:shd w:val="clear" w:color="auto" w:fill="9BBB59" w:themeFill="accent3"/>
+          </w:tcPr>
+          <w:p>
+            <w:pPr>
+              <w:pStyle w:val="PSI-Normal"/>
+            </w:pPr>
+          </w:p>
+        </w:tc>
+        <w:tc>
+          <w:tcPr>
+            <w:tcW w:w="805" w:type="dxa"/>
+          </w:tcPr>
+          <w:p>
+            <w:pPr>
+              <w:pStyle w:val="PSI-Normal"/>
+            </w:pPr>
+            <w:r>
+              <w:t>2</w:t>
+            </w:r>
+          </w:p>
+        </w:tc>
+        <w:tc>
+          <w:tcPr>
+            <w:tcW w:w="5068" w:type="dxa"/>
+          </w:tcPr>
+          <w:p>
+            <w:pPr>
+              <w:pStyle w:val="PSI-Normal"/>
+            </w:pPr>
+            <w:r>
+              <w:t>El usuario selecciona la opción de ingresar un nuevo graduado</w:t>
+            </w:r>
+          </w:p>
+        </w:tc>
+      </w:tr>
+      <w:tr>
+        <w:tc>
+          <w:tcPr>
+            <w:tcW w:w="2809" w:type="dxa"/>
+            <w:vMerge/>
+            <w:shd w:val="clear" w:color="auto" w:fill="9BBB59" w:themeFill="accent3"/>
+          </w:tcPr>
+          <w:p>
+            <w:pPr>
+              <w:pStyle w:val="PSI-Normal"/>
+            </w:pPr>
+          </w:p>
+        </w:tc>
+        <w:tc>
+          <w:tcPr>
+            <w:tcW w:w="805" w:type="dxa"/>
+          </w:tcPr>
+          <w:p>
+            <w:pPr>
+              <w:pStyle w:val="PSI-Normal"/>
+            </w:pPr>
+            <w:r>
+              <w:t>3</w:t>
+            </w:r>
+          </w:p>
+        </w:tc>
+        <w:tc>
+          <w:tcPr>
+            <w:tcW w:w="5068" w:type="dxa"/>
+          </w:tcPr>
+          <w:p>
+            <w:pPr>
+              <w:pStyle w:val="PSI-Normal"/>
+            </w:pPr>
+            <w:r>
+              <w:t xml:space="preserve">El sistema </w:t>
+            </w:r>
+            <w:r>
+              <w:t>despliega una pantalla con un formulario para que el usuario ingrese todos los datos del nuevo graduado</w:t>
+            </w:r>
+          </w:p>
+        </w:tc>
+      </w:tr>
+      <w:tr>
+        <w:tc>
+          <w:tcPr>
+            <w:tcW w:w="2809" w:type="dxa"/>
+            <w:vMerge/>
+            <w:shd w:val="clear" w:color="auto" w:fill="9BBB59" w:themeFill="accent3"/>
+          </w:tcPr>
+          <w:p>
+            <w:pPr>
+              <w:pStyle w:val="PSI-Normal"/>
+            </w:pPr>
+          </w:p>
+        </w:tc>
+        <w:tc>
+          <w:tcPr>
+            <w:tcW w:w="805" w:type="dxa"/>
+          </w:tcPr>
+          <w:p>
+            <w:pPr>
+              <w:pStyle w:val="PSI-Normal"/>
+            </w:pPr>
+            <w:r>
+              <w:t>4</w:t>
+            </w:r>
+          </w:p>
+        </w:tc>
+        <w:tc>
+          <w:tcPr>
+            <w:tcW w:w="5068" w:type="dxa"/>
+          </w:tcPr>
+          <w:p>
+            <w:pPr>
+              <w:pStyle w:val="PSI-Normal"/>
+            </w:pPr>
+            <w:r>
+              <w:t xml:space="preserve">El usuario </w:t>
+            </w:r>
+            <w:r>
+              <w:t>completa</w:t>
+            </w:r>
+            <w:r>
+              <w:t xml:space="preserve">, al menos, los campos obligatorios y hace clic en “Registrar graduado”. </w:t>
+            </w:r>
+          </w:p>
+        </w:tc>
+      </w:tr>
+      <w:tr>
+        <w:tc>
+          <w:tcPr>
+            <w:tcW w:w="2809" w:type="dxa"/>
+            <w:vMerge/>
+            <w:shd w:val="clear" w:color="auto" w:fill="9BBB59" w:themeFill="accent3"/>
+          </w:tcPr>
+          <w:p>
+            <w:pPr>
+              <w:pStyle w:val="PSI-Normal"/>
+            </w:pPr>
+          </w:p>
+        </w:tc>
+        <w:tc>
+          <w:tcPr>
+            <w:tcW w:w="805" w:type="dxa"/>
+          </w:tcPr>
+          <w:p>
+            <w:pPr>
+              <w:pStyle w:val="PSI-Normal"/>
+            </w:pPr>
+            <w:r>
+              <w:t>5</w:t>
+            </w:r>
+          </w:p>
+        </w:tc>
+        <w:tc>
+          <w:tcPr>
+            <w:tcW w:w="5068" w:type="dxa"/>
+          </w:tcPr>
+          <w:p>
+            <w:pPr>
+              <w:pStyle w:val="PSI-Normal"/>
+            </w:pPr>
+            <w:r>
+              <w:t>Se ejecuta el CU04-Paso 1</w:t>
+            </w:r>
+          </w:p>
+        </w:tc>
+      </w:tr>
+      <w:tr>
+        <w:tc>
+          <w:tcPr>
+            <w:tcW w:w="2809" w:type="dxa"/>
+            <w:shd w:val="clear" w:color="auto" w:fill="76923C" w:themeFill="accent3" w:themeFillShade="BF"/>
+          </w:tcPr>
+          <w:p>
+            <w:pPr>
+              <w:pStyle w:val="PSI-Normal"/>
+            </w:pPr>
+          </w:p>
+        </w:tc>
+        <w:tc>
+          <w:tcPr>
+            <w:tcW w:w="805" w:type="dxa"/>
+            <w:shd w:val="clear" w:color="auto" w:fill="76923C" w:themeFill="accent3" w:themeFillShade="BF"/>
+          </w:tcPr>
+          <w:p>
+            <w:pPr>
+              <w:pStyle w:val="PSI-Normal"/>
+            </w:pPr>
+          </w:p>
+        </w:tc>
+        <w:tc>
+          <w:tcPr>
+            <w:tcW w:w="5068" w:type="dxa"/>
+            <w:shd w:val="clear" w:color="auto" w:fill="76923C" w:themeFill="accent3" w:themeFillShade="BF"/>
+          </w:tcPr>
+          <w:p>
+            <w:pPr>
+              <w:pStyle w:val="PSI-Normal"/>
+            </w:pPr>
+          </w:p>
+        </w:tc>
+      </w:tr>
+      <w:tr>
+        <w:tc>
+          <w:tcPr>
+            <w:tcW w:w="2809" w:type="dxa"/>
+            <w:vMerge w:val="restart"/>
+            <w:shd w:val="clear" w:color="auto" w:fill="9BBB59" w:themeFill="accent3"/>
+          </w:tcPr>
+          <w:p>
+            <w:pPr>
+              <w:pStyle w:val="PSI-Normal"/>
+            </w:pPr>
+            <w:r>
+              <w:t>Flujo alternativo</w:t>
+            </w:r>
+          </w:p>
+        </w:tc>
+        <w:tc>
+          <w:tcPr>
+            <w:tcW w:w="805" w:type="dxa"/>
+            <w:shd w:val="clear" w:color="auto" w:fill="FFFFFF" w:themeFill="background1"/>
+          </w:tcPr>
+          <w:p>
+            <w:pPr>
+              <w:pStyle w:val="PSI-Normal"/>
+            </w:pPr>
+            <w:r>
+              <w:t>2a</w:t>
+            </w:r>
+          </w:p>
+        </w:tc>
+        <w:tc>
+          <w:tcPr>
+            <w:tcW w:w="5068" w:type="dxa"/>
+            <w:shd w:val="clear" w:color="auto" w:fill="FFFFFF" w:themeFill="background1"/>
+          </w:tcPr>
+          <w:p>
+            <w:pPr>
+              <w:pStyle w:val="PSI-Normal"/>
+            </w:pPr>
+            <w:r>
+              <w:t>El usuario selecciona la opción modificar graduado</w:t>
+            </w:r>
+          </w:p>
+        </w:tc>
+      </w:tr>
+      <w:tr>
+        <w:tc>
+          <w:tcPr>
+            <w:tcW w:w="2809" w:type="dxa"/>
+            <w:vMerge/>
+            <w:shd w:val="clear" w:color="auto" w:fill="9BBB59" w:themeFill="accent3"/>
+          </w:tcPr>
+          <w:p>
+            <w:pPr>
+              <w:pStyle w:val="PSI-Normal"/>
+            </w:pPr>
+          </w:p>
+        </w:tc>
+        <w:tc>
+          <w:tcPr>
+            <w:tcW w:w="805" w:type="dxa"/>
+            <w:shd w:val="clear" w:color="auto" w:fill="FFFFFF" w:themeFill="background1"/>
+          </w:tcPr>
+          <w:p>
+            <w:pPr>
+              <w:pStyle w:val="PSI-Normal"/>
+            </w:pPr>
+            <w:r>
+              <w:t>2a1</w:t>
+            </w:r>
+          </w:p>
+        </w:tc>
+        <w:tc>
+          <w:tcPr>
+            <w:tcW w:w="5068" w:type="dxa"/>
+            <w:shd w:val="clear" w:color="auto" w:fill="FFFFFF" w:themeFill="background1"/>
+          </w:tcPr>
+          <w:p>
+            <w:pPr>
+              <w:pStyle w:val="PSI-Normal"/>
+            </w:pPr>
+            <w:r>
+              <w:t>El flujo sigue en el CU-06 Paso 1</w:t>
+            </w:r>
+          </w:p>
+        </w:tc>
+      </w:tr>
+      <w:tr>
+        <w:tc>
+          <w:tcPr>
+            <w:tcW w:w="2809" w:type="dxa"/>
+            <w:vMerge/>
+            <w:shd w:val="clear" w:color="auto" w:fill="9BBB59" w:themeFill="accent3"/>
+          </w:tcPr>
+          <w:p>
+            <w:pPr>
+              <w:pStyle w:val="PSI-Normal"/>
+            </w:pPr>
+          </w:p>
+        </w:tc>
+        <w:tc>
+          <w:tcPr>
+            <w:tcW w:w="805" w:type="dxa"/>
+            <w:shd w:val="clear" w:color="auto" w:fill="FFFFFF" w:themeFill="background1"/>
+          </w:tcPr>
+          <w:p>
+            <w:pPr>
+              <w:pStyle w:val="PSI-Normal"/>
+            </w:pPr>
+          </w:p>
+        </w:tc>
+        <w:tc>
+          <w:tcPr>
+            <w:tcW w:w="5068" w:type="dxa"/>
+            <w:shd w:val="clear" w:color="auto" w:fill="FFFFFF" w:themeFill="background1"/>
+          </w:tcPr>
+          <w:p>
+            <w:pPr>
+              <w:pStyle w:val="PSI-Normal"/>
+            </w:pPr>
+          </w:p>
+        </w:tc>
+      </w:tr>
+      <w:tr>
+        <w:tc>
+          <w:tcPr>
+            <w:tcW w:w="2809" w:type="dxa"/>
+            <w:vMerge/>
+            <w:shd w:val="clear" w:color="auto" w:fill="9BBB59" w:themeFill="accent3"/>
+          </w:tcPr>
+          <w:p>
+            <w:pPr>
+              <w:pStyle w:val="PSI-Normal"/>
+            </w:pPr>
+          </w:p>
+        </w:tc>
+        <w:tc>
+          <w:tcPr>
+            <w:tcW w:w="805" w:type="dxa"/>
+            <w:shd w:val="clear" w:color="auto" w:fill="FFFFFF" w:themeFill="background1"/>
+          </w:tcPr>
+          <w:p>
+            <w:pPr>
+              <w:pStyle w:val="PSI-Normal"/>
+            </w:pPr>
+            <w:r>
+              <w:t>2b</w:t>
+            </w:r>
+          </w:p>
+        </w:tc>
+        <w:tc>
+          <w:tcPr>
+            <w:tcW w:w="5068" w:type="dxa"/>
+            <w:shd w:val="clear" w:color="auto" w:fill="FFFFFF" w:themeFill="background1"/>
+          </w:tcPr>
+          <w:p>
+            <w:pPr>
+              <w:pStyle w:val="PSI-Normal"/>
+            </w:pPr>
+            <w:r>
+              <w:t>El usuario selecciona dar de baja al graduado</w:t>
+            </w:r>
+          </w:p>
+        </w:tc>
+      </w:tr>
+      <w:tr>
+        <w:tc>
+          <w:tcPr>
+            <w:tcW w:w="2809" w:type="dxa"/>
+            <w:vMerge/>
+            <w:shd w:val="clear" w:color="auto" w:fill="9BBB59" w:themeFill="accent3"/>
+          </w:tcPr>
+          <w:p>
+            <w:pPr>
+              <w:pStyle w:val="PSI-Normal"/>
+            </w:pPr>
+          </w:p>
+        </w:tc>
+        <w:tc>
+          <w:tcPr>
+            <w:tcW w:w="805" w:type="dxa"/>
+            <w:shd w:val="clear" w:color="auto" w:fill="FFFFFF" w:themeFill="background1"/>
+          </w:tcPr>
+          <w:p>
+            <w:pPr>
+              <w:pStyle w:val="PSI-Normal"/>
+            </w:pPr>
+            <w:r>
+              <w:t>2b1</w:t>
+            </w:r>
+          </w:p>
+        </w:tc>
+        <w:tc>
+          <w:tcPr>
+            <w:tcW w:w="5068" w:type="dxa"/>
+            <w:shd w:val="clear" w:color="auto" w:fill="FFFFFF" w:themeFill="background1"/>
+          </w:tcPr>
+          <w:p>
+            <w:pPr>
+              <w:pStyle w:val="PSI-Normal"/>
+            </w:pPr>
+            <w:r>
+              <w:t>El sistema muestra una ventana emergente con un mensaje de advertencia y las opciones “Volver/Dar de baja”</w:t>
+            </w:r>
+          </w:p>
+        </w:tc>
+      </w:tr>
+      <w:tr>
+        <w:tc>
+          <w:tcPr>
+            <w:tcW w:w="2809" w:type="dxa"/>
+            <w:vMerge/>
+            <w:shd w:val="clear" w:color="auto" w:fill="9BBB59" w:themeFill="accent3"/>
+          </w:tcPr>
+          <w:p>
+            <w:pPr>
+              <w:pStyle w:val="PSI-Normal"/>
+            </w:pPr>
+          </w:p>
+        </w:tc>
+        <w:tc>
+          <w:tcPr>
+            <w:tcW w:w="805" w:type="dxa"/>
+            <w:shd w:val="clear" w:color="auto" w:fill="FFFFFF" w:themeFill="background1"/>
+          </w:tcPr>
+          <w:p>
+            <w:pPr>
+              <w:pStyle w:val="PSI-Normal"/>
+            </w:pPr>
+            <w:r>
+              <w:t>2b2</w:t>
+            </w:r>
+          </w:p>
+        </w:tc>
+        <w:tc>
+          <w:tcPr>
+            <w:tcW w:w="5068" w:type="dxa"/>
+            <w:shd w:val="clear" w:color="auto" w:fill="FFFFFF" w:themeFill="background1"/>
+          </w:tcPr>
+          <w:p>
+            <w:pPr>
+              <w:pStyle w:val="PSI-Normal"/>
+            </w:pPr>
+            <w:r>
+              <w:t>El usuario da clic en la opción “Dar de baja”.</w:t>
+            </w:r>
+          </w:p>
+        </w:tc>
+      </w:tr>
+      <w:tr>
+        <w:tc>
+          <w:tcPr>
+            <w:tcW w:w="2809" w:type="dxa"/>
+            <w:vMerge/>
+            <w:shd w:val="clear" w:color="auto" w:fill="9BBB59" w:themeFill="accent3"/>
+          </w:tcPr>
+          <w:p>
+            <w:pPr>
+              <w:pStyle w:val="PSI-Normal"/>
+            </w:pPr>
+          </w:p>
+        </w:tc>
+        <w:tc>
+          <w:tcPr>
+            <w:tcW w:w="805" w:type="dxa"/>
+            <w:shd w:val="clear" w:color="auto" w:fill="FFFFFF" w:themeFill="background1"/>
+          </w:tcPr>
+          <w:p>
+            <w:pPr>
+              <w:pStyle w:val="PSI-Normal"/>
+            </w:pPr>
+            <w:r>
+              <w:t>2b3</w:t>
+            </w:r>
+          </w:p>
+        </w:tc>
+        <w:tc>
+          <w:tcPr>
+            <w:tcW w:w="5068" w:type="dxa"/>
+            <w:shd w:val="clear" w:color="auto" w:fill="FFFFFF" w:themeFill="background1"/>
+          </w:tcPr>
+          <w:p>
+            <w:pPr>
+              <w:pStyle w:val="PSI-Normal"/>
+            </w:pPr>
+            <w:r>
+              <w:t>El sistema ejecuta el CU-07 Paso 1</w:t>
+            </w:r>
+          </w:p>
+        </w:tc>
+      </w:tr>
+    </w:tbl>
+    <w:p>
+      <w:pPr>
+        <w:pStyle w:val="PSI-Normal"/>
+      </w:pPr>
+    </w:p>
+    <w:tbl>
+      <w:tblPr>
+        <w:tblStyle w:val="Tablaconcuadrcula"/>
+        <w:tblW w:w="0" w:type="auto"/>
+        <w:tblInd w:w="38" w:type="dxa"/>
+        <w:tblLook w:val="04A0" w:firstRow="1" w:lastRow="0" w:firstColumn="1" w:lastColumn="0" w:noHBand="0" w:noVBand="1"/>
+      </w:tblPr>
+      <w:tblGrid>
+        <w:gridCol w:w="2809"/>
+        <w:gridCol w:w="805"/>
+        <w:gridCol w:w="5068"/>
+      </w:tblGrid>
+      <w:tr>
+        <w:tc>
+          <w:tcPr>
+            <w:tcW w:w="2809" w:type="dxa"/>
+            <w:shd w:val="clear" w:color="auto" w:fill="9BBB59" w:themeFill="accent3"/>
+          </w:tcPr>
+          <w:p>
+            <w:pPr>
+              <w:pStyle w:val="PSI-Normal"/>
+            </w:pPr>
+            <w:r>
+              <w:t>CU-0</w:t>
+            </w:r>
+            <w:r>
+              <w:t>9</w:t>
+            </w:r>
+          </w:p>
+        </w:tc>
+        <w:tc>
+          <w:tcPr>
+            <w:tcW w:w="5873" w:type="dxa"/>
+            <w:gridSpan w:val="2"/>
+          </w:tcPr>
+          <w:p>
+            <w:pPr>
+              <w:pStyle w:val="PSI-Normal"/>
+            </w:pPr>
+            <w:r>
+              <w:t>Consultar tablero de estadística</w:t>
+            </w:r>
+          </w:p>
+        </w:tc>
+      </w:tr>
+      <w:tr>
+        <w:trPr>
+          <w:trHeight w:val="186"/>
+        </w:trPr>
+        <w:tc>
+          <w:tcPr>
+            <w:tcW w:w="2809" w:type="dxa"/>
+            <w:shd w:val="clear" w:color="auto" w:fill="9BBB59" w:themeFill="accent3"/>
+          </w:tcPr>
+          <w:p>
+            <w:pPr>
+              <w:pStyle w:val="PSI-Normal"/>
+            </w:pPr>
+            <w:r>
+              <w:t>Actores</w:t>
+            </w:r>
+          </w:p>
+        </w:tc>
+        <w:tc>
+          <w:tcPr>
+            <w:tcW w:w="5873" w:type="dxa"/>
+            <w:gridSpan w:val="2"/>
+          </w:tcPr>
+          <w:p>
+            <w:pPr>
+              <w:pStyle w:val="PSI-Normal"/>
+            </w:pPr>
+            <w:r>
+              <w:t>Usuario, BBDD</w:t>
+            </w:r>
+          </w:p>
+        </w:tc>
+      </w:tr>
+      <w:tr>
+        <w:tc>
+          <w:tcPr>
+            <w:tcW w:w="2809" w:type="dxa"/>
+            <w:shd w:val="clear" w:color="auto" w:fill="9BBB59" w:themeFill="accent3"/>
+          </w:tcPr>
+          <w:p>
+            <w:pPr>
+              <w:pStyle w:val="PSI-Normal"/>
+            </w:pPr>
+            <w:r>
+              <w:t>Precondiciones</w:t>
+            </w:r>
+          </w:p>
+        </w:tc>
+        <w:tc>
+          <w:tcPr>
+            <w:tcW w:w="5873" w:type="dxa"/>
+            <w:gridSpan w:val="2"/>
+          </w:tcPr>
+          <w:p>
+            <w:pPr>
+              <w:pStyle w:val="PSI-Normal"/>
+            </w:pPr>
+            <w:r>
+              <w:t xml:space="preserve">El usuario ha ingresado al panel </w:t>
+            </w:r>
+            <w:r>
+              <w:t>de estadística</w:t>
+            </w:r>
+          </w:p>
+        </w:tc>
+      </w:tr>
+      <w:tr>
+        <w:tc>
+          <w:tcPr>
+            <w:tcW w:w="2809" w:type="dxa"/>
+            <w:shd w:val="clear" w:color="auto" w:fill="9BBB59" w:themeFill="accent3"/>
+          </w:tcPr>
+          <w:p>
+            <w:pPr>
+              <w:pStyle w:val="PSI-Normal"/>
+            </w:pPr>
+            <w:r>
+              <w:t>Postcondiciones</w:t>
+            </w:r>
+          </w:p>
+        </w:tc>
+        <w:tc>
+          <w:tcPr>
+            <w:tcW w:w="5873" w:type="dxa"/>
+            <w:gridSpan w:val="2"/>
+          </w:tcPr>
+          <w:p>
+            <w:pPr>
+              <w:pStyle w:val="PSI-Normal"/>
+            </w:pPr>
+            <w:r>
+              <w:t>Se muestra la representación (tabla o gráfico) de la estadística solicitada</w:t>
+            </w:r>
+          </w:p>
+        </w:tc>
+      </w:tr>
+      <w:tr>
+        <w:tc>
+          <w:tcPr>
+            <w:tcW w:w="2809" w:type="dxa"/>
+            <w:vMerge w:val="restart"/>
+            <w:shd w:val="clear" w:color="auto" w:fill="9BBB59" w:themeFill="accent3"/>
+          </w:tcPr>
+          <w:p>
+            <w:pPr>
+              <w:pStyle w:val="PSI-Normal"/>
+            </w:pPr>
+            <w:r>
+              <w:t>Flujo normal</w:t>
+            </w:r>
+          </w:p>
+        </w:tc>
+        <w:tc>
+          <w:tcPr>
+            <w:tcW w:w="805" w:type="dxa"/>
+          </w:tcPr>
+          <w:p>
+            <w:pPr>
+              <w:pStyle w:val="PSI-Normal"/>
+            </w:pPr>
+            <w:r>
+              <w:t>Pasos</w:t>
+            </w:r>
+          </w:p>
+        </w:tc>
+        <w:tc>
+          <w:tcPr>
+            <w:tcW w:w="5068" w:type="dxa"/>
+          </w:tcPr>
+          <w:p>
+            <w:pPr>
+              <w:pStyle w:val="PSI-Normal"/>
+            </w:pPr>
+            <w:r>
+              <w:t>Acciones</w:t>
+            </w:r>
+          </w:p>
+        </w:tc>
+      </w:tr>
+      <w:tr>
+        <w:tc>
+          <w:tcPr>
+            <w:tcW w:w="2809" w:type="dxa"/>
+            <w:vMerge/>
+            <w:shd w:val="clear" w:color="auto" w:fill="9BBB59" w:themeFill="accent3"/>
+          </w:tcPr>
+          <w:p>
+            <w:pPr>
+              <w:pStyle w:val="PSI-Normal"/>
+            </w:pPr>
+          </w:p>
+        </w:tc>
+        <w:tc>
+          <w:tcPr>
+            <w:tcW w:w="805" w:type="dxa"/>
+          </w:tcPr>
+          <w:p>
+            <w:pPr>
+              <w:pStyle w:val="PSI-Normal"/>
+            </w:pPr>
+            <w:r>
+              <w:t>1</w:t>
+            </w:r>
+          </w:p>
+        </w:tc>
+        <w:tc>
+          <w:tcPr>
+            <w:tcW w:w="5068" w:type="dxa"/>
+          </w:tcPr>
+          <w:p>
+            <w:pPr>
+              <w:pStyle w:val="PSI-Normal"/>
+            </w:pPr>
+            <w:r>
+              <w:t>El usuario ingresa al panel de estadística</w:t>
+            </w:r>
+          </w:p>
+        </w:tc>
+      </w:tr>
+      <w:tr>
+        <w:tc>
+          <w:tcPr>
+            <w:tcW w:w="2809" w:type="dxa"/>
+            <w:vMerge/>
+            <w:shd w:val="clear" w:color="auto" w:fill="9BBB59" w:themeFill="accent3"/>
+          </w:tcPr>
+          <w:p>
+            <w:pPr>
+              <w:pStyle w:val="PSI-Normal"/>
+            </w:pPr>
+          </w:p>
+        </w:tc>
+        <w:tc>
+          <w:tcPr>
+            <w:tcW w:w="805" w:type="dxa"/>
+          </w:tcPr>
+          <w:p>
+            <w:pPr>
+              <w:pStyle w:val="PSI-Normal"/>
+            </w:pPr>
+            <w:r>
+              <w:t>2</w:t>
+            </w:r>
+          </w:p>
+        </w:tc>
+        <w:tc>
+          <w:tcPr>
+            <w:tcW w:w="5068" w:type="dxa"/>
+          </w:tcPr>
+          <w:p>
+            <w:pPr>
+              <w:pStyle w:val="PSI-Normal"/>
+            </w:pPr>
+            <w:r>
+              <w:t>El sistema despliega la pantalla de estadística</w:t>
+            </w:r>
+          </w:p>
+        </w:tc>
+      </w:tr>
+      <w:tr>
+        <w:tc>
+          <w:tcPr>
+            <w:tcW w:w="2809" w:type="dxa"/>
+            <w:vMerge/>
+            <w:shd w:val="clear" w:color="auto" w:fill="9BBB59" w:themeFill="accent3"/>
+          </w:tcPr>
+          <w:p>
+            <w:pPr>
+              <w:pStyle w:val="PSI-Normal"/>
+            </w:pPr>
+          </w:p>
+        </w:tc>
+        <w:tc>
+          <w:tcPr>
+            <w:tcW w:w="805" w:type="dxa"/>
+          </w:tcPr>
+          <w:p>
+            <w:pPr>
+              <w:pStyle w:val="PSI-Normal"/>
+            </w:pPr>
+            <w:r>
+              <w:t>3</w:t>
+            </w:r>
+          </w:p>
+        </w:tc>
+        <w:tc>
+          <w:tcPr>
+            <w:tcW w:w="5068" w:type="dxa"/>
+          </w:tcPr>
+          <w:p>
+            <w:pPr>
+              <w:pStyle w:val="PSI-Normal"/>
+            </w:pPr>
+            <w:r>
+              <w:t>El usuario selecciona una de las estadísticas</w:t>
+            </w:r>
+          </w:p>
+        </w:tc>
+      </w:tr>
+      <w:tr>
+        <w:tc>
+          <w:tcPr>
+            <w:tcW w:w="2809" w:type="dxa"/>
+            <w:vMerge/>
+            <w:shd w:val="clear" w:color="auto" w:fill="9BBB59" w:themeFill="accent3"/>
+          </w:tcPr>
+          <w:p>
+            <w:pPr>
+              <w:pStyle w:val="PSI-Normal"/>
+            </w:pPr>
+          </w:p>
+        </w:tc>
+        <w:tc>
+          <w:tcPr>
+            <w:tcW w:w="805" w:type="dxa"/>
+          </w:tcPr>
+          <w:p>
+            <w:pPr>
+              <w:pStyle w:val="PSI-Normal"/>
+            </w:pPr>
+            <w:r>
+              <w:t>4</w:t>
+            </w:r>
+          </w:p>
+        </w:tc>
+        <w:tc>
+          <w:tcPr>
+            <w:tcW w:w="5068" w:type="dxa"/>
+          </w:tcPr>
+          <w:p>
+            <w:pPr>
+              <w:pStyle w:val="PSI-Normal"/>
+            </w:pPr>
+            <w:r>
+              <w:t>El sistema representa esa estadística mediante un gráfico tomando todos los valores admisibles (sin restricciones)</w:t>
+            </w:r>
+          </w:p>
+        </w:tc>
+      </w:tr>
+    </w:tbl>
+    <w:p>
+      <w:pPr>
+        <w:pStyle w:val="PSI-Normal"/>
+      </w:pPr>
+    </w:p>
+    <w:tbl>
+      <w:tblPr>
+        <w:tblStyle w:val="Tablaconcuadrcula"/>
+        <w:tblW w:w="0" w:type="auto"/>
+        <w:tblInd w:w="38" w:type="dxa"/>
+        <w:tblLook w:val="04A0" w:firstRow="1" w:lastRow="0" w:firstColumn="1" w:lastColumn="0" w:noHBand="0" w:noVBand="1"/>
+      </w:tblPr>
+      <w:tblGrid>
+        <w:gridCol w:w="2809"/>
+        <w:gridCol w:w="805"/>
+        <w:gridCol w:w="5068"/>
+      </w:tblGrid>
+      <w:tr>
+        <w:tc>
+          <w:tcPr>
+            <w:tcW w:w="2809" w:type="dxa"/>
+            <w:shd w:val="clear" w:color="auto" w:fill="9BBB59" w:themeFill="accent3"/>
+          </w:tcPr>
+          <w:p>
+            <w:pPr>
+              <w:pStyle w:val="PSI-Normal"/>
+            </w:pPr>
+            <w:r>
+              <w:t>CU-</w:t>
+            </w:r>
+            <w:r>
+              <w:t>10</w:t>
+            </w:r>
+          </w:p>
+        </w:tc>
+        <w:tc>
+          <w:tcPr>
+            <w:tcW w:w="5873" w:type="dxa"/>
+            <w:gridSpan w:val="2"/>
+          </w:tcPr>
+          <w:p>
+            <w:pPr>
+              <w:pStyle w:val="PSI-Normal"/>
+            </w:pPr>
+            <w:r>
+              <w:t>Parametrizar estadística</w:t>
+            </w:r>
+          </w:p>
+        </w:tc>
+      </w:tr>
+      <w:tr>
+        <w:trPr>
+          <w:trHeight w:val="186"/>
+        </w:trPr>
+        <w:tc>
+          <w:tcPr>
+            <w:tcW w:w="2809" w:type="dxa"/>
+            <w:shd w:val="clear" w:color="auto" w:fill="9BBB59" w:themeFill="accent3"/>
+          </w:tcPr>
+          <w:p>
+            <w:pPr>
+              <w:pStyle w:val="PSI-Normal"/>
+            </w:pPr>
+            <w:r>
+              <w:t>Actores</w:t>
+            </w:r>
+          </w:p>
+        </w:tc>
+        <w:tc>
+          <w:tcPr>
+            <w:tcW w:w="5873" w:type="dxa"/>
+            <w:gridSpan w:val="2"/>
+          </w:tcPr>
+          <w:p>
+            <w:pPr>
+              <w:pStyle w:val="PSI-Normal"/>
+            </w:pPr>
+            <w:r>
+              <w:t>Usuario, BBDD</w:t>
+            </w:r>
+          </w:p>
+        </w:tc>
+      </w:tr>
+      <w:tr>
+        <w:tc>
+          <w:tcPr>
+            <w:tcW w:w="2809" w:type="dxa"/>
+            <w:shd w:val="clear" w:color="auto" w:fill="9BBB59" w:themeFill="accent3"/>
+          </w:tcPr>
+          <w:p>
+            <w:pPr>
+              <w:pStyle w:val="PSI-Normal"/>
+            </w:pPr>
+            <w:r>
+              <w:t>Precondiciones</w:t>
+            </w:r>
+          </w:p>
+        </w:tc>
+        <w:tc>
+          <w:tcPr>
+            <w:tcW w:w="5873" w:type="dxa"/>
+            <w:gridSpan w:val="2"/>
+          </w:tcPr>
+          <w:p>
+            <w:pPr>
+              <w:pStyle w:val="PSI-Normal"/>
+            </w:pPr>
+            <w:r>
+              <w:t>El usuario ha ingresado al panel de estadística</w:t>
+            </w:r>
+            <w:r>
+              <w:t xml:space="preserve"> y seleccionado una estadística</w:t>
+            </w:r>
+          </w:p>
+        </w:tc>
+      </w:tr>
+      <w:tr>
+        <w:tc>
+          <w:tcPr>
+            <w:tcW w:w="2809" w:type="dxa"/>
+            <w:shd w:val="clear" w:color="auto" w:fill="9BBB59" w:themeFill="accent3"/>
+          </w:tcPr>
+          <w:p>
+            <w:pPr>
+              <w:pStyle w:val="PSI-Normal"/>
+            </w:pPr>
+            <w:r>
+              <w:t>Postcondiciones</w:t>
+            </w:r>
+          </w:p>
+        </w:tc>
+        <w:tc>
+          <w:tcPr>
+            <w:tcW w:w="5873" w:type="dxa"/>
+            <w:gridSpan w:val="2"/>
+          </w:tcPr>
+          <w:p>
+            <w:pPr>
+              <w:pStyle w:val="PSI-Normal"/>
+            </w:pPr>
+            <w:r>
+              <w:t>Se muestra la estadística parametrizada en pantalla</w:t>
+            </w:r>
+          </w:p>
+        </w:tc>
+      </w:tr>
+      <w:tr>
+        <w:tc>
+          <w:tcPr>
+            <w:tcW w:w="2809" w:type="dxa"/>
+            <w:vMerge w:val="restart"/>
+            <w:shd w:val="clear" w:color="auto" w:fill="9BBB59" w:themeFill="accent3"/>
+          </w:tcPr>
+          <w:p>
+            <w:pPr>
+              <w:pStyle w:val="PSI-Normal"/>
+            </w:pPr>
+            <w:r>
+              <w:t>Flujo normal</w:t>
+            </w:r>
+          </w:p>
+        </w:tc>
+        <w:tc>
+          <w:tcPr>
+            <w:tcW w:w="805" w:type="dxa"/>
+          </w:tcPr>
+          <w:p>
+            <w:pPr>
+              <w:pStyle w:val="PSI-Normal"/>
+            </w:pPr>
+            <w:r>
+              <w:t>Pasos</w:t>
+            </w:r>
+          </w:p>
+        </w:tc>
+        <w:tc>
+          <w:tcPr>
+            <w:tcW w:w="5068" w:type="dxa"/>
+          </w:tcPr>
+          <w:p>
+            <w:pPr>
+              <w:pStyle w:val="PSI-Normal"/>
+            </w:pPr>
+            <w:r>
+              <w:t>Acciones</w:t>
+            </w:r>
+          </w:p>
+        </w:tc>
+      </w:tr>
+      <w:tr>
+        <w:tc>
+          <w:tcPr>
+            <w:tcW w:w="2809" w:type="dxa"/>
+            <w:vMerge/>
+            <w:shd w:val="clear" w:color="auto" w:fill="9BBB59" w:themeFill="accent3"/>
+          </w:tcPr>
+          <w:p>
+            <w:pPr>
+              <w:pStyle w:val="PSI-Normal"/>
+            </w:pPr>
+          </w:p>
+        </w:tc>
+        <w:tc>
+          <w:tcPr>
+            <w:tcW w:w="805" w:type="dxa"/>
+          </w:tcPr>
+          <w:p>
+            <w:pPr>
+              <w:pStyle w:val="PSI-Normal"/>
+            </w:pPr>
+            <w:r>
+              <w:t>1</w:t>
+            </w:r>
+          </w:p>
+        </w:tc>
+        <w:tc>
+          <w:tcPr>
+            <w:tcW w:w="5068" w:type="dxa"/>
+          </w:tcPr>
+          <w:p>
+            <w:pPr>
+              <w:pStyle w:val="PSI-Normal"/>
+            </w:pPr>
+            <w:r>
+              <w:t>El usuario selecciona una opción para ajustar su estadística elegida (lapso, fecha de ingreso, fecha de egreso, carrera, escuela)</w:t>
+            </w:r>
+          </w:p>
+        </w:tc>
+      </w:tr>
+      <w:tr>
+        <w:tc>
+          <w:tcPr>
+            <w:tcW w:w="2809" w:type="dxa"/>
+            <w:vMerge/>
+            <w:shd w:val="clear" w:color="auto" w:fill="9BBB59" w:themeFill="accent3"/>
+          </w:tcPr>
+          <w:p>
+            <w:pPr>
+              <w:pStyle w:val="PSI-Normal"/>
+            </w:pPr>
+          </w:p>
+        </w:tc>
+        <w:tc>
+          <w:tcPr>
+            <w:tcW w:w="805" w:type="dxa"/>
+          </w:tcPr>
+          <w:p>
+            <w:pPr>
+              <w:pStyle w:val="PSI-Normal"/>
+            </w:pPr>
+            <w:r>
+              <w:t>2</w:t>
+            </w:r>
+          </w:p>
+        </w:tc>
+        <w:tc>
+          <w:tcPr>
+            <w:tcW w:w="5068" w:type="dxa"/>
+          </w:tcPr>
+          <w:p>
+            <w:pPr>
+              <w:pStyle w:val="PSI-Normal"/>
+            </w:pPr>
+            <w:r>
+              <w:t>El sistema muestra la estadística seleccionada ajustada por los parámetros indicados</w:t>
+            </w:r>
+          </w:p>
+        </w:tc>
+      </w:tr>
+    </w:tbl>
+    <w:p>
+      <w:pPr>
+        <w:pStyle w:val="PSI-Normal"/>
+      </w:pPr>
+    </w:p>
+    <w:tbl>
+      <w:tblPr>
+        <w:tblStyle w:val="Tablaconcuadrcula"/>
+        <w:tblW w:w="0" w:type="auto"/>
+        <w:tblInd w:w="38" w:type="dxa"/>
+        <w:tblLook w:val="04A0" w:firstRow="1" w:lastRow="0" w:firstColumn="1" w:lastColumn="0" w:noHBand="0" w:noVBand="1"/>
+      </w:tblPr>
+      <w:tblGrid>
+        <w:gridCol w:w="2809"/>
+        <w:gridCol w:w="805"/>
+        <w:gridCol w:w="5068"/>
+      </w:tblGrid>
+      <w:tr>
+        <w:tc>
+          <w:tcPr>
+            <w:tcW w:w="2809" w:type="dxa"/>
+            <w:shd w:val="clear" w:color="auto" w:fill="9BBB59" w:themeFill="accent3"/>
+          </w:tcPr>
+          <w:p>
+            <w:pPr>
+              <w:pStyle w:val="PSI-Normal"/>
+            </w:pPr>
+            <w:r>
+              <w:t>CU-</w:t>
+            </w:r>
+            <w:r>
+              <w:t>11</w:t>
+            </w:r>
+          </w:p>
+        </w:tc>
+        <w:tc>
+          <w:tcPr>
+            <w:tcW w:w="5873" w:type="dxa"/>
+            <w:gridSpan w:val="2"/>
+          </w:tcPr>
+          <w:p>
+            <w:pPr>
+              <w:pStyle w:val="PSI-Normal"/>
+            </w:pPr>
+            <w:r>
+              <w:t>Gestionar graduado</w:t>
+            </w:r>
+            <w:r>
+              <w:t xml:space="preserve"> con baja lógica</w:t>
+            </w:r>
+          </w:p>
+        </w:tc>
+      </w:tr>
+      <w:tr>
+        <w:trPr>
+          <w:trHeight w:val="186"/>
+        </w:trPr>
+        <w:tc>
+          <w:tcPr>
+            <w:tcW w:w="2809" w:type="dxa"/>
+            <w:shd w:val="clear" w:color="auto" w:fill="9BBB59" w:themeFill="accent3"/>
+          </w:tcPr>
+          <w:p>
+            <w:pPr>
+              <w:pStyle w:val="PSI-Normal"/>
+            </w:pPr>
+            <w:r>
+              <w:t>Actores</w:t>
+            </w:r>
+          </w:p>
+        </w:tc>
+        <w:tc>
+          <w:tcPr>
+            <w:tcW w:w="5873" w:type="dxa"/>
+            <w:gridSpan w:val="2"/>
+          </w:tcPr>
+          <w:p>
+            <w:pPr>
+              <w:pStyle w:val="PSI-Normal"/>
+            </w:pPr>
+            <w:r>
+              <w:t>Usuario, BBDD</w:t>
+            </w:r>
+          </w:p>
+        </w:tc>
+      </w:tr>
+      <w:tr>
+        <w:tc>
+          <w:tcPr>
+            <w:tcW w:w="2809" w:type="dxa"/>
+            <w:shd w:val="clear" w:color="auto" w:fill="9BBB59" w:themeFill="accent3"/>
+          </w:tcPr>
+          <w:p>
+            <w:pPr>
+              <w:pStyle w:val="PSI-Normal"/>
+            </w:pPr>
+            <w:r>
+              <w:t>Precondiciones</w:t>
+            </w:r>
+          </w:p>
+        </w:tc>
+        <w:tc>
+          <w:tcPr>
+            <w:tcW w:w="5873" w:type="dxa"/>
+            <w:gridSpan w:val="2"/>
+          </w:tcPr>
+          <w:p>
+            <w:pPr>
+              <w:pStyle w:val="PSI-Normal"/>
+            </w:pPr>
+            <w:r>
+              <w:t>El usuario ha ingresado al panel de listado de graduados</w:t>
+            </w:r>
+            <w:r>
+              <w:t xml:space="preserve"> con baja lógica</w:t>
+            </w:r>
+          </w:p>
+        </w:tc>
+      </w:tr>
+      <w:tr>
+        <w:tc>
+          <w:tcPr>
+            <w:tcW w:w="2809" w:type="dxa"/>
+            <w:shd w:val="clear" w:color="auto" w:fill="9BBB59" w:themeFill="accent3"/>
+          </w:tcPr>
+          <w:p>
+            <w:pPr>
+              <w:pStyle w:val="PSI-Normal"/>
+            </w:pPr>
+            <w:r>
+              <w:t>Postcondiciones</w:t>
+            </w:r>
+          </w:p>
+        </w:tc>
+        <w:tc>
+          <w:tcPr>
+            <w:tcW w:w="5873" w:type="dxa"/>
+            <w:gridSpan w:val="2"/>
+          </w:tcPr>
+          <w:p>
+            <w:pPr>
+              <w:pStyle w:val="PSI-Normal"/>
+            </w:pPr>
+            <w:r>
+              <w:t>Se registra una operación</w:t>
+            </w:r>
+          </w:p>
+        </w:tc>
+      </w:tr>
+      <w:tr>
+        <w:tc>
+          <w:tcPr>
+            <w:tcW w:w="2809" w:type="dxa"/>
+            <w:vMerge w:val="restart"/>
+            <w:shd w:val="clear" w:color="auto" w:fill="9BBB59" w:themeFill="accent3"/>
+          </w:tcPr>
+          <w:p>
+            <w:pPr>
+              <w:pStyle w:val="PSI-Normal"/>
+            </w:pPr>
+            <w:r>
+              <w:t>Flujo normal</w:t>
+            </w:r>
+          </w:p>
+        </w:tc>
+        <w:tc>
+          <w:tcPr>
+            <w:tcW w:w="805" w:type="dxa"/>
+          </w:tcPr>
+          <w:p>
+            <w:pPr>
+              <w:pStyle w:val="PSI-Normal"/>
+            </w:pPr>
+            <w:r>
+              <w:t>Pasos</w:t>
+            </w:r>
+          </w:p>
+        </w:tc>
+        <w:tc>
+          <w:tcPr>
+            <w:tcW w:w="5068" w:type="dxa"/>
+          </w:tcPr>
+          <w:p>
+            <w:pPr>
+              <w:pStyle w:val="PSI-Normal"/>
+            </w:pPr>
+            <w:r>
+              <w:t>Acciones</w:t>
+            </w:r>
+          </w:p>
+        </w:tc>
+      </w:tr>
+      <w:tr>
+        <w:tc>
+          <w:tcPr>
+            <w:tcW w:w="2809" w:type="dxa"/>
+            <w:vMerge/>
+            <w:shd w:val="clear" w:color="auto" w:fill="9BBB59" w:themeFill="accent3"/>
+          </w:tcPr>
+          <w:p>
+            <w:pPr>
+              <w:pStyle w:val="PSI-Normal"/>
+            </w:pPr>
+          </w:p>
+        </w:tc>
+        <w:tc>
+          <w:tcPr>
+            <w:tcW w:w="805" w:type="dxa"/>
+          </w:tcPr>
+          <w:p>
+            <w:pPr>
+              <w:pStyle w:val="PSI-Normal"/>
+            </w:pPr>
+            <w:r>
+              <w:t>1</w:t>
+            </w:r>
+          </w:p>
+        </w:tc>
+        <w:tc>
+          <w:tcPr>
+            <w:tcW w:w="5068" w:type="dxa"/>
+          </w:tcPr>
+          <w:p>
+            <w:pPr>
+              <w:pStyle w:val="PSI-Normal"/>
+            </w:pPr>
+            <w:r>
+              <w:t>El sistema despliega la pantalla de listado de graduados</w:t>
+            </w:r>
+            <w:r>
+              <w:t xml:space="preserve"> con baja lógica</w:t>
+            </w:r>
+          </w:p>
+        </w:tc>
+      </w:tr>
+      <w:tr>
+        <w:tc>
+          <w:tcPr>
+            <w:tcW w:w="2809" w:type="dxa"/>
+            <w:vMerge/>
+            <w:shd w:val="clear" w:color="auto" w:fill="9BBB59" w:themeFill="accent3"/>
+          </w:tcPr>
+          <w:p>
+            <w:pPr>
+              <w:pStyle w:val="PSI-Normal"/>
+            </w:pPr>
+          </w:p>
+        </w:tc>
+        <w:tc>
+          <w:tcPr>
+            <w:tcW w:w="805" w:type="dxa"/>
+          </w:tcPr>
+          <w:p>
+            <w:pPr>
+              <w:pStyle w:val="PSI-Normal"/>
+            </w:pPr>
+            <w:r>
+              <w:t>2</w:t>
+            </w:r>
+          </w:p>
+        </w:tc>
+        <w:tc>
+          <w:tcPr>
+            <w:tcW w:w="5068" w:type="dxa"/>
+          </w:tcPr>
+          <w:p>
+            <w:pPr>
+              <w:pStyle w:val="PSI-Normal"/>
+            </w:pPr>
+            <w:r>
+              <w:t xml:space="preserve">El usuario selecciona la opción de </w:t>
+            </w:r>
+            <w:r>
+              <w:t>dar de alta a uno de los graduados</w:t>
+            </w:r>
+          </w:p>
+        </w:tc>
+      </w:tr>
+      <w:tr>
+        <w:tc>
+          <w:tcPr>
+            <w:tcW w:w="2809" w:type="dxa"/>
+            <w:vMerge/>
+            <w:shd w:val="clear" w:color="auto" w:fill="9BBB59" w:themeFill="accent3"/>
+          </w:tcPr>
+          <w:p>
+            <w:pPr>
+              <w:pStyle w:val="PSI-Normal"/>
+            </w:pPr>
+          </w:p>
+        </w:tc>
+        <w:tc>
+          <w:tcPr>
+            <w:tcW w:w="805" w:type="dxa"/>
+          </w:tcPr>
+          <w:p>
+            <w:pPr>
+              <w:pStyle w:val="PSI-Normal"/>
+            </w:pPr>
+            <w:r>
+              <w:t>3</w:t>
+            </w:r>
+          </w:p>
+        </w:tc>
+        <w:tc>
+          <w:tcPr>
+            <w:tcW w:w="5068" w:type="dxa"/>
+          </w:tcPr>
+          <w:p>
+            <w:pPr>
+              <w:pStyle w:val="PSI-Normal"/>
+            </w:pPr>
+            <w:r>
+              <w:t xml:space="preserve">El sistema despliega una </w:t>
+            </w:r>
+            <w:r>
+              <w:t>ventana</w:t>
+            </w:r>
+            <w:r>
+              <w:t xml:space="preserve"> </w:t>
+            </w:r>
+            <w:r>
+              <w:t>emergente confirmando si realmente desea dar de alta (“Dar de alta/Retroceder”)</w:t>
+            </w:r>
+          </w:p>
+        </w:tc>
+      </w:tr>
+      <w:tr>
+        <w:tc>
+          <w:tcPr>
+            <w:tcW w:w="2809" w:type="dxa"/>
+            <w:vMerge/>
+            <w:shd w:val="clear" w:color="auto" w:fill="9BBB59" w:themeFill="accent3"/>
+          </w:tcPr>
+          <w:p>
+            <w:pPr>
+              <w:pStyle w:val="PSI-Normal"/>
+            </w:pPr>
+          </w:p>
+        </w:tc>
+        <w:tc>
+          <w:tcPr>
+            <w:tcW w:w="805" w:type="dxa"/>
+          </w:tcPr>
+          <w:p>
+            <w:pPr>
+              <w:pStyle w:val="PSI-Normal"/>
+            </w:pPr>
+            <w:r>
+              <w:t>4</w:t>
+            </w:r>
+          </w:p>
+        </w:tc>
+        <w:tc>
+          <w:tcPr>
+            <w:tcW w:w="5068" w:type="dxa"/>
+          </w:tcPr>
+          <w:p>
+            <w:pPr>
+              <w:pStyle w:val="PSI-Normal"/>
+            </w:pPr>
+            <w:r>
+              <w:t xml:space="preserve">El usuario </w:t>
+            </w:r>
+            <w:r>
+              <w:t>selecciona “Dar de alta”</w:t>
+            </w:r>
+          </w:p>
+        </w:tc>
+      </w:tr>
+      <w:tr>
+        <w:tc>
+          <w:tcPr>
+            <w:tcW w:w="2809" w:type="dxa"/>
+            <w:vMerge/>
+            <w:shd w:val="clear" w:color="auto" w:fill="9BBB59" w:themeFill="accent3"/>
+          </w:tcPr>
+          <w:p>
+            <w:pPr>
+              <w:pStyle w:val="PSI-Normal"/>
+            </w:pPr>
+          </w:p>
+        </w:tc>
+        <w:tc>
+          <w:tcPr>
+            <w:tcW w:w="805" w:type="dxa"/>
+          </w:tcPr>
+          <w:p>
+            <w:pPr>
+              <w:pStyle w:val="PSI-Normal"/>
+            </w:pPr>
+            <w:r>
+              <w:t>5</w:t>
+            </w:r>
+          </w:p>
+        </w:tc>
+        <w:tc>
+          <w:tcPr>
+            <w:tcW w:w="5068" w:type="dxa"/>
+          </w:tcPr>
+          <w:p>
+            <w:pPr>
+              <w:pStyle w:val="PSI-Normal"/>
+            </w:pPr>
+            <w:r>
+              <w:t>Se ejecuta el CU04-Paso 1</w:t>
+            </w:r>
+          </w:p>
+        </w:tc>
+      </w:tr>
+      <w:tr>
+        <w:tc>
+          <w:tcPr>
+            <w:tcW w:w="2809" w:type="dxa"/>
+            <w:shd w:val="clear" w:color="auto" w:fill="76923C" w:themeFill="accent3" w:themeFillShade="BF"/>
+          </w:tcPr>
+          <w:p>
+            <w:pPr>
+              <w:pStyle w:val="PSI-Normal"/>
+            </w:pPr>
+          </w:p>
+        </w:tc>
+        <w:tc>
+          <w:tcPr>
+            <w:tcW w:w="805" w:type="dxa"/>
+            <w:shd w:val="clear" w:color="auto" w:fill="76923C" w:themeFill="accent3" w:themeFillShade="BF"/>
+          </w:tcPr>
+          <w:p>
+            <w:pPr>
+              <w:pStyle w:val="PSI-Normal"/>
+            </w:pPr>
+          </w:p>
+        </w:tc>
+        <w:tc>
+          <w:tcPr>
+            <w:tcW w:w="5068" w:type="dxa"/>
+            <w:shd w:val="clear" w:color="auto" w:fill="76923C" w:themeFill="accent3" w:themeFillShade="BF"/>
+          </w:tcPr>
+          <w:p>
+            <w:pPr>
+              <w:pStyle w:val="PSI-Normal"/>
+            </w:pPr>
+          </w:p>
+        </w:tc>
+      </w:tr>
+      <w:tr>
+        <w:tc>
+          <w:tcPr>
+            <w:tcW w:w="2809" w:type="dxa"/>
+            <w:vMerge w:val="restart"/>
+            <w:shd w:val="clear" w:color="auto" w:fill="9BBB59" w:themeFill="accent3"/>
+          </w:tcPr>
+          <w:p>
+            <w:pPr>
+              <w:pStyle w:val="PSI-Normal"/>
+            </w:pPr>
+            <w:r>
+              <w:t>Flujo alternativo</w:t>
+            </w:r>
+          </w:p>
+        </w:tc>
+        <w:tc>
+          <w:tcPr>
+            <w:tcW w:w="805" w:type="dxa"/>
+            <w:shd w:val="clear" w:color="auto" w:fill="FFFFFF" w:themeFill="background1"/>
+          </w:tcPr>
+          <w:p>
+            <w:pPr>
+              <w:pStyle w:val="PSI-Normal"/>
+            </w:pPr>
+            <w:r>
+              <w:t>2a</w:t>
+            </w:r>
+          </w:p>
+        </w:tc>
+        <w:tc>
+          <w:tcPr>
+            <w:tcW w:w="5068" w:type="dxa"/>
+            <w:shd w:val="clear" w:color="auto" w:fill="FFFFFF" w:themeFill="background1"/>
+          </w:tcPr>
+          <w:p>
+            <w:pPr>
+              <w:pStyle w:val="PSI-Normal"/>
+            </w:pPr>
+            <w:r>
+              <w:t xml:space="preserve">El usuario selecciona la opción modificar </w:t>
+            </w:r>
+            <w:r>
+              <w:t>datos de graduado con baja lógica</w:t>
+            </w:r>
+          </w:p>
+        </w:tc>
+      </w:tr>
+      <w:tr>
+        <w:tc>
+          <w:tcPr>
+            <w:tcW w:w="2809" w:type="dxa"/>
+            <w:vMerge/>
+            <w:shd w:val="clear" w:color="auto" w:fill="9BBB59" w:themeFill="accent3"/>
+          </w:tcPr>
+          <w:p>
+            <w:pPr>
+              <w:pStyle w:val="PSI-Normal"/>
+            </w:pPr>
+          </w:p>
+        </w:tc>
+        <w:tc>
+          <w:tcPr>
+            <w:tcW w:w="805" w:type="dxa"/>
+            <w:shd w:val="clear" w:color="auto" w:fill="FFFFFF" w:themeFill="background1"/>
+          </w:tcPr>
+          <w:p>
+            <w:pPr>
+              <w:pStyle w:val="PSI-Normal"/>
+            </w:pPr>
+            <w:r>
+              <w:t>2a1</w:t>
+            </w:r>
+          </w:p>
+        </w:tc>
+        <w:tc>
+          <w:tcPr>
+            <w:tcW w:w="5068" w:type="dxa"/>
+            <w:shd w:val="clear" w:color="auto" w:fill="FFFFFF" w:themeFill="background1"/>
+          </w:tcPr>
+          <w:p>
+            <w:pPr>
+              <w:pStyle w:val="PSI-Normal"/>
+            </w:pPr>
+            <w:r>
+              <w:t>El flujo sigue en el CU-06 Paso 1</w:t>
+            </w:r>
+          </w:p>
+        </w:tc>
+      </w:tr>
+      <w:tr>
+        <w:tc>
+          <w:tcPr>
+            <w:tcW w:w="2809" w:type="dxa"/>
+            <w:vMerge/>
+            <w:shd w:val="clear" w:color="auto" w:fill="9BBB59" w:themeFill="accent3"/>
+          </w:tcPr>
+          <w:p>
+            <w:pPr>
+              <w:pStyle w:val="PSI-Normal"/>
+            </w:pPr>
+          </w:p>
+        </w:tc>
+        <w:tc>
+          <w:tcPr>
+            <w:tcW w:w="805" w:type="dxa"/>
+            <w:shd w:val="clear" w:color="auto" w:fill="FFFFFF" w:themeFill="background1"/>
+          </w:tcPr>
+          <w:p>
+            <w:pPr>
+              <w:pStyle w:val="PSI-Normal"/>
+            </w:pPr>
+          </w:p>
+        </w:tc>
+        <w:tc>
+          <w:tcPr>
+            <w:tcW w:w="5068" w:type="dxa"/>
+            <w:shd w:val="clear" w:color="auto" w:fill="FFFFFF" w:themeFill="background1"/>
+          </w:tcPr>
+          <w:p>
+            <w:pPr>
+              <w:pStyle w:val="PSI-Normal"/>
+            </w:pPr>
+          </w:p>
+        </w:tc>
+      </w:tr>
+      <w:tr>
+        <w:tc>
+          <w:tcPr>
+            <w:tcW w:w="2809" w:type="dxa"/>
+            <w:vMerge/>
+            <w:shd w:val="clear" w:color="auto" w:fill="9BBB59" w:themeFill="accent3"/>
+          </w:tcPr>
+          <w:p>
+            <w:pPr>
+              <w:pStyle w:val="PSI-Normal"/>
+            </w:pPr>
+          </w:p>
+        </w:tc>
+        <w:tc>
+          <w:tcPr>
+            <w:tcW w:w="805" w:type="dxa"/>
+            <w:shd w:val="clear" w:color="auto" w:fill="FFFFFF" w:themeFill="background1"/>
+          </w:tcPr>
+          <w:p>
+            <w:pPr>
+              <w:pStyle w:val="PSI-Normal"/>
+            </w:pPr>
+            <w:r>
+              <w:t>2b</w:t>
+            </w:r>
+          </w:p>
+        </w:tc>
+        <w:tc>
+          <w:tcPr>
+            <w:tcW w:w="5068" w:type="dxa"/>
+            <w:shd w:val="clear" w:color="auto" w:fill="FFFFFF" w:themeFill="background1"/>
+          </w:tcPr>
+          <w:p>
+            <w:pPr>
+              <w:pStyle w:val="PSI-Normal"/>
+            </w:pPr>
+            <w:r>
+              <w:t xml:space="preserve">El usuario selecciona </w:t>
+            </w:r>
+            <w:r>
+              <w:t xml:space="preserve">eliminar </w:t>
+            </w:r>
+            <w:r>
+              <w:t>graduado</w:t>
+            </w:r>
+          </w:p>
+        </w:tc>
+      </w:tr>
+      <w:tr>
+        <w:tc>
+          <w:tcPr>
+            <w:tcW w:w="2809" w:type="dxa"/>
+            <w:vMerge/>
+            <w:shd w:val="clear" w:color="auto" w:fill="9BBB59" w:themeFill="accent3"/>
+          </w:tcPr>
+          <w:p>
+            <w:pPr>
+              <w:pStyle w:val="PSI-Normal"/>
+            </w:pPr>
+          </w:p>
+        </w:tc>
+        <w:tc>
+          <w:tcPr>
+            <w:tcW w:w="805" w:type="dxa"/>
+            <w:shd w:val="clear" w:color="auto" w:fill="FFFFFF" w:themeFill="background1"/>
+          </w:tcPr>
+          <w:p>
+            <w:pPr>
+              <w:pStyle w:val="PSI-Normal"/>
+            </w:pPr>
+            <w:r>
+              <w:t>2b1</w:t>
+            </w:r>
+          </w:p>
+        </w:tc>
+        <w:tc>
+          <w:tcPr>
+            <w:tcW w:w="5068" w:type="dxa"/>
+            <w:shd w:val="clear" w:color="auto" w:fill="FFFFFF" w:themeFill="background1"/>
+          </w:tcPr>
+          <w:p>
+            <w:pPr>
+              <w:pStyle w:val="PSI-Normal"/>
+            </w:pPr>
+            <w:r>
+              <w:t>El sistema muestra una ventana emergente con un mensaje de advertencia y las opciones “Volver/</w:t>
+            </w:r>
+            <w:r>
+              <w:t>Eliminar permanentemente</w:t>
+            </w:r>
+            <w:r>
+              <w:t>”</w:t>
+            </w:r>
+          </w:p>
+        </w:tc>
+      </w:tr>
+      <w:tr>
+        <w:tc>
+          <w:tcPr>
+            <w:tcW w:w="2809" w:type="dxa"/>
+            <w:vMerge/>
+            <w:shd w:val="clear" w:color="auto" w:fill="9BBB59" w:themeFill="accent3"/>
+          </w:tcPr>
+          <w:p>
+            <w:pPr>
+              <w:pStyle w:val="PSI-Normal"/>
+            </w:pPr>
+          </w:p>
+        </w:tc>
+        <w:tc>
+          <w:tcPr>
+            <w:tcW w:w="805" w:type="dxa"/>
+            <w:shd w:val="clear" w:color="auto" w:fill="FFFFFF" w:themeFill="background1"/>
+          </w:tcPr>
+          <w:p>
+            <w:pPr>
+              <w:pStyle w:val="PSI-Normal"/>
+            </w:pPr>
+            <w:r>
+              <w:t>2b2</w:t>
+            </w:r>
+          </w:p>
+        </w:tc>
+        <w:tc>
+          <w:tcPr>
+            <w:tcW w:w="5068" w:type="dxa"/>
+            <w:shd w:val="clear" w:color="auto" w:fill="FFFFFF" w:themeFill="background1"/>
+          </w:tcPr>
+          <w:p>
+            <w:pPr>
+              <w:pStyle w:val="PSI-Normal"/>
+            </w:pPr>
+            <w:r>
+              <w:t>El usuario da clic en la opción “</w:t>
+            </w:r>
+            <w:r>
+              <w:t>Eliminar permanentemente</w:t>
+            </w:r>
+            <w:r>
+              <w:t>”.</w:t>
+            </w:r>
+          </w:p>
+        </w:tc>
+      </w:tr>
+      <w:tr>
+        <w:tc>
+          <w:tcPr>
+            <w:tcW w:w="2809" w:type="dxa"/>
+            <w:vMerge/>
+            <w:shd w:val="clear" w:color="auto" w:fill="9BBB59" w:themeFill="accent3"/>
+          </w:tcPr>
+          <w:p>
+            <w:pPr>
+              <w:pStyle w:val="PSI-Normal"/>
+            </w:pPr>
+          </w:p>
+        </w:tc>
+        <w:tc>
+          <w:tcPr>
+            <w:tcW w:w="805" w:type="dxa"/>
+            <w:shd w:val="clear" w:color="auto" w:fill="FFFFFF" w:themeFill="background1"/>
+          </w:tcPr>
+          <w:p>
+            <w:pPr>
+              <w:pStyle w:val="PSI-Normal"/>
+            </w:pPr>
+            <w:r>
+              <w:t>2b3</w:t>
+            </w:r>
+          </w:p>
+        </w:tc>
+        <w:tc>
+          <w:tcPr>
+            <w:tcW w:w="5068" w:type="dxa"/>
+            <w:shd w:val="clear" w:color="auto" w:fill="FFFFFF" w:themeFill="background1"/>
+          </w:tcPr>
+          <w:p>
+            <w:pPr>
+              <w:pStyle w:val="PSI-Normal"/>
+            </w:pPr>
+            <w:r>
+              <w:t>El sistema ejecuta el CU-07 Paso 1</w:t>
+            </w:r>
+          </w:p>
+        </w:tc>
+      </w:tr>
+    </w:tbl>
+    <w:p>
+      <w:pPr>
+        <w:pStyle w:val="PSI-Normal"/>
+      </w:pPr>
+    </w:p>
     <w:p>
       <w:pPr>
         <w:pStyle w:val="PSI-Normal"/>
@@ -7948,20 +11420,26 @@
         <w:rPr>
           <w:lang w:val="es-AR"/>
         </w:rPr>
-        <w:t xml:space="preserve"> de analíticos, organizará y unificará la información de graduados, y permitirá obtener estadísticas útiles para la toma de decisiones de la Secretaría Académica. </w:t>
-      </w:r>
-    </w:p>
-    <w:p>
-      <w:pPr>
-        <w:rPr>
-          <w:lang w:val="es-AR"/>
-        </w:rPr>
-      </w:pPr>
+        <w:t xml:space="preserve"> de analíticos, organizará y </w:t>
+      </w:r>
       <w:r>
         <w:rPr>
           <w:lang w:val="es-AR"/>
         </w:rPr>
         <w:lastRenderedPageBreak/>
+        <w:t xml:space="preserve">unificará la información de graduados, y permitirá obtener estadísticas útiles para la toma de decisiones de la Secretaría Académica. </w:t>
+      </w:r>
+    </w:p>
+    <w:p>
+      <w:pPr>
+        <w:rPr>
+          <w:lang w:val="es-AR"/>
+        </w:rPr>
+      </w:pPr>
+      <w:r>
+        <w:rPr>
+          <w:lang w:val="es-AR"/>
+        </w:rPr>
         <w:t>En conjunto, la plataforma se proyecta como una solución técnicamente factible y estratégica para fortalecer el acompañamiento y el bienestar de la comunidad universitaria</w:t>
       </w:r>
     </w:p>
@@ -11216,6 +14694,155 @@
     </w:lvl>
   </w:abstractNum>
   <w:abstractNum w:abstractNumId="23" w15:restartNumberingAfterBreak="0">
+    <w:nsid w:val="7DDA5DE9"/>
+    <w:multiLevelType w:val="multilevel"/>
+    <w:tmpl w:val="52367858"/>
+    <w:lvl w:ilvl="0">
+      <w:start w:val="1"/>
+      <w:numFmt w:val="decimal"/>
+      <w:lvlText w:val="%1."/>
+      <w:lvlJc w:val="left"/>
+      <w:pPr>
+        <w:tabs>
+          <w:tab w:val="num" w:pos="720"/>
+        </w:tabs>
+        <w:ind w:left="720" w:hanging="360"/>
+      </w:pPr>
+      <w:rPr>
+        <w:rFonts w:hint="default"/>
+        <w:sz w:val="20"/>
+      </w:rPr>
+    </w:lvl>
+    <w:lvl w:ilvl="1" w:tentative="1">
+      <w:start w:val="1"/>
+      <w:numFmt w:val="bullet"/>
+      <w:lvlText w:val="o"/>
+      <w:lvlJc w:val="left"/>
+      <w:pPr>
+        <w:tabs>
+          <w:tab w:val="num" w:pos="1440"/>
+        </w:tabs>
+        <w:ind w:left="1440" w:hanging="360"/>
+      </w:pPr>
+      <w:rPr>
+        <w:rFonts w:ascii="Courier New" w:hAnsi="Courier New" w:hint="default"/>
+        <w:sz w:val="20"/>
+      </w:rPr>
+    </w:lvl>
+    <w:lvl w:ilvl="2" w:tentative="1">
+      <w:start w:val="1"/>
+      <w:numFmt w:val="bullet"/>
+      <w:lvlText w:val=""/>
+      <w:lvlJc w:val="left"/>
+      <w:pPr>
+        <w:tabs>
+          <w:tab w:val="num" w:pos="2160"/>
+        </w:tabs>
+        <w:ind w:left="2160" w:hanging="360"/>
+      </w:pPr>
+      <w:rPr>
+        <w:rFonts w:ascii="Wingdings" w:hAnsi="Wingdings" w:hint="default"/>
+        <w:sz w:val="20"/>
+      </w:rPr>
+    </w:lvl>
+    <w:lvl w:ilvl="3" w:tentative="1">
+      <w:start w:val="1"/>
+      <w:numFmt w:val="bullet"/>
+      <w:lvlText w:val=""/>
+      <w:lvlJc w:val="left"/>
+      <w:pPr>
+        <w:tabs>
+          <w:tab w:val="num" w:pos="2880"/>
+        </w:tabs>
+        <w:ind w:left="2880" w:hanging="360"/>
+      </w:pPr>
+      <w:rPr>
+        <w:rFonts w:ascii="Wingdings" w:hAnsi="Wingdings" w:hint="default"/>
+        <w:sz w:val="20"/>
+      </w:rPr>
+    </w:lvl>
+    <w:lvl w:ilvl="4" w:tentative="1">
+      <w:start w:val="1"/>
+      <w:numFmt w:val="bullet"/>
+      <w:lvlText w:val=""/>
+      <w:lvlJc w:val="left"/>
+      <w:pPr>
+        <w:tabs>
+          <w:tab w:val="num" w:pos="3600"/>
+        </w:tabs>
+        <w:ind w:left="3600" w:hanging="360"/>
+      </w:pPr>
+      <w:rPr>
+        <w:rFonts w:ascii="Wingdings" w:hAnsi="Wingdings" w:hint="default"/>
+        <w:sz w:val="20"/>
+      </w:rPr>
+    </w:lvl>
+    <w:lvl w:ilvl="5" w:tentative="1">
+      <w:start w:val="1"/>
+      <w:numFmt w:val="bullet"/>
+      <w:lvlText w:val=""/>
+      <w:lvlJc w:val="left"/>
+      <w:pPr>
+        <w:tabs>
+          <w:tab w:val="num" w:pos="4320"/>
+        </w:tabs>
+        <w:ind w:left="4320" w:hanging="360"/>
+      </w:pPr>
+      <w:rPr>
+        <w:rFonts w:ascii="Wingdings" w:hAnsi="Wingdings" w:hint="default"/>
+        <w:sz w:val="20"/>
+      </w:rPr>
+    </w:lvl>
+    <w:lvl w:ilvl="6" w:tentative="1">
+      <w:start w:val="1"/>
+      <w:numFmt w:val="bullet"/>
+      <w:lvlText w:val=""/>
+      <w:lvlJc w:val="left"/>
+      <w:pPr>
+        <w:tabs>
+          <w:tab w:val="num" w:pos="5040"/>
+        </w:tabs>
+        <w:ind w:left="5040" w:hanging="360"/>
+      </w:pPr>
+      <w:rPr>
+        <w:rFonts w:ascii="Wingdings" w:hAnsi="Wingdings" w:hint="default"/>
+        <w:sz w:val="20"/>
+      </w:rPr>
+    </w:lvl>
+    <w:lvl w:ilvl="7" w:tentative="1">
+      <w:start w:val="1"/>
+      <w:numFmt w:val="bullet"/>
+      <w:lvlText w:val=""/>
+      <w:lvlJc w:val="left"/>
+      <w:pPr>
+        <w:tabs>
+          <w:tab w:val="num" w:pos="5760"/>
+        </w:tabs>
+        <w:ind w:left="5760" w:hanging="360"/>
+      </w:pPr>
+      <w:rPr>
+        <w:rFonts w:ascii="Wingdings" w:hAnsi="Wingdings" w:hint="default"/>
+        <w:sz w:val="20"/>
+      </w:rPr>
+    </w:lvl>
+    <w:lvl w:ilvl="8" w:tentative="1">
+      <w:start w:val="1"/>
+      <w:numFmt w:val="bullet"/>
+      <w:lvlText w:val=""/>
+      <w:lvlJc w:val="left"/>
+      <w:pPr>
+        <w:tabs>
+          <w:tab w:val="num" w:pos="6480"/>
+        </w:tabs>
+        <w:ind w:left="6480" w:hanging="360"/>
+      </w:pPr>
+      <w:rPr>
+        <w:rFonts w:ascii="Wingdings" w:hAnsi="Wingdings" w:hint="default"/>
+        <w:sz w:val="20"/>
+      </w:rPr>
+    </w:lvl>
+  </w:abstractNum>
+  <w:abstractNum w:abstractNumId="24" w15:restartNumberingAfterBreak="0">
     <w:nsid w:val="7EB654FB"/>
     <w:multiLevelType w:val="hybridMultilevel"/>
     <w:tmpl w:val="88E40EEC"/>
@@ -11371,7 +14998,7 @@
     <w:abstractNumId w:val="9"/>
   </w:num>
   <w:num w:numId="23" w16cid:durableId="986395175">
-    <w:abstractNumId w:val="23"/>
+    <w:abstractNumId w:val="24"/>
   </w:num>
   <w:num w:numId="24" w16cid:durableId="1959488229">
     <w:abstractNumId w:val="19"/>
@@ -11381,6 +15008,9 @@
   </w:num>
   <w:num w:numId="26" w16cid:durableId="1645429073">
     <w:abstractNumId w:val="4"/>
+  </w:num>
+  <w:num w:numId="27" w16cid:durableId="1929999461">
+    <w:abstractNumId w:val="23"/>
   </w:num>
 </w:numbering>
 </file>

</xml_diff>